<commit_message>
Sync admin page fixes
</commit_message>
<xml_diff>
--- a/部署指南.docx
+++ b/部署指南.docx
@@ -23,13 +23,13 @@
         <ns0:pStyle ns0:val="a4"/>
       </ns0:pPr>
       <ns0:r>
-        <ns0:t>生成日期：</ns0:t>
-      </ns0:r>
-      <ns0:r>
-        <ns0:t>2026-05-11</ns0:t>
-      </ns0:r>
-      <ns0:r>
-        <ns0:t>；本文档中的行号均以该脱敏副本为准。</ns0:t>
+        <ns0:t>生成日期：2026-05-15；本文档中的行号均以该脱敏副本为准。</ns0:t>
+      </ns0:r>
+      <ns0:r>
+        <ns0:t/>
+      </ns0:r>
+      <ns0:r>
+        <ns0:t/>
       </ns0:r>
     </ns0:p>
     <ns0:p ns2:paraId="7EEF8C32" ns2:textId="77777777" ns0:rsidR="00B4231D" ns0:rsidRDefault="00000000">
@@ -1510,64 +1510,95 @@
         <ns0:pStyle ns0:val="Bullet"/>
       </ns0:pPr>
       <ns0:r>
-        <ns0:t xml:space="preserve">• public/login.js </ns0:t>
+        <ns0:t xml:space="preserve">• public/login.js 第 389 行：把 app.example.com/login 改成你的登录入口。</ns0:t>
+      </ns0:r>
+      <ns0:r>
+        <ns0:t/>
+      </ns0:r>
+      <ns0:r>
+        <ns0:t xml:space="preserve"/>
+      </ns0:r>
+      <ns0:r>
+        <ns0:t/>
+      </ns0:r>
+      <ns0:r>
+        <ns0:t xml:space="preserve"/>
+      </ns0:r>
+      <ns0:r>
+        <ns0:t/>
+      </ns0:r>
+    </ns0:p>
+    <ns0:p ns2:paraId="49F49007" ns2:textId="77777777" ns0:rsidR="00B4231D" ns0:rsidRDefault="00000000">
+      <ns0:pPr>
+        <ns0:pStyle ns0:val="Bullet"/>
+      </ns0:pPr>
+      <ns0:r>
+        <ns0:t xml:space="preserve">• public/login.js 第 543 行：把 app.example.com/login 改成你的登录入口。</ns0:t>
+      </ns0:r>
+      <ns0:r>
+        <ns0:t/>
+      </ns0:r>
+      <ns0:r>
+        <ns0:t xml:space="preserve"/>
+      </ns0:r>
+      <ns0:r>
+        <ns0:t/>
+      </ns0:r>
+      <ns0:r>
+        <ns0:t xml:space="preserve"/>
+      </ns0:r>
+      <ns0:r>
+        <ns0:t/>
+      </ns0:r>
+    </ns0:p>
+    <ns0:p ns2:paraId="46463256" ns2:textId="77777777" ns0:rsidR="00B4231D" ns0:rsidRDefault="00000000">
+      <ns0:pPr>
+        <ns0:pStyle ns0:val="Bullet"/>
+      </ns0:pPr>
+      <ns0:r>
+        <ns0:t xml:space="preserve">• public/linkhistory.js </ns0:t>
       </ns0:r>
       <ns0:r>
         <ns0:t>第</ns0:t>
       </ns0:r>
       <ns0:r>
-        <ns0:t xml:space="preserve"> 332 </ns0:t>
+        <ns0:t xml:space="preserve"> 52 </ns0:t>
       </ns0:r>
       <ns0:r>
         <ns0:t>行：把</ns0:t>
       </ns0:r>
       <ns0:r>
-        <ns0:t xml:space="preserve"> app.example.com/login </ns0:t>
-      </ns0:r>
-      <ns0:r>
-        <ns0:t>改成你的登录入口。</ns0:t>
-      </ns0:r>
-    </ns0:p>
-    <ns0:p ns2:paraId="49F49007" ns2:textId="77777777" ns0:rsidR="00B4231D" ns0:rsidRDefault="00000000">
-      <ns0:pPr>
-        <ns0:pStyle ns0:val="Bullet"/>
-      </ns0:pPr>
-      <ns0:r>
-        <ns0:t xml:space="preserve">• public/login.js </ns0:t>
+        <ns0:t xml:space="preserve"> app.example.com/</ns0:t>
+      </ns0:r>
+      <ns0:proofErr ns0:type="spellStart"/>
+      <ns0:r>
+        <ns0:t>linkhistory</ns0:t>
+      </ns0:r>
+      <ns0:proofErr ns0:type="spellEnd"/>
+      <ns0:r>
+        <ns0:t xml:space="preserve"> </ns0:t>
+      </ns0:r>
+      <ns0:r>
+        <ns0:t>改成你的封存库入口。</ns0:t>
+      </ns0:r>
+    </ns0:p>
+    <ns0:p ns2:paraId="0E05E643" ns2:textId="77777777" ns0:rsidR="00B4231D" ns0:rsidRDefault="00000000">
+      <ns0:pPr>
+        <ns0:pStyle ns0:val="Bullet"/>
+      </ns0:pPr>
+      <ns0:r>
+        <ns0:t xml:space="preserve">• public/linkhistory.js </ns0:t>
       </ns0:r>
       <ns0:r>
         <ns0:t>第</ns0:t>
       </ns0:r>
       <ns0:r>
-        <ns0:t xml:space="preserve"> 485 </ns0:t>
+        <ns0:t xml:space="preserve"> 89 </ns0:t>
       </ns0:r>
       <ns0:r>
         <ns0:t>行：把</ns0:t>
       </ns0:r>
       <ns0:r>
-        <ns0:t xml:space="preserve"> app.example.com/login </ns0:t>
-      </ns0:r>
-      <ns0:r>
-        <ns0:t>改成你的登录入口。</ns0:t>
-      </ns0:r>
-    </ns0:p>
-    <ns0:p ns2:paraId="46463256" ns2:textId="77777777" ns0:rsidR="00B4231D" ns0:rsidRDefault="00000000">
-      <ns0:pPr>
-        <ns0:pStyle ns0:val="Bullet"/>
-      </ns0:pPr>
-      <ns0:r>
-        <ns0:t xml:space="preserve">• public/linkhistory.js </ns0:t>
-      </ns0:r>
-      <ns0:r>
-        <ns0:t>第</ns0:t>
-      </ns0:r>
-      <ns0:r>
-        <ns0:t xml:space="preserve"> 52 </ns0:t>
-      </ns0:r>
-      <ns0:r>
-        <ns0:t>行：把</ns0:t>
-      </ns0:r>
-      <ns0:r>
         <ns0:t xml:space="preserve"> app.example.com/</ns0:t>
       </ns0:r>
       <ns0:proofErr ns0:type="spellStart"/>
@@ -1582,37 +1613,6 @@
         <ns0:t>改成你的封存库入口。</ns0:t>
       </ns0:r>
     </ns0:p>
-    <ns0:p ns2:paraId="0E05E643" ns2:textId="77777777" ns0:rsidR="00B4231D" ns0:rsidRDefault="00000000">
-      <ns0:pPr>
-        <ns0:pStyle ns0:val="Bullet"/>
-      </ns0:pPr>
-      <ns0:r>
-        <ns0:t xml:space="preserve">• public/linkhistory.js </ns0:t>
-      </ns0:r>
-      <ns0:r>
-        <ns0:t>第</ns0:t>
-      </ns0:r>
-      <ns0:r>
-        <ns0:t xml:space="preserve"> 89 </ns0:t>
-      </ns0:r>
-      <ns0:r>
-        <ns0:t>行：把</ns0:t>
-      </ns0:r>
-      <ns0:r>
-        <ns0:t xml:space="preserve"> app.example.com/</ns0:t>
-      </ns0:r>
-      <ns0:proofErr ns0:type="spellStart"/>
-      <ns0:r>
-        <ns0:t>linkhistory</ns0:t>
-      </ns0:r>
-      <ns0:proofErr ns0:type="spellEnd"/>
-      <ns0:r>
-        <ns0:t xml:space="preserve"> </ns0:t>
-      </ns0:r>
-      <ns0:r>
-        <ns0:t>改成你的封存库入口。</ns0:t>
-      </ns0:r>
-    </ns0:p>
     <ns0:p ns2:paraId="135F43BA" ns2:textId="77777777" ns0:rsidR="00B4231D" ns0:rsidRDefault="00000000">
       <ns0:pPr>
         <ns0:pStyle ns0:val="2"/>
@@ -1629,7 +1629,7 @@
         <ns0:pStyle ns0:val="Bullet"/>
       </ns0:pPr>
       <ns0:r>
-        <ns0:t xml:space="preserve">• src/default-config.js 第 35-48 行：默认姓名、头像字、学号、学院、专业、班级、宿舍等个人信息。开源副本已是示例数据；实际部署可改成你希望管理员首次打开时看到的模板。</ns0:t>
+        <ns0:t xml:space="preserve">• src/default-config.js 第 37-50 行：默认姓名、头像字、学号、学院、专业、班级、宿舍等个人信息。开源副本已是示例数据；实际部署可改成你希望管理员首次打开时看到的模板。</ns0:t>
       </ns0:r>
       <ns0:proofErr ns0:type="spellStart"/>
       <ns0:r>
@@ -1654,30 +1654,30 @@
         <ns0:pStyle ns0:val="Bullet"/>
       </ns0:pPr>
       <ns0:r>
-        <ns0:t xml:space="preserve">• </ns0:t>
-      </ns0:r>
-      <ns0:proofErr ns0:type="spellStart"/>
-      <ns0:r>
-        <ns0:t>src</ns0:t>
-      </ns0:r>
-      <ns0:proofErr ns0:type="spellEnd"/>
-      <ns0:r>
-        <ns0:t xml:space="preserve">/default-config.js </ns0:t>
-      </ns0:r>
-      <ns0:r>
-        <ns0:t>第</ns0:t>
-      </ns0:r>
-      <ns0:r>
-        <ns0:t xml:space="preserve"> 62-66 </ns0:t>
-      </ns0:r>
-      <ns0:r>
-        <ns0:t>行：默认审批人、请假原因、定位文本和定位</ns0:t>
-      </ns0:r>
-      <ns0:r>
-        <ns0:t xml:space="preserve"> URL</ns0:t>
-      </ns0:r>
-      <ns0:r>
-        <ns0:t>。</ns0:t>
+        <ns0:t xml:space="preserve">• src/default-config.js 第 64-68 行：默认审批人、请假原因、定位文本和定位 URL。</ns0:t>
+      </ns0:r>
+      <ns0:proofErr ns0:type="spellStart"/>
+      <ns0:r>
+        <ns0:t/>
+      </ns0:r>
+      <ns0:proofErr ns0:type="spellEnd"/>
+      <ns0:r>
+        <ns0:t xml:space="preserve"/>
+      </ns0:r>
+      <ns0:r>
+        <ns0:t/>
+      </ns0:r>
+      <ns0:r>
+        <ns0:t xml:space="preserve"/>
+      </ns0:r>
+      <ns0:r>
+        <ns0:t/>
+      </ns0:r>
+      <ns0:r>
+        <ns0:t xml:space="preserve"/>
+      </ns0:r>
+      <ns0:r>
+        <ns0:t/>
       </ns0:r>
     </ns0:p>
     <ns0:p ns2:paraId="0F5628C9" ns2:textId="77777777" ns0:rsidR="00B4231D" ns0:rsidRDefault="00000000">
@@ -1685,24 +1685,24 @@
         <ns0:pStyle ns0:val="Bullet"/>
       </ns0:pPr>
       <ns0:r>
-        <ns0:t xml:space="preserve">• </ns0:t>
-      </ns0:r>
-      <ns0:proofErr ns0:type="spellStart"/>
-      <ns0:r>
-        <ns0:t>src</ns0:t>
-      </ns0:r>
-      <ns0:proofErr ns0:type="spellEnd"/>
-      <ns0:r>
-        <ns0:t xml:space="preserve">/default-config.js </ns0:t>
-      </ns0:r>
-      <ns0:r>
-        <ns0:t>第</ns0:t>
-      </ns0:r>
-      <ns0:r>
-        <ns0:t xml:space="preserve"> 70-73 </ns0:t>
-      </ns0:r>
-      <ns0:r>
-        <ns0:t>行：默认目的地省、市、区县、详细地址。</ns0:t>
+        <ns0:t xml:space="preserve">• src/default-config.js 第 70-75 行：默认目的地省、市、区县、详细地址。</ns0:t>
+      </ns0:r>
+      <ns0:proofErr ns0:type="spellStart"/>
+      <ns0:r>
+        <ns0:t/>
+      </ns0:r>
+      <ns0:proofErr ns0:type="spellEnd"/>
+      <ns0:r>
+        <ns0:t xml:space="preserve"/>
+      </ns0:r>
+      <ns0:r>
+        <ns0:t/>
+      </ns0:r>
+      <ns0:r>
+        <ns0:t xml:space="preserve"/>
+      </ns0:r>
+      <ns0:r>
+        <ns0:t/>
       </ns0:r>
     </ns0:p>
     <ns0:p ns2:paraId="77676F79" ns2:textId="77777777" ns0:rsidR="00B4231D" ns0:rsidRDefault="00000000">
@@ -1710,24 +1710,24 @@
         <ns0:pStyle ns0:val="Bullet"/>
       </ns0:pPr>
       <ns0:r>
-        <ns0:t xml:space="preserve">• </ns0:t>
-      </ns0:r>
-      <ns0:proofErr ns0:type="spellStart"/>
-      <ns0:r>
-        <ns0:t>src</ns0:t>
-      </ns0:r>
-      <ns0:proofErr ns0:type="spellEnd"/>
-      <ns0:r>
-        <ns0:t xml:space="preserve">/default-config.js </ns0:t>
-      </ns0:r>
-      <ns0:r>
-        <ns0:t>第</ns0:t>
-      </ns0:r>
-      <ns0:r>
-        <ns0:t xml:space="preserve"> 113 </ns0:t>
-      </ns0:r>
-      <ns0:r>
-        <ns0:t>行：默认客服链接。</ns0:t>
+        <ns0:t xml:space="preserve">• src/default-config.js 第 115 行：默认客服链接。</ns0:t>
+      </ns0:r>
+      <ns0:proofErr ns0:type="spellStart"/>
+      <ns0:r>
+        <ns0:t/>
+      </ns0:r>
+      <ns0:proofErr ns0:type="spellEnd"/>
+      <ns0:r>
+        <ns0:t xml:space="preserve"/>
+      </ns0:r>
+      <ns0:r>
+        <ns0:t/>
+      </ns0:r>
+      <ns0:r>
+        <ns0:t xml:space="preserve"/>
+      </ns0:r>
+      <ns0:r>
+        <ns0:t/>
       </ns0:r>
     </ns0:p>
     <ns0:p ns2:paraId="562C6799" ns2:textId="77777777" ns0:rsidR="00B4231D" ns0:rsidRDefault="00000000">
@@ -1735,7 +1735,7 @@
         <ns0:pStyle ns0:val="Bullet"/>
       </ns0:pPr>
       <ns0:r>
-        <ns0:t>• public/wec-counselor-leave-apps/leave/share/config.js 第 42-57、75-85、133 行：这是静态分享页 fallback 配置，应与 src/default-config.js 保持同级别脱敏或改成你的默认模板。</ns0:t>
+        <ns0:t>• public/wec-counselor-leave-apps/leave/share/config.js 第 44-59、77-88、135 行：这是静态分享页 fallback 配置，应与 src/default-config.js 保持同级别脱敏或改成你的默认模板。</ns0:t>
       </ns0:r>
       <ns0:proofErr ns0:type="spellStart"/>
       <ns0:r>

</xml_diff>

<commit_message>
Improve deployment guide layout
</commit_message>
<xml_diff>
--- a/部署指南.docx
+++ b/部署指南.docx
@@ -4,63 +4,88 @@
   <w:body>
     <w:p>
       <w:pPr>
-        <w:rPr>
-          <w:rFonts w:ascii="微软雅黑" w:eastAsia="微软雅黑" w:hAnsi="微软雅黑" w:hint="eastAsia"/>
+        <w:shd w:val="clear" w:color="auto" w:fill="1F4E79"/>
+        <w:spacing w:before="160" w:after="200" w:line="560" w:lineRule="auto"/>
+        <w:jc w:val="center"/>
+        <w:rPr>
+          <w:rFonts w:ascii="Microsoft YaHei UI" w:eastAsia="微软雅黑" w:hAnsi="Microsoft YaHei UI" w:hint="eastAsia"/>
           <w:b/>
-          <w:sz w:val="32"/>
-        </w:rPr>
-      </w:pPr>
-      <w:r>
-        <w:rPr>
-          <w:rFonts w:ascii="微软雅黑" w:eastAsia="微软雅黑" w:hAnsi="微软雅黑" w:hint="eastAsia"/>
+          <w:color w:val="FFFFFF"/>
+          <w:sz w:val="44"/>
+        </w:rPr>
+      </w:pPr>
+      <w:r>
+        <w:rPr>
+          <w:rFonts w:ascii="Microsoft YaHei UI" w:eastAsia="微软雅黑" w:hAnsi="Microsoft YaHei UI" w:hint="eastAsia"/>
           <w:b/>
-          <w:sz w:val="32"/>
-        </w:rPr>
-        <w:t>leave-status 开源版部署指南</w:t>
-      </w:r>
-    </w:p>
-    <w:p>
-      <w:pPr>
-        <w:rPr>
-          <w:rFonts w:ascii="微软雅黑" w:eastAsia="微软雅黑" w:hAnsi="微软雅黑" w:hint="eastAsia"/>
-          <w:sz w:val="21"/>
-        </w:rPr>
-      </w:pPr>
-      <w:r>
-        <w:rPr>
-          <w:rFonts w:ascii="微软雅黑" w:eastAsia="微软雅黑" w:hAnsi="微软雅黑" w:hint="eastAsia"/>
-          <w:sz w:val="21"/>
+          <w:color w:val="FFFFFF"/>
+          <w:sz w:val="44"/>
+        </w:rPr>
+        <w:t xml:space="preserve">leave-status </w:t>
+      </w:r>
+      <w:r>
+        <w:rPr>
+          <w:rFonts w:ascii="Microsoft YaHei UI" w:eastAsia="微软雅黑" w:hAnsi="Microsoft YaHei UI" w:hint="eastAsia"/>
+          <w:b/>
+          <w:color w:val="FFFFFF"/>
+          <w:sz w:val="44"/>
+        </w:rPr>
+        <w:t>开源版部署指南</w:t>
+      </w:r>
+    </w:p>
+    <w:p>
+      <w:pPr>
+        <w:spacing w:after="280" w:line="300" w:lineRule="auto"/>
+        <w:jc w:val="center"/>
+        <w:rPr>
+          <w:rFonts w:ascii="微软雅黑" w:eastAsia="微软雅黑" w:hAnsi="微软雅黑" w:hint="eastAsia"/>
+          <w:color w:val="64748B"/>
+          <w:sz w:val="19"/>
+        </w:rPr>
+      </w:pPr>
+      <w:r>
+        <w:rPr>
+          <w:rFonts w:ascii="微软雅黑" w:eastAsia="微软雅黑" w:hAnsi="微软雅黑" w:hint="eastAsia"/>
+          <w:color w:val="64748B"/>
+          <w:sz w:val="19"/>
         </w:rPr>
         <w:t>生成日期：2026-05-15；本文档中的行号均以该脱敏副本为准。</w:t>
       </w:r>
     </w:p>
     <w:p>
       <w:pPr>
-        <w:rPr>
-          <w:rFonts w:ascii="微软雅黑" w:eastAsia="微软雅黑" w:hAnsi="微软雅黑" w:hint="eastAsia"/>
+        <w:shd w:val="clear" w:color="auto" w:fill="EAF2FB"/>
+        <w:spacing w:before="240" w:after="140" w:line="380" w:lineRule="auto"/>
+        <w:rPr>
+          <w:rFonts w:ascii="Microsoft YaHei UI" w:eastAsia="Microsoft YaHei UI" w:hAnsi="Microsoft YaHei UI" w:hint="eastAsia"/>
           <w:b/>
-          <w:sz w:val="26"/>
-        </w:rPr>
-      </w:pPr>
-      <w:r>
-        <w:rPr>
-          <w:rFonts w:ascii="微软雅黑" w:eastAsia="微软雅黑" w:hAnsi="微软雅黑" w:hint="eastAsia"/>
+          <w:color w:val="17365D"/>
+          <w:sz w:val="28"/>
+        </w:rPr>
+      </w:pPr>
+      <w:r>
+        <w:rPr>
+          <w:rFonts w:ascii="Microsoft YaHei UI" w:eastAsia="Microsoft YaHei UI" w:hAnsi="Microsoft YaHei UI" w:hint="eastAsia"/>
           <w:b/>
-          <w:sz w:val="26"/>
+          <w:color w:val="17365D"/>
+          <w:sz w:val="28"/>
         </w:rPr>
         <w:t>1. 项目理解与运行架构</w:t>
       </w:r>
     </w:p>
     <w:p>
       <w:pPr>
-        <w:rPr>
-          <w:rFonts w:ascii="微软雅黑" w:eastAsia="微软雅黑" w:hAnsi="微软雅黑" w:hint="eastAsia"/>
-          <w:sz w:val="21"/>
-        </w:rPr>
-      </w:pPr>
-      <w:r>
-        <w:rPr>
-          <w:rFonts w:ascii="微软雅黑" w:eastAsia="微软雅黑" w:hAnsi="微软雅黑" w:hint="eastAsia"/>
+        <w:spacing w:after="120" w:line="300" w:lineRule="auto"/>
+        <w:rPr>
+          <w:rFonts w:ascii="微软雅黑" w:eastAsia="微软雅黑" w:hAnsi="微软雅黑" w:hint="eastAsia"/>
+          <w:color w:val="263445"/>
+          <w:sz w:val="21"/>
+        </w:rPr>
+      </w:pPr>
+      <w:r>
+        <w:rPr>
+          <w:rFonts w:ascii="微软雅黑" w:eastAsia="微软雅黑" w:hAnsi="微软雅黑" w:hint="eastAsia"/>
+          <w:color w:val="263445"/>
           <w:sz w:val="21"/>
         </w:rPr>
         <w:t>这是一个部署在 Cloudflare Workers 上的请假状态分享系统。Worker 负责路由、鉴权、数据读写和静态资源托管，public 目录提供后台与分享页前端资源，src 目录提供 Worker 业务逻辑。</w:t>
@@ -68,14 +93,18 @@
     </w:p>
     <w:p>
       <w:pPr>
-        <w:rPr>
-          <w:rFonts w:ascii="微软雅黑" w:eastAsia="微软雅黑" w:hAnsi="微软雅黑" w:hint="eastAsia"/>
-          <w:sz w:val="21"/>
-        </w:rPr>
-      </w:pPr>
-      <w:r>
-        <w:rPr>
-          <w:rFonts w:ascii="微软雅黑" w:eastAsia="微软雅黑" w:hAnsi="微软雅黑" w:hint="eastAsia"/>
+        <w:spacing w:after="80" w:line="300" w:lineRule="auto"/>
+        <w:ind w:left="283" w:hanging="130"/>
+        <w:rPr>
+          <w:rFonts w:ascii="微软雅黑" w:eastAsia="微软雅黑" w:hAnsi="微软雅黑" w:hint="eastAsia"/>
+          <w:color w:val="263445"/>
+          <w:sz w:val="21"/>
+        </w:rPr>
+      </w:pPr>
+      <w:r>
+        <w:rPr>
+          <w:rFonts w:ascii="微软雅黑" w:eastAsia="微软雅黑" w:hAnsi="微软雅黑" w:hint="eastAsia"/>
+          <w:color w:val="263445"/>
           <w:sz w:val="21"/>
         </w:rPr>
         <w:t>• 管理后台：/login，管理员通过 Cloudflare Access 登录后创建、编辑、销毁请假分享链接。</w:t>
@@ -83,14 +112,18 @@
     </w:p>
     <w:p>
       <w:pPr>
-        <w:rPr>
-          <w:rFonts w:ascii="微软雅黑" w:eastAsia="微软雅黑" w:hAnsi="微软雅黑" w:hint="eastAsia"/>
-          <w:sz w:val="21"/>
-        </w:rPr>
-      </w:pPr>
-      <w:r>
-        <w:rPr>
-          <w:rFonts w:ascii="微软雅黑" w:eastAsia="微软雅黑" w:hAnsi="微软雅黑" w:hint="eastAsia"/>
+        <w:spacing w:after="80" w:line="300" w:lineRule="auto"/>
+        <w:ind w:left="283" w:hanging="130"/>
+        <w:rPr>
+          <w:rFonts w:ascii="微软雅黑" w:eastAsia="微软雅黑" w:hAnsi="微软雅黑" w:hint="eastAsia"/>
+          <w:color w:val="263445"/>
+          <w:sz w:val="21"/>
+        </w:rPr>
+      </w:pPr>
+      <w:r>
+        <w:rPr>
+          <w:rFonts w:ascii="微软雅黑" w:eastAsia="微软雅黑" w:hAnsi="微软雅黑" w:hint="eastAsia"/>
+          <w:color w:val="263445"/>
           <w:sz w:val="21"/>
         </w:rPr>
         <w:t>• 封存库：/linkhistory，管理员查看已销毁或过期后封存的链接，可恢复仍允许恢复的记录。</w:t>
@@ -98,14 +131,18 @@
     </w:p>
     <w:p>
       <w:pPr>
-        <w:rPr>
-          <w:rFonts w:ascii="微软雅黑" w:eastAsia="微软雅黑" w:hAnsi="微软雅黑" w:hint="eastAsia"/>
-          <w:sz w:val="21"/>
-        </w:rPr>
-      </w:pPr>
-      <w:r>
-        <w:rPr>
-          <w:rFonts w:ascii="微软雅黑" w:eastAsia="微软雅黑" w:hAnsi="微软雅黑" w:hint="eastAsia"/>
+        <w:spacing w:after="80" w:line="300" w:lineRule="auto"/>
+        <w:ind w:left="283" w:hanging="130"/>
+        <w:rPr>
+          <w:rFonts w:ascii="微软雅黑" w:eastAsia="微软雅黑" w:hAnsi="微软雅黑" w:hint="eastAsia"/>
+          <w:color w:val="263445"/>
+          <w:sz w:val="21"/>
+        </w:rPr>
+      </w:pPr>
+      <w:r>
+        <w:rPr>
+          <w:rFonts w:ascii="微软雅黑" w:eastAsia="微软雅黑" w:hAnsi="微软雅黑" w:hint="eastAsia"/>
+          <w:color w:val="263445"/>
           <w:sz w:val="21"/>
         </w:rPr>
         <w:t>• 超级管理员：/superloginv，超级管理员通过单独的 Cloudflare Access 应用进入，用于新增管理员邮箱、设置链接数量上限、查看 R2/D1 用量和清空指定管理员封存库。</w:t>
@@ -113,14 +150,19 @@
     </w:p>
     <w:p>
       <w:pPr>
-        <w:rPr>
-          <w:rFonts w:ascii="微软雅黑" w:eastAsia="微软雅黑" w:hAnsi="微软雅黑" w:hint="eastAsia"/>
-          <w:sz w:val="21"/>
-        </w:rPr>
-      </w:pPr>
-      <w:r>
-        <w:rPr>
-          <w:rFonts w:ascii="微软雅黑" w:eastAsia="微软雅黑" w:hAnsi="微软雅黑" w:hint="eastAsia"/>
+        <w:shd w:val="clear" w:color="auto" w:fill="FFF7E6"/>
+        <w:spacing w:after="80" w:line="300" w:lineRule="auto"/>
+        <w:ind w:left="283" w:hanging="130"/>
+        <w:rPr>
+          <w:rFonts w:ascii="微软雅黑" w:eastAsia="微软雅黑" w:hAnsi="微软雅黑" w:hint="eastAsia"/>
+          <w:color w:val="263445"/>
+          <w:sz w:val="21"/>
+        </w:rPr>
+      </w:pPr>
+      <w:r>
+        <w:rPr>
+          <w:rFonts w:ascii="微软雅黑" w:eastAsia="微软雅黑" w:hAnsi="微软雅黑" w:hint="eastAsia"/>
+          <w:color w:val="263445"/>
           <w:sz w:val="21"/>
         </w:rPr>
         <w:t>• 公开分享页：/wec-counselor-leave-apps/leave/share/index.html?id=...，无需 Access 登录，按分享 ID 从 KV 读取完整配置并渲染页面；D1 只用于后台列表、统计和索引兜底，不是公开分享页的主数据源。</w:t>
@@ -128,14 +170,18 @@
     </w:p>
     <w:p>
       <w:pPr>
-        <w:rPr>
-          <w:rFonts w:ascii="微软雅黑" w:eastAsia="微软雅黑" w:hAnsi="微软雅黑" w:hint="eastAsia"/>
-          <w:sz w:val="21"/>
-        </w:rPr>
-      </w:pPr>
-      <w:r>
-        <w:rPr>
-          <w:rFonts w:ascii="微软雅黑" w:eastAsia="微软雅黑" w:hAnsi="微软雅黑" w:hint="eastAsia"/>
+        <w:spacing w:after="80" w:line="300" w:lineRule="auto"/>
+        <w:ind w:left="283" w:hanging="130"/>
+        <w:rPr>
+          <w:rFonts w:ascii="微软雅黑" w:eastAsia="微软雅黑" w:hAnsi="微软雅黑" w:hint="eastAsia"/>
+          <w:color w:val="263445"/>
+          <w:sz w:val="21"/>
+        </w:rPr>
+      </w:pPr>
+      <w:r>
+        <w:rPr>
+          <w:rFonts w:ascii="微软雅黑" w:eastAsia="微软雅黑" w:hAnsi="微软雅黑" w:hint="eastAsia"/>
+          <w:color w:val="263445"/>
           <w:sz w:val="21"/>
         </w:rPr>
         <w:t>• KV 绑定 LEAVE_STATUS_DATA：保存分享记录、回收站/封存记录、管理员账号、登录会话、模板配置和链接统计。</w:t>
@@ -143,14 +189,18 @@
     </w:p>
     <w:p>
       <w:pPr>
-        <w:rPr>
-          <w:rFonts w:ascii="微软雅黑" w:eastAsia="微软雅黑" w:hAnsi="微软雅黑" w:hint="eastAsia"/>
-          <w:sz w:val="21"/>
-        </w:rPr>
-      </w:pPr>
-      <w:r>
-        <w:rPr>
-          <w:rFonts w:ascii="微软雅黑" w:eastAsia="微软雅黑" w:hAnsi="微软雅黑" w:hint="eastAsia"/>
+        <w:spacing w:after="80" w:line="300" w:lineRule="auto"/>
+        <w:ind w:left="283" w:hanging="130"/>
+        <w:rPr>
+          <w:rFonts w:ascii="微软雅黑" w:eastAsia="微软雅黑" w:hAnsi="微软雅黑" w:hint="eastAsia"/>
+          <w:color w:val="263445"/>
+          <w:sz w:val="21"/>
+        </w:rPr>
+      </w:pPr>
+      <w:r>
+        <w:rPr>
+          <w:rFonts w:ascii="微软雅黑" w:eastAsia="微软雅黑" w:hAnsi="微软雅黑" w:hint="eastAsia"/>
+          <w:color w:val="263445"/>
           <w:sz w:val="21"/>
         </w:rPr>
         <w:t>• R2 绑定 LEAVE_ATTACHMENTS：保存请假附件和销假附件的原图、压缩预览图。</w:t>
@@ -158,14 +208,18 @@
     </w:p>
     <w:p>
       <w:pPr>
-        <w:rPr>
-          <w:rFonts w:ascii="微软雅黑" w:eastAsia="微软雅黑" w:hAnsi="微软雅黑" w:hint="eastAsia"/>
-          <w:sz w:val="21"/>
-        </w:rPr>
-      </w:pPr>
-      <w:r>
-        <w:rPr>
-          <w:rFonts w:ascii="微软雅黑" w:eastAsia="微软雅黑" w:hAnsi="微软雅黑" w:hint="eastAsia"/>
+        <w:spacing w:after="80" w:line="300" w:lineRule="auto"/>
+        <w:ind w:left="283" w:hanging="130"/>
+        <w:rPr>
+          <w:rFonts w:ascii="微软雅黑" w:eastAsia="微软雅黑" w:hAnsi="微软雅黑" w:hint="eastAsia"/>
+          <w:color w:val="263445"/>
+          <w:sz w:val="21"/>
+        </w:rPr>
+      </w:pPr>
+      <w:r>
+        <w:rPr>
+          <w:rFonts w:ascii="微软雅黑" w:eastAsia="微软雅黑" w:hAnsi="微软雅黑" w:hint="eastAsia"/>
+          <w:color w:val="263445"/>
           <w:sz w:val="21"/>
         </w:rPr>
         <w:t>• D1 绑定 LEAVE_STATUS_D1：保存可查询索引和管理员状态镜像，schema 位于 migrations/0001_leave_status_d1.sql，同时在 src/constants.js 中内置用于运行期兜底建表。</w:t>
@@ -173,14 +227,19 @@
     </w:p>
     <w:p>
       <w:pPr>
-        <w:rPr>
-          <w:rFonts w:ascii="微软雅黑" w:eastAsia="微软雅黑" w:hAnsi="微软雅黑" w:hint="eastAsia"/>
-          <w:sz w:val="21"/>
-        </w:rPr>
-      </w:pPr>
-      <w:r>
-        <w:rPr>
-          <w:rFonts w:ascii="微软雅黑" w:eastAsia="微软雅黑" w:hAnsi="微软雅黑" w:hint="eastAsia"/>
+        <w:shd w:val="clear" w:color="auto" w:fill="FFF7E6"/>
+        <w:spacing w:after="80" w:line="300" w:lineRule="auto"/>
+        <w:ind w:left="283" w:hanging="130"/>
+        <w:rPr>
+          <w:rFonts w:ascii="微软雅黑" w:eastAsia="微软雅黑" w:hAnsi="微软雅黑" w:hint="eastAsia"/>
+          <w:color w:val="263445"/>
+          <w:sz w:val="21"/>
+        </w:rPr>
+      </w:pPr>
+      <w:r>
+        <w:rPr>
+          <w:rFonts w:ascii="微软雅黑" w:eastAsia="微软雅黑" w:hAnsi="微软雅黑" w:hint="eastAsia"/>
+          <w:color w:val="263445"/>
           <w:sz w:val="21"/>
         </w:rPr>
         <w:t>• Cloudflare Access：只保护后台入口和后台 API，公开分享页不要整体套 Access，否则外部访问者看不到分享链接。</w:t>
@@ -188,31 +247,38 @@
     </w:p>
     <w:p>
       <w:pPr>
-        <w:rPr>
-          <w:rFonts w:ascii="微软雅黑" w:eastAsia="微软雅黑" w:hAnsi="微软雅黑" w:hint="eastAsia"/>
+        <w:shd w:val="clear" w:color="auto" w:fill="EAF2FB"/>
+        <w:spacing w:before="240" w:after="140" w:line="380" w:lineRule="auto"/>
+        <w:rPr>
+          <w:rFonts w:ascii="Microsoft YaHei UI" w:eastAsia="Microsoft YaHei UI" w:hAnsi="Microsoft YaHei UI" w:hint="eastAsia"/>
           <w:b/>
-          <w:sz w:val="26"/>
-        </w:rPr>
-      </w:pPr>
-      <w:r>
-        <w:rPr>
-          <w:rFonts w:ascii="微软雅黑" w:eastAsia="微软雅黑" w:hAnsi="微软雅黑" w:hint="eastAsia"/>
+          <w:color w:val="17365D"/>
+          <w:sz w:val="28"/>
+        </w:rPr>
+      </w:pPr>
+      <w:r>
+        <w:rPr>
+          <w:rFonts w:ascii="Microsoft YaHei UI" w:eastAsia="Microsoft YaHei UI" w:hAnsi="Microsoft YaHei UI" w:hint="eastAsia"/>
           <w:b/>
-          <w:sz w:val="26"/>
+          <w:color w:val="17365D"/>
+          <w:sz w:val="28"/>
         </w:rPr>
         <w:t>2. 脱敏副本状态</w:t>
       </w:r>
     </w:p>
     <w:p>
       <w:pPr>
-        <w:rPr>
-          <w:rFonts w:ascii="微软雅黑" w:eastAsia="微软雅黑" w:hAnsi="微软雅黑" w:hint="eastAsia"/>
-          <w:sz w:val="21"/>
-        </w:rPr>
-      </w:pPr>
-      <w:r>
-        <w:rPr>
-          <w:rFonts w:ascii="微软雅黑" w:eastAsia="微软雅黑" w:hAnsi="微软雅黑" w:hint="eastAsia"/>
+        <w:spacing w:after="120" w:line="300" w:lineRule="auto"/>
+        <w:rPr>
+          <w:rFonts w:ascii="微软雅黑" w:eastAsia="微软雅黑" w:hAnsi="微软雅黑" w:hint="eastAsia"/>
+          <w:color w:val="263445"/>
+          <w:sz w:val="21"/>
+        </w:rPr>
+      </w:pPr>
+      <w:r>
+        <w:rPr>
+          <w:rFonts w:ascii="微软雅黑" w:eastAsia="微软雅黑" w:hAnsi="微软雅黑" w:hint="eastAsia"/>
+          <w:color w:val="263445"/>
           <w:sz w:val="21"/>
         </w:rPr>
         <w:t>本副本已经排除了原项目中的 .wrangler 本地缓存和构建产物，并增加 .gitignore 防止把本地状态、环境变量和日志提交到开源仓库。原项目目录没有被写入。</w:t>
@@ -220,14 +286,18 @@
     </w:p>
     <w:p>
       <w:pPr>
-        <w:rPr>
-          <w:rFonts w:ascii="微软雅黑" w:eastAsia="微软雅黑" w:hAnsi="微软雅黑" w:hint="eastAsia"/>
-          <w:sz w:val="21"/>
-        </w:rPr>
-      </w:pPr>
-      <w:r>
-        <w:rPr>
-          <w:rFonts w:ascii="微软雅黑" w:eastAsia="微软雅黑" w:hAnsi="微软雅黑" w:hint="eastAsia"/>
+        <w:spacing w:after="80" w:line="300" w:lineRule="auto"/>
+        <w:ind w:left="283" w:hanging="130"/>
+        <w:rPr>
+          <w:rFonts w:ascii="微软雅黑" w:eastAsia="微软雅黑" w:hAnsi="微软雅黑" w:hint="eastAsia"/>
+          <w:color w:val="263445"/>
+          <w:sz w:val="21"/>
+        </w:rPr>
+      </w:pPr>
+      <w:r>
+        <w:rPr>
+          <w:rFonts w:ascii="微软雅黑" w:eastAsia="微软雅黑" w:hAnsi="微软雅黑" w:hint="eastAsia"/>
+          <w:color w:val="263445"/>
           <w:sz w:val="21"/>
         </w:rPr>
         <w:t>• wrangler.toml 中的 Cloudflare KV/D1/R2 ID、Access 应用 ID、Policy ID、Audience、账号 ID 和邮箱已替换为占位符。</w:t>
@@ -235,14 +305,18 @@
     </w:p>
     <w:p>
       <w:pPr>
-        <w:rPr>
-          <w:rFonts w:ascii="微软雅黑" w:eastAsia="微软雅黑" w:hAnsi="微软雅黑" w:hint="eastAsia"/>
-          <w:sz w:val="21"/>
-        </w:rPr>
-      </w:pPr>
-      <w:r>
-        <w:rPr>
-          <w:rFonts w:ascii="微软雅黑" w:eastAsia="微软雅黑" w:hAnsi="微软雅黑" w:hint="eastAsia"/>
+        <w:spacing w:after="80" w:line="300" w:lineRule="auto"/>
+        <w:ind w:left="283" w:hanging="130"/>
+        <w:rPr>
+          <w:rFonts w:ascii="微软雅黑" w:eastAsia="微软雅黑" w:hAnsi="微软雅黑" w:hint="eastAsia"/>
+          <w:color w:val="263445"/>
+          <w:sz w:val="21"/>
+        </w:rPr>
+      </w:pPr>
+      <w:r>
+        <w:rPr>
+          <w:rFonts w:ascii="微软雅黑" w:eastAsia="微软雅黑" w:hAnsi="微软雅黑" w:hint="eastAsia"/>
+          <w:color w:val="263445"/>
           <w:sz w:val="21"/>
         </w:rPr>
         <w:t>• 默认学生姓名、学号、审批人、地址、定位 URL、学校服务 URL 已替换为示例数据。</w:t>
@@ -250,14 +324,19 @@
     </w:p>
     <w:p>
       <w:pPr>
-        <w:rPr>
-          <w:rFonts w:ascii="微软雅黑" w:eastAsia="微软雅黑" w:hAnsi="微软雅黑" w:hint="eastAsia"/>
-          <w:sz w:val="21"/>
-        </w:rPr>
-      </w:pPr>
-      <w:r>
-        <w:rPr>
-          <w:rFonts w:ascii="微软雅黑" w:eastAsia="微软雅黑" w:hAnsi="微软雅黑" w:hint="eastAsia"/>
+        <w:shd w:val="clear" w:color="auto" w:fill="FFF7E6"/>
+        <w:spacing w:after="80" w:line="300" w:lineRule="auto"/>
+        <w:ind w:left="283" w:hanging="130"/>
+        <w:rPr>
+          <w:rFonts w:ascii="微软雅黑" w:eastAsia="微软雅黑" w:hAnsi="微软雅黑" w:hint="eastAsia"/>
+          <w:color w:val="263445"/>
+          <w:sz w:val="21"/>
+        </w:rPr>
+      </w:pPr>
+      <w:r>
+        <w:rPr>
+          <w:rFonts w:ascii="微软雅黑" w:eastAsia="微软雅黑" w:hAnsi="微软雅黑" w:hint="eastAsia"/>
+          <w:color w:val="263445"/>
           <w:sz w:val="21"/>
         </w:rPr>
         <w:t>• 前端固定展示的 app.example.com、example.com 均为占位域名，部署前必须替换为自己的域名。</w:t>
@@ -265,14 +344,18 @@
     </w:p>
     <w:p>
       <w:pPr>
-        <w:rPr>
-          <w:rFonts w:ascii="微软雅黑" w:eastAsia="微软雅黑" w:hAnsi="微软雅黑" w:hint="eastAsia"/>
-          <w:sz w:val="21"/>
-        </w:rPr>
-      </w:pPr>
-      <w:r>
-        <w:rPr>
-          <w:rFonts w:ascii="微软雅黑" w:eastAsia="微软雅黑" w:hAnsi="微软雅黑" w:hint="eastAsia"/>
+        <w:spacing w:after="80" w:line="300" w:lineRule="auto"/>
+        <w:ind w:left="283" w:hanging="130"/>
+        <w:rPr>
+          <w:rFonts w:ascii="微软雅黑" w:eastAsia="微软雅黑" w:hAnsi="微软雅黑" w:hint="eastAsia"/>
+          <w:color w:val="263445"/>
+          <w:sz w:val="21"/>
+        </w:rPr>
+      </w:pPr>
+      <w:r>
+        <w:rPr>
+          <w:rFonts w:ascii="微软雅黑" w:eastAsia="微软雅黑" w:hAnsi="微软雅黑" w:hint="eastAsia"/>
+          <w:color w:val="263445"/>
           <w:sz w:val="21"/>
         </w:rPr>
         <w:t>• public/china-divisions.js 是省市区选择器数据，包含大量地名，敏感词扫描时出现地名命中属于正常数据集命中，不是个人信息。</w:t>
@@ -280,31 +363,38 @@
     </w:p>
     <w:p>
       <w:pPr>
-        <w:rPr>
-          <w:rFonts w:ascii="微软雅黑" w:eastAsia="微软雅黑" w:hAnsi="微软雅黑" w:hint="eastAsia"/>
+        <w:shd w:val="clear" w:color="auto" w:fill="EAF2FB"/>
+        <w:spacing w:before="240" w:after="140" w:line="380" w:lineRule="auto"/>
+        <w:rPr>
+          <w:rFonts w:ascii="Microsoft YaHei UI" w:eastAsia="Microsoft YaHei UI" w:hAnsi="Microsoft YaHei UI" w:hint="eastAsia"/>
           <w:b/>
-          <w:sz w:val="26"/>
-        </w:rPr>
-      </w:pPr>
-      <w:r>
-        <w:rPr>
-          <w:rFonts w:ascii="微软雅黑" w:eastAsia="微软雅黑" w:hAnsi="微软雅黑" w:hint="eastAsia"/>
+          <w:color w:val="17365D"/>
+          <w:sz w:val="28"/>
+        </w:rPr>
+      </w:pPr>
+      <w:r>
+        <w:rPr>
+          <w:rFonts w:ascii="Microsoft YaHei UI" w:eastAsia="Microsoft YaHei UI" w:hAnsi="Microsoft YaHei UI" w:hint="eastAsia"/>
           <w:b/>
-          <w:sz w:val="26"/>
+          <w:color w:val="17365D"/>
+          <w:sz w:val="28"/>
         </w:rPr>
         <w:t>3. 部署前必须修改的行</w:t>
       </w:r>
     </w:p>
     <w:p>
       <w:pPr>
-        <w:rPr>
-          <w:rFonts w:ascii="微软雅黑" w:eastAsia="微软雅黑" w:hAnsi="微软雅黑" w:hint="eastAsia"/>
-          <w:sz w:val="21"/>
-        </w:rPr>
-      </w:pPr>
-      <w:r>
-        <w:rPr>
-          <w:rFonts w:ascii="微软雅黑" w:eastAsia="微软雅黑" w:hAnsi="微软雅黑" w:hint="eastAsia"/>
+        <w:spacing w:after="120" w:line="300" w:lineRule="auto"/>
+        <w:rPr>
+          <w:rFonts w:ascii="微软雅黑" w:eastAsia="微软雅黑" w:hAnsi="微软雅黑" w:hint="eastAsia"/>
+          <w:color w:val="263445"/>
+          <w:sz w:val="21"/>
+        </w:rPr>
+      </w:pPr>
+      <w:r>
+        <w:rPr>
+          <w:rFonts w:ascii="微软雅黑" w:eastAsia="微软雅黑" w:hAnsi="微软雅黑" w:hint="eastAsia"/>
+          <w:color w:val="263445"/>
           <w:sz w:val="21"/>
         </w:rPr>
         <w:t>以下步骤按建议顺序执行。示例假设你的根域名是 yourdomain.com，后台默认子域名是 app.yourdomain.com。若你使用其他子域名，所有 app.yourdomain.com 都替换为你的实际后台域名。</w:t>
@@ -312,14 +402,17 @@
     </w:p>
     <w:p>
       <w:pPr>
-        <w:rPr>
-          <w:rFonts w:ascii="微软雅黑" w:eastAsia="微软雅黑" w:hAnsi="微软雅黑" w:hint="eastAsia"/>
-          <w:sz w:val="21"/>
-        </w:rPr>
-      </w:pPr>
-      <w:r>
-        <w:rPr>
-          <w:rFonts w:ascii="微软雅黑" w:eastAsia="微软雅黑" w:hAnsi="微软雅黑" w:hint="eastAsia"/>
+        <w:spacing w:after="120" w:line="300" w:lineRule="auto"/>
+        <w:rPr>
+          <w:rFonts w:ascii="微软雅黑" w:eastAsia="微软雅黑" w:hAnsi="微软雅黑" w:hint="eastAsia"/>
+          <w:color w:val="263445"/>
+          <w:sz w:val="21"/>
+        </w:rPr>
+      </w:pPr>
+      <w:r>
+        <w:rPr>
+          <w:rFonts w:ascii="微软雅黑" w:eastAsia="微软雅黑" w:hAnsi="微软雅黑" w:hint="eastAsia"/>
+          <w:color w:val="263445"/>
           <w:sz w:val="21"/>
         </w:rPr>
         <w:t>3.1 修改 Worker 资源与路由</w:t>
@@ -327,14 +420,18 @@
     </w:p>
     <w:p>
       <w:pPr>
-        <w:rPr>
-          <w:rFonts w:ascii="微软雅黑" w:eastAsia="微软雅黑" w:hAnsi="微软雅黑" w:hint="eastAsia"/>
-          <w:sz w:val="21"/>
-        </w:rPr>
-      </w:pPr>
-      <w:r>
-        <w:rPr>
-          <w:rFonts w:ascii="微软雅黑" w:eastAsia="微软雅黑" w:hAnsi="微软雅黑" w:hint="eastAsia"/>
+        <w:spacing w:after="80" w:line="300" w:lineRule="auto"/>
+        <w:ind w:left="283" w:hanging="130"/>
+        <w:rPr>
+          <w:rFonts w:ascii="微软雅黑" w:eastAsia="微软雅黑" w:hAnsi="微软雅黑" w:hint="eastAsia"/>
+          <w:color w:val="263445"/>
+          <w:sz w:val="21"/>
+        </w:rPr>
+      </w:pPr>
+      <w:r>
+        <w:rPr>
+          <w:rFonts w:ascii="微软雅黑" w:eastAsia="微软雅黑" w:hAnsi="微软雅黑" w:hint="eastAsia"/>
+          <w:color w:val="263445"/>
           <w:sz w:val="21"/>
         </w:rPr>
         <w:t>• wrangler.toml 第 1 行：name 可保留 leave-status-admin，也可改成你的 Worker 名称，例如 leave-status-prod。</w:t>
@@ -342,14 +439,18 @@
     </w:p>
     <w:p>
       <w:pPr>
-        <w:rPr>
-          <w:rFonts w:ascii="微软雅黑" w:eastAsia="微软雅黑" w:hAnsi="微软雅黑" w:hint="eastAsia"/>
-          <w:sz w:val="21"/>
-        </w:rPr>
-      </w:pPr>
-      <w:r>
-        <w:rPr>
-          <w:rFonts w:ascii="微软雅黑" w:eastAsia="微软雅黑" w:hAnsi="微软雅黑" w:hint="eastAsia"/>
+        <w:spacing w:after="80" w:line="300" w:lineRule="auto"/>
+        <w:ind w:left="283" w:hanging="130"/>
+        <w:rPr>
+          <w:rFonts w:ascii="微软雅黑" w:eastAsia="微软雅黑" w:hAnsi="微软雅黑" w:hint="eastAsia"/>
+          <w:color w:val="263445"/>
+          <w:sz w:val="21"/>
+        </w:rPr>
+      </w:pPr>
+      <w:r>
+        <w:rPr>
+          <w:rFonts w:ascii="微软雅黑" w:eastAsia="微软雅黑" w:hAnsi="微软雅黑" w:hint="eastAsia"/>
+          <w:color w:val="263445"/>
           <w:sz w:val="21"/>
         </w:rPr>
         <w:t>• wrangler.toml 第 7 行：把 REPLACE_WITH_KV_NAMESPACE_ID 改成生产 KV namespace id；preview_id 可以改成独立预览 namespace id，不使用预览环境时可以删除 preview_id 这一项。</w:t>
@@ -357,14 +458,18 @@
     </w:p>
     <w:p>
       <w:pPr>
-        <w:rPr>
-          <w:rFonts w:ascii="微软雅黑" w:eastAsia="微软雅黑" w:hAnsi="微软雅黑" w:hint="eastAsia"/>
-          <w:sz w:val="21"/>
-        </w:rPr>
-      </w:pPr>
-      <w:r>
-        <w:rPr>
-          <w:rFonts w:ascii="微软雅黑" w:eastAsia="微软雅黑" w:hAnsi="微软雅黑" w:hint="eastAsia"/>
+        <w:spacing w:after="80" w:line="300" w:lineRule="auto"/>
+        <w:ind w:left="283" w:hanging="130"/>
+        <w:rPr>
+          <w:rFonts w:ascii="微软雅黑" w:eastAsia="微软雅黑" w:hAnsi="微软雅黑" w:hint="eastAsia"/>
+          <w:color w:val="263445"/>
+          <w:sz w:val="21"/>
+        </w:rPr>
+      </w:pPr>
+      <w:r>
+        <w:rPr>
+          <w:rFonts w:ascii="微软雅黑" w:eastAsia="微软雅黑" w:hAnsi="微软雅黑" w:hint="eastAsia"/>
+          <w:color w:val="263445"/>
           <w:sz w:val="21"/>
         </w:rPr>
         <w:t>• wrangler.toml 第 11 行：把 example.com/login* 改成 app.yourdomain.com/login*，zone_name 改成 yourdomain.com；如果你希望保留根域名登录入口，也可以改成 yourdomain.com/login*，但 Access 应用也要覆盖对应入口。</w:t>
@@ -372,14 +477,18 @@
     </w:p>
     <w:p>
       <w:pPr>
-        <w:rPr>
-          <w:rFonts w:ascii="微软雅黑" w:eastAsia="微软雅黑" w:hAnsi="微软雅黑" w:hint="eastAsia"/>
-          <w:sz w:val="21"/>
-        </w:rPr>
-      </w:pPr>
-      <w:r>
-        <w:rPr>
-          <w:rFonts w:ascii="微软雅黑" w:eastAsia="微软雅黑" w:hAnsi="微软雅黑" w:hint="eastAsia"/>
+        <w:spacing w:after="80" w:line="300" w:lineRule="auto"/>
+        <w:ind w:left="283" w:hanging="130"/>
+        <w:rPr>
+          <w:rFonts w:ascii="微软雅黑" w:eastAsia="微软雅黑" w:hAnsi="微软雅黑" w:hint="eastAsia"/>
+          <w:color w:val="263445"/>
+          <w:sz w:val="21"/>
+        </w:rPr>
+      </w:pPr>
+      <w:r>
+        <w:rPr>
+          <w:rFonts w:ascii="微软雅黑" w:eastAsia="微软雅黑" w:hAnsi="微软雅黑" w:hint="eastAsia"/>
+          <w:color w:val="263445"/>
           <w:sz w:val="21"/>
         </w:rPr>
         <w:t>• wrangler.toml 第 12 行：把 *.example.com/* 改成 *.yourdomain.com/*，用于支持自定义二级域名分享链接。保留这条 wildcard route 时，还要确保 Cloudflare DNS 中存在可解析并走橙云代理的通配子域名记录；否则自定义子域名链接会 DNS 失败。若不开放自定义二级域名，可删除这条 wildcard route，并避免在后台启用自定义二级域名。</w:t>
@@ -387,14 +496,18 @@
     </w:p>
     <w:p>
       <w:pPr>
-        <w:rPr>
-          <w:rFonts w:ascii="微软雅黑" w:eastAsia="微软雅黑" w:hAnsi="微软雅黑" w:hint="eastAsia"/>
-          <w:sz w:val="21"/>
-        </w:rPr>
-      </w:pPr>
-      <w:r>
-        <w:rPr>
-          <w:rFonts w:ascii="微软雅黑" w:eastAsia="微软雅黑" w:hAnsi="微软雅黑" w:hint="eastAsia"/>
+        <w:spacing w:after="80" w:line="300" w:lineRule="auto"/>
+        <w:ind w:left="283" w:hanging="130"/>
+        <w:rPr>
+          <w:rFonts w:ascii="微软雅黑" w:eastAsia="微软雅黑" w:hAnsi="微软雅黑" w:hint="eastAsia"/>
+          <w:color w:val="263445"/>
+          <w:sz w:val="21"/>
+        </w:rPr>
+      </w:pPr>
+      <w:r>
+        <w:rPr>
+          <w:rFonts w:ascii="微软雅黑" w:eastAsia="微软雅黑" w:hAnsi="微软雅黑" w:hint="eastAsia"/>
+          <w:color w:val="263445"/>
           <w:sz w:val="21"/>
         </w:rPr>
         <w:t>• wrangler.toml 第 13 行：把 app.example.com 改成 app.yourdomain.com。</w:t>
@@ -402,14 +515,19 @@
     </w:p>
     <w:p>
       <w:pPr>
-        <w:rPr>
-          <w:rFonts w:ascii="微软雅黑" w:eastAsia="微软雅黑" w:hAnsi="微软雅黑" w:hint="eastAsia"/>
-          <w:sz w:val="21"/>
-        </w:rPr>
-      </w:pPr>
-      <w:r>
-        <w:rPr>
-          <w:rFonts w:ascii="微软雅黑" w:eastAsia="微软雅黑" w:hAnsi="微软雅黑" w:hint="eastAsia"/>
+        <w:shd w:val="clear" w:color="auto" w:fill="FFF7E6"/>
+        <w:spacing w:after="80" w:line="300" w:lineRule="auto"/>
+        <w:ind w:left="283" w:hanging="130"/>
+        <w:rPr>
+          <w:rFonts w:ascii="微软雅黑" w:eastAsia="微软雅黑" w:hAnsi="微软雅黑" w:hint="eastAsia"/>
+          <w:color w:val="263445"/>
+          <w:sz w:val="21"/>
+        </w:rPr>
+      </w:pPr>
+      <w:r>
+        <w:rPr>
+          <w:rFonts w:ascii="微软雅黑" w:eastAsia="微软雅黑" w:hAnsi="微软雅黑" w:hint="eastAsia"/>
+          <w:color w:val="263445"/>
           <w:sz w:val="21"/>
         </w:rPr>
         <w:t>• wrangler.toml 第 17 行：把 admin@example.com 改成你的超级管理员邮箱，此邮箱必须能通过 Cloudflare Access。</w:t>
@@ -417,14 +535,18 @@
     </w:p>
     <w:p>
       <w:pPr>
-        <w:rPr>
-          <w:rFonts w:ascii="微软雅黑" w:eastAsia="微软雅黑" w:hAnsi="微软雅黑" w:hint="eastAsia"/>
-          <w:sz w:val="21"/>
-        </w:rPr>
-      </w:pPr>
-      <w:r>
-        <w:rPr>
-          <w:rFonts w:ascii="微软雅黑" w:eastAsia="微软雅黑" w:hAnsi="微软雅黑" w:hint="eastAsia"/>
+        <w:spacing w:after="80" w:line="300" w:lineRule="auto"/>
+        <w:ind w:left="283" w:hanging="130"/>
+        <w:rPr>
+          <w:rFonts w:ascii="微软雅黑" w:eastAsia="微软雅黑" w:hAnsi="微软雅黑" w:hint="eastAsia"/>
+          <w:color w:val="263445"/>
+          <w:sz w:val="21"/>
+        </w:rPr>
+      </w:pPr>
+      <w:r>
+        <w:rPr>
+          <w:rFonts w:ascii="微软雅黑" w:eastAsia="微软雅黑" w:hAnsi="微软雅黑" w:hint="eastAsia"/>
+          <w:color w:val="263445"/>
           <w:sz w:val="21"/>
         </w:rPr>
         <w:t>• wrangler.toml 第 18 行：把 REPLACE_WITH_CLOUDFLARE_ACCOUNT_ID 改成你的 Cloudflare Account ID。</w:t>
@@ -432,14 +554,19 @@
     </w:p>
     <w:p>
       <w:pPr>
-        <w:rPr>
-          <w:rFonts w:ascii="微软雅黑" w:eastAsia="微软雅黑" w:hAnsi="微软雅黑" w:hint="eastAsia"/>
-          <w:sz w:val="21"/>
-        </w:rPr>
-      </w:pPr>
-      <w:r>
-        <w:rPr>
-          <w:rFonts w:ascii="微软雅黑" w:eastAsia="微软雅黑" w:hAnsi="微软雅黑" w:hint="eastAsia"/>
+        <w:shd w:val="clear" w:color="auto" w:fill="FFF7E6"/>
+        <w:spacing w:after="80" w:line="300" w:lineRule="auto"/>
+        <w:ind w:left="283" w:hanging="130"/>
+        <w:rPr>
+          <w:rFonts w:ascii="微软雅黑" w:eastAsia="微软雅黑" w:hAnsi="微软雅黑" w:hint="eastAsia"/>
+          <w:color w:val="263445"/>
+          <w:sz w:val="21"/>
+        </w:rPr>
+      </w:pPr>
+      <w:r>
+        <w:rPr>
+          <w:rFonts w:ascii="微软雅黑" w:eastAsia="微软雅黑" w:hAnsi="微软雅黑" w:hint="eastAsia"/>
+          <w:color w:val="263445"/>
           <w:sz w:val="21"/>
         </w:rPr>
         <w:t>• wrangler.toml 第 19 行：把 your-team.cloudflareaccess.com 改成你的 Zero Trust team domain，只填主机名，不要加 https://。</w:t>
@@ -447,14 +574,18 @@
     </w:p>
     <w:p>
       <w:pPr>
-        <w:rPr>
-          <w:rFonts w:ascii="微软雅黑" w:eastAsia="微软雅黑" w:hAnsi="微软雅黑" w:hint="eastAsia"/>
-          <w:sz w:val="21"/>
-        </w:rPr>
-      </w:pPr>
-      <w:r>
-        <w:rPr>
-          <w:rFonts w:ascii="微软雅黑" w:eastAsia="微软雅黑" w:hAnsi="微软雅黑" w:hint="eastAsia"/>
+        <w:spacing w:after="80" w:line="300" w:lineRule="auto"/>
+        <w:ind w:left="283" w:hanging="130"/>
+        <w:rPr>
+          <w:rFonts w:ascii="微软雅黑" w:eastAsia="微软雅黑" w:hAnsi="微软雅黑" w:hint="eastAsia"/>
+          <w:color w:val="263445"/>
+          <w:sz w:val="21"/>
+        </w:rPr>
+      </w:pPr>
+      <w:r>
+        <w:rPr>
+          <w:rFonts w:ascii="微软雅黑" w:eastAsia="微软雅黑" w:hAnsi="微软雅黑" w:hint="eastAsia"/>
+          <w:color w:val="263445"/>
           <w:sz w:val="21"/>
         </w:rPr>
         <w:t>• wrangler.toml 第 20 行：填超级管理员 Access 应用的 AUD。</w:t>
@@ -462,14 +593,18 @@
     </w:p>
     <w:p>
       <w:pPr>
-        <w:rPr>
-          <w:rFonts w:ascii="微软雅黑" w:eastAsia="微软雅黑" w:hAnsi="微软雅黑" w:hint="eastAsia"/>
-          <w:sz w:val="21"/>
-        </w:rPr>
-      </w:pPr>
-      <w:r>
-        <w:rPr>
-          <w:rFonts w:ascii="微软雅黑" w:eastAsia="微软雅黑" w:hAnsi="微软雅黑" w:hint="eastAsia"/>
+        <w:spacing w:after="80" w:line="300" w:lineRule="auto"/>
+        <w:ind w:left="283" w:hanging="130"/>
+        <w:rPr>
+          <w:rFonts w:ascii="微软雅黑" w:eastAsia="微软雅黑" w:hAnsi="微软雅黑" w:hint="eastAsia"/>
+          <w:color w:val="263445"/>
+          <w:sz w:val="21"/>
+        </w:rPr>
+      </w:pPr>
+      <w:r>
+        <w:rPr>
+          <w:rFonts w:ascii="微软雅黑" w:eastAsia="微软雅黑" w:hAnsi="微软雅黑" w:hint="eastAsia"/>
+          <w:color w:val="263445"/>
           <w:sz w:val="21"/>
         </w:rPr>
         <w:t>• wrangler.toml 第 21 行：填普通管理员 Access 应用的 Application ID。</w:t>
@@ -477,14 +612,18 @@
     </w:p>
     <w:p>
       <w:pPr>
-        <w:rPr>
-          <w:rFonts w:ascii="微软雅黑" w:eastAsia="微软雅黑" w:hAnsi="微软雅黑" w:hint="eastAsia"/>
-          <w:sz w:val="21"/>
-        </w:rPr>
-      </w:pPr>
-      <w:r>
-        <w:rPr>
-          <w:rFonts w:ascii="微软雅黑" w:eastAsia="微软雅黑" w:hAnsi="微软雅黑" w:hint="eastAsia"/>
+        <w:spacing w:after="80" w:line="300" w:lineRule="auto"/>
+        <w:ind w:left="283" w:hanging="130"/>
+        <w:rPr>
+          <w:rFonts w:ascii="微软雅黑" w:eastAsia="微软雅黑" w:hAnsi="微软雅黑" w:hint="eastAsia"/>
+          <w:color w:val="263445"/>
+          <w:sz w:val="21"/>
+        </w:rPr>
+      </w:pPr>
+      <w:r>
+        <w:rPr>
+          <w:rFonts w:ascii="微软雅黑" w:eastAsia="微软雅黑" w:hAnsi="微软雅黑" w:hint="eastAsia"/>
+          <w:color w:val="263445"/>
           <w:sz w:val="21"/>
         </w:rPr>
         <w:t>• wrangler.toml 第 22 行：填普通管理员 Access 应用中会被同步的 Allow Policy ID。</w:t>
@@ -492,14 +631,18 @@
     </w:p>
     <w:p>
       <w:pPr>
-        <w:rPr>
-          <w:rFonts w:ascii="微软雅黑" w:eastAsia="微软雅黑" w:hAnsi="微软雅黑" w:hint="eastAsia"/>
-          <w:sz w:val="21"/>
-        </w:rPr>
-      </w:pPr>
-      <w:r>
-        <w:rPr>
-          <w:rFonts w:ascii="微软雅黑" w:eastAsia="微软雅黑" w:hAnsi="微软雅黑" w:hint="eastAsia"/>
+        <w:spacing w:after="80" w:line="300" w:lineRule="auto"/>
+        <w:ind w:left="283" w:hanging="130"/>
+        <w:rPr>
+          <w:rFonts w:ascii="微软雅黑" w:eastAsia="微软雅黑" w:hAnsi="微软雅黑" w:hint="eastAsia"/>
+          <w:color w:val="263445"/>
+          <w:sz w:val="21"/>
+        </w:rPr>
+      </w:pPr>
+      <w:r>
+        <w:rPr>
+          <w:rFonts w:ascii="微软雅黑" w:eastAsia="微软雅黑" w:hAnsi="微软雅黑" w:hint="eastAsia"/>
+          <w:color w:val="263445"/>
           <w:sz w:val="21"/>
         </w:rPr>
         <w:t>• wrangler.toml 第 23 行：填普通管理员 Access 应用的 AUD。</w:t>
@@ -507,14 +650,19 @@
     </w:p>
     <w:p>
       <w:pPr>
-        <w:rPr>
-          <w:rFonts w:ascii="微软雅黑" w:eastAsia="微软雅黑" w:hAnsi="微软雅黑" w:hint="eastAsia"/>
-          <w:sz w:val="21"/>
-        </w:rPr>
-      </w:pPr>
-      <w:r>
-        <w:rPr>
-          <w:rFonts w:ascii="微软雅黑" w:eastAsia="微软雅黑" w:hAnsi="微软雅黑" w:hint="eastAsia"/>
+        <w:shd w:val="clear" w:color="auto" w:fill="FFF7E6"/>
+        <w:spacing w:after="80" w:line="300" w:lineRule="auto"/>
+        <w:ind w:left="283" w:hanging="130"/>
+        <w:rPr>
+          <w:rFonts w:ascii="微软雅黑" w:eastAsia="微软雅黑" w:hAnsi="微软雅黑" w:hint="eastAsia"/>
+          <w:color w:val="263445"/>
+          <w:sz w:val="21"/>
+        </w:rPr>
+      </w:pPr>
+      <w:r>
+        <w:rPr>
+          <w:rFonts w:ascii="微软雅黑" w:eastAsia="微软雅黑" w:hAnsi="微软雅黑" w:hint="eastAsia"/>
+          <w:color w:val="263445"/>
           <w:sz w:val="21"/>
         </w:rPr>
         <w:t>• wrangler.toml 第 24 行：ADMIN_EMAIL_REPLACEMENTS_JSON 只用于旧用户名映射到邮箱；新部署保持 {}。</w:t>
@@ -522,14 +670,18 @@
     </w:p>
     <w:p>
       <w:pPr>
-        <w:rPr>
-          <w:rFonts w:ascii="微软雅黑" w:eastAsia="微软雅黑" w:hAnsi="微软雅黑" w:hint="eastAsia"/>
-          <w:sz w:val="21"/>
-        </w:rPr>
-      </w:pPr>
-      <w:r>
-        <w:rPr>
-          <w:rFonts w:ascii="微软雅黑" w:eastAsia="微软雅黑" w:hAnsi="微软雅黑" w:hint="eastAsia"/>
+        <w:spacing w:after="80" w:line="300" w:lineRule="auto"/>
+        <w:ind w:left="283" w:hanging="130"/>
+        <w:rPr>
+          <w:rFonts w:ascii="微软雅黑" w:eastAsia="微软雅黑" w:hAnsi="微软雅黑" w:hint="eastAsia"/>
+          <w:color w:val="263445"/>
+          <w:sz w:val="21"/>
+        </w:rPr>
+      </w:pPr>
+      <w:r>
+        <w:rPr>
+          <w:rFonts w:ascii="微软雅黑" w:eastAsia="微软雅黑" w:hAnsi="微软雅黑" w:hint="eastAsia"/>
+          <w:color w:val="263445"/>
           <w:sz w:val="21"/>
         </w:rPr>
         <w:t>• wrangler.toml 第 34 行：bucket_name 改成你实际创建的 R2 bucket 名称。</w:t>
@@ -537,14 +689,18 @@
     </w:p>
     <w:p>
       <w:pPr>
-        <w:rPr>
-          <w:rFonts w:ascii="微软雅黑" w:eastAsia="微软雅黑" w:hAnsi="微软雅黑" w:hint="eastAsia"/>
-          <w:sz w:val="21"/>
-        </w:rPr>
-      </w:pPr>
-      <w:r>
-        <w:rPr>
-          <w:rFonts w:ascii="微软雅黑" w:eastAsia="微软雅黑" w:hAnsi="微软雅黑" w:hint="eastAsia"/>
+        <w:spacing w:after="80" w:line="300" w:lineRule="auto"/>
+        <w:ind w:left="283" w:hanging="130"/>
+        <w:rPr>
+          <w:rFonts w:ascii="微软雅黑" w:eastAsia="微软雅黑" w:hAnsi="微软雅黑" w:hint="eastAsia"/>
+          <w:color w:val="263445"/>
+          <w:sz w:val="21"/>
+        </w:rPr>
+      </w:pPr>
+      <w:r>
+        <w:rPr>
+          <w:rFonts w:ascii="微软雅黑" w:eastAsia="微软雅黑" w:hAnsi="微软雅黑" w:hint="eastAsia"/>
+          <w:color w:val="263445"/>
           <w:sz w:val="21"/>
         </w:rPr>
         <w:t>• wrangler.toml 第 38-39 行：database_name 和 database_id 改成你实际创建的 D1 数据库名称与 UUID。</w:t>
@@ -552,14 +708,17 @@
     </w:p>
     <w:p>
       <w:pPr>
-        <w:rPr>
-          <w:rFonts w:ascii="微软雅黑" w:eastAsia="微软雅黑" w:hAnsi="微软雅黑" w:hint="eastAsia"/>
-          <w:sz w:val="21"/>
-        </w:rPr>
-      </w:pPr>
-      <w:r>
-        <w:rPr>
-          <w:rFonts w:ascii="微软雅黑" w:eastAsia="微软雅黑" w:hAnsi="微软雅黑" w:hint="eastAsia"/>
+        <w:spacing w:after="120" w:line="300" w:lineRule="auto"/>
+        <w:rPr>
+          <w:rFonts w:ascii="微软雅黑" w:eastAsia="微软雅黑" w:hAnsi="微软雅黑" w:hint="eastAsia"/>
+          <w:color w:val="263445"/>
+          <w:sz w:val="21"/>
+        </w:rPr>
+      </w:pPr>
+      <w:r>
+        <w:rPr>
+          <w:rFonts w:ascii="微软雅黑" w:eastAsia="微软雅黑" w:hAnsi="微软雅黑" w:hint="eastAsia"/>
+          <w:color w:val="263445"/>
           <w:sz w:val="21"/>
         </w:rPr>
         <w:t>3.2 修改业务域名常量</w:t>
@@ -567,14 +726,18 @@
     </w:p>
     <w:p>
       <w:pPr>
-        <w:rPr>
-          <w:rFonts w:ascii="微软雅黑" w:eastAsia="微软雅黑" w:hAnsi="微软雅黑" w:hint="eastAsia"/>
-          <w:sz w:val="21"/>
-        </w:rPr>
-      </w:pPr>
-      <w:r>
-        <w:rPr>
-          <w:rFonts w:ascii="微软雅黑" w:eastAsia="微软雅黑" w:hAnsi="微软雅黑" w:hint="eastAsia"/>
+        <w:spacing w:after="80" w:line="300" w:lineRule="auto"/>
+        <w:ind w:left="283" w:hanging="130"/>
+        <w:rPr>
+          <w:rFonts w:ascii="微软雅黑" w:eastAsia="微软雅黑" w:hAnsi="微软雅黑" w:hint="eastAsia"/>
+          <w:color w:val="263445"/>
+          <w:sz w:val="21"/>
+        </w:rPr>
+      </w:pPr>
+      <w:r>
+        <w:rPr>
+          <w:rFonts w:ascii="微软雅黑" w:eastAsia="微软雅黑" w:hAnsi="微软雅黑" w:hint="eastAsia"/>
+          <w:color w:val="263445"/>
           <w:sz w:val="21"/>
         </w:rPr>
         <w:t>• src/constants.js 第 27 行：SHARE_ROOT_DOMAIN 改成 yourdomain.com。</w:t>
@@ -582,14 +745,18 @@
     </w:p>
     <w:p>
       <w:pPr>
-        <w:rPr>
-          <w:rFonts w:ascii="微软雅黑" w:eastAsia="微软雅黑" w:hAnsi="微软雅黑" w:hint="eastAsia"/>
-          <w:sz w:val="21"/>
-        </w:rPr>
-      </w:pPr>
-      <w:r>
-        <w:rPr>
-          <w:rFonts w:ascii="微软雅黑" w:eastAsia="微软雅黑" w:hAnsi="微软雅黑" w:hint="eastAsia"/>
+        <w:spacing w:after="80" w:line="300" w:lineRule="auto"/>
+        <w:ind w:left="283" w:hanging="130"/>
+        <w:rPr>
+          <w:rFonts w:ascii="微软雅黑" w:eastAsia="微软雅黑" w:hAnsi="微软雅黑" w:hint="eastAsia"/>
+          <w:color w:val="263445"/>
+          <w:sz w:val="21"/>
+        </w:rPr>
+      </w:pPr>
+      <w:r>
+        <w:rPr>
+          <w:rFonts w:ascii="微软雅黑" w:eastAsia="微软雅黑" w:hAnsi="微软雅黑" w:hint="eastAsia"/>
+          <w:color w:val="263445"/>
           <w:sz w:val="21"/>
         </w:rPr>
         <w:t>• src/constants.js 第 28 行：DEFAULT_SHARE_SUBDOMAIN 改成 app，或你的默认后台/分享子域名前缀。</w:t>
@@ -597,14 +764,18 @@
     </w:p>
     <w:p>
       <w:pPr>
-        <w:rPr>
-          <w:rFonts w:ascii="微软雅黑" w:eastAsia="微软雅黑" w:hAnsi="微软雅黑" w:hint="eastAsia"/>
-          <w:sz w:val="21"/>
-        </w:rPr>
-      </w:pPr>
-      <w:r>
-        <w:rPr>
-          <w:rFonts w:ascii="微软雅黑" w:eastAsia="微软雅黑" w:hAnsi="微软雅黑" w:hint="eastAsia"/>
+        <w:spacing w:after="80" w:line="300" w:lineRule="auto"/>
+        <w:ind w:left="283" w:hanging="130"/>
+        <w:rPr>
+          <w:rFonts w:ascii="微软雅黑" w:eastAsia="微软雅黑" w:hAnsi="微软雅黑" w:hint="eastAsia"/>
+          <w:color w:val="263445"/>
+          <w:sz w:val="21"/>
+        </w:rPr>
+      </w:pPr>
+      <w:r>
+        <w:rPr>
+          <w:rFonts w:ascii="微软雅黑" w:eastAsia="微软雅黑" w:hAnsi="微软雅黑" w:hint="eastAsia"/>
+          <w:color w:val="263445"/>
           <w:sz w:val="21"/>
         </w:rPr>
         <w:t>• src/constants.js 第 44 行：ATTACHMENT_PUBLIC_BASE_URL 改成 https://app.yourdomain.com/uploads。</w:t>
@@ -612,14 +783,18 @@
     </w:p>
     <w:p>
       <w:pPr>
-        <w:rPr>
-          <w:rFonts w:ascii="微软雅黑" w:eastAsia="微软雅黑" w:hAnsi="微软雅黑" w:hint="eastAsia"/>
-          <w:sz w:val="21"/>
-        </w:rPr>
-      </w:pPr>
-      <w:r>
-        <w:rPr>
-          <w:rFonts w:ascii="微软雅黑" w:eastAsia="微软雅黑" w:hAnsi="微软雅黑" w:hint="eastAsia"/>
+        <w:spacing w:after="80" w:line="300" w:lineRule="auto"/>
+        <w:ind w:left="283" w:hanging="130"/>
+        <w:rPr>
+          <w:rFonts w:ascii="微软雅黑" w:eastAsia="微软雅黑" w:hAnsi="微软雅黑" w:hint="eastAsia"/>
+          <w:color w:val="263445"/>
+          <w:sz w:val="21"/>
+        </w:rPr>
+      </w:pPr>
+      <w:r>
+        <w:rPr>
+          <w:rFonts w:ascii="微软雅黑" w:eastAsia="微软雅黑" w:hAnsi="微软雅黑" w:hint="eastAsia"/>
+          <w:color w:val="263445"/>
           <w:sz w:val="21"/>
         </w:rPr>
         <w:t>• src/constants.js 第 45 行：COMPLETION_ATTACHMENT_PUBLIC_BASE_URL 改成 https://app.yourdomain.com/completion-uploads。</w:t>
@@ -627,14 +802,18 @@
     </w:p>
     <w:p>
       <w:pPr>
-        <w:rPr>
-          <w:rFonts w:ascii="微软雅黑" w:eastAsia="微软雅黑" w:hAnsi="微软雅黑" w:hint="eastAsia"/>
-          <w:sz w:val="21"/>
-        </w:rPr>
-      </w:pPr>
-      <w:r>
-        <w:rPr>
-          <w:rFonts w:ascii="微软雅黑" w:eastAsia="微软雅黑" w:hAnsi="微软雅黑" w:hint="eastAsia"/>
+        <w:spacing w:after="80" w:line="300" w:lineRule="auto"/>
+        <w:ind w:left="283" w:hanging="130"/>
+        <w:rPr>
+          <w:rFonts w:ascii="微软雅黑" w:eastAsia="微软雅黑" w:hAnsi="微软雅黑" w:hint="eastAsia"/>
+          <w:color w:val="263445"/>
+          <w:sz w:val="21"/>
+        </w:rPr>
+      </w:pPr>
+      <w:r>
+        <w:rPr>
+          <w:rFonts w:ascii="微软雅黑" w:eastAsia="微软雅黑" w:hAnsi="微软雅黑" w:hint="eastAsia"/>
+          <w:color w:val="263445"/>
           <w:sz w:val="21"/>
         </w:rPr>
         <w:t>• src/constants.js 第 193 行：connect-src 中的 https://*.example.com 改成 https://*.yourdomain.com，否则前端请求可能被 CSP 拦截。</w:t>
@@ -642,14 +821,17 @@
     </w:p>
     <w:p>
       <w:pPr>
-        <w:rPr>
-          <w:rFonts w:ascii="微软雅黑" w:eastAsia="微软雅黑" w:hAnsi="微软雅黑" w:hint="eastAsia"/>
-          <w:sz w:val="21"/>
-        </w:rPr>
-      </w:pPr>
-      <w:r>
-        <w:rPr>
-          <w:rFonts w:ascii="微软雅黑" w:eastAsia="微软雅黑" w:hAnsi="微软雅黑" w:hint="eastAsia"/>
+        <w:spacing w:after="120" w:line="300" w:lineRule="auto"/>
+        <w:rPr>
+          <w:rFonts w:ascii="微软雅黑" w:eastAsia="微软雅黑" w:hAnsi="微软雅黑" w:hint="eastAsia"/>
+          <w:color w:val="263445"/>
+          <w:sz w:val="21"/>
+        </w:rPr>
+      </w:pPr>
+      <w:r>
+        <w:rPr>
+          <w:rFonts w:ascii="微软雅黑" w:eastAsia="微软雅黑" w:hAnsi="微软雅黑" w:hint="eastAsia"/>
+          <w:color w:val="263445"/>
           <w:sz w:val="21"/>
         </w:rPr>
         <w:t>这几行不仅影响展示，还会影响生成分享链接、附件公开访问 URL 和浏览器安全策略。只改 wrangler.toml 不够。</w:t>
@@ -657,14 +839,17 @@
     </w:p>
     <w:p>
       <w:pPr>
-        <w:rPr>
-          <w:rFonts w:ascii="微软雅黑" w:eastAsia="微软雅黑" w:hAnsi="微软雅黑" w:hint="eastAsia"/>
-          <w:sz w:val="21"/>
-        </w:rPr>
-      </w:pPr>
-      <w:r>
-        <w:rPr>
-          <w:rFonts w:ascii="微软雅黑" w:eastAsia="微软雅黑" w:hAnsi="微软雅黑" w:hint="eastAsia"/>
+        <w:spacing w:after="120" w:line="300" w:lineRule="auto"/>
+        <w:rPr>
+          <w:rFonts w:ascii="微软雅黑" w:eastAsia="微软雅黑" w:hAnsi="微软雅黑" w:hint="eastAsia"/>
+          <w:color w:val="263445"/>
+          <w:sz w:val="21"/>
+        </w:rPr>
+      </w:pPr>
+      <w:r>
+        <w:rPr>
+          <w:rFonts w:ascii="微软雅黑" w:eastAsia="微软雅黑" w:hAnsi="微软雅黑" w:hint="eastAsia"/>
+          <w:color w:val="263445"/>
           <w:sz w:val="21"/>
         </w:rPr>
         <w:t>3.3 修改前端固定文案</w:t>
@@ -672,14 +857,18 @@
     </w:p>
     <w:p>
       <w:pPr>
-        <w:rPr>
-          <w:rFonts w:ascii="微软雅黑" w:eastAsia="微软雅黑" w:hAnsi="微软雅黑" w:hint="eastAsia"/>
-          <w:sz w:val="21"/>
-        </w:rPr>
-      </w:pPr>
-      <w:r>
-        <w:rPr>
-          <w:rFonts w:ascii="微软雅黑" w:eastAsia="微软雅黑" w:hAnsi="微软雅黑" w:hint="eastAsia"/>
+        <w:spacing w:after="80" w:line="300" w:lineRule="auto"/>
+        <w:ind w:left="283" w:hanging="130"/>
+        <w:rPr>
+          <w:rFonts w:ascii="微软雅黑" w:eastAsia="微软雅黑" w:hAnsi="微软雅黑" w:hint="eastAsia"/>
+          <w:color w:val="263445"/>
+          <w:sz w:val="21"/>
+        </w:rPr>
+      </w:pPr>
+      <w:r>
+        <w:rPr>
+          <w:rFonts w:ascii="微软雅黑" w:eastAsia="微软雅黑" w:hAnsi="微软雅黑" w:hint="eastAsia"/>
+          <w:color w:val="263445"/>
           <w:sz w:val="21"/>
         </w:rPr>
         <w:t>• public/login.js 第 15-16 行：改成与 src/constants.js 第 27-28 行一致的根域名和默认子域名。</w:t>
@@ -687,14 +876,18 @@
     </w:p>
     <w:p>
       <w:pPr>
-        <w:rPr>
-          <w:rFonts w:ascii="微软雅黑" w:eastAsia="微软雅黑" w:hAnsi="微软雅黑" w:hint="eastAsia"/>
-          <w:sz w:val="21"/>
-        </w:rPr>
-      </w:pPr>
-      <w:r>
-        <w:rPr>
-          <w:rFonts w:ascii="微软雅黑" w:eastAsia="微软雅黑" w:hAnsi="微软雅黑" w:hint="eastAsia"/>
+        <w:spacing w:after="80" w:line="300" w:lineRule="auto"/>
+        <w:ind w:left="283" w:hanging="130"/>
+        <w:rPr>
+          <w:rFonts w:ascii="微软雅黑" w:eastAsia="微软雅黑" w:hAnsi="微软雅黑" w:hint="eastAsia"/>
+          <w:color w:val="263445"/>
+          <w:sz w:val="21"/>
+        </w:rPr>
+      </w:pPr>
+      <w:r>
+        <w:rPr>
+          <w:rFonts w:ascii="微软雅黑" w:eastAsia="微软雅黑" w:hAnsi="微软雅黑" w:hint="eastAsia"/>
+          <w:color w:val="263445"/>
           <w:sz w:val="21"/>
         </w:rPr>
         <w:t>• public/login.js 第 389 行：把 app.example.com/login 改成你的登录入口。</w:t>
@@ -702,14 +895,18 @@
     </w:p>
     <w:p>
       <w:pPr>
-        <w:rPr>
-          <w:rFonts w:ascii="微软雅黑" w:eastAsia="微软雅黑" w:hAnsi="微软雅黑" w:hint="eastAsia"/>
-          <w:sz w:val="21"/>
-        </w:rPr>
-      </w:pPr>
-      <w:r>
-        <w:rPr>
-          <w:rFonts w:ascii="微软雅黑" w:eastAsia="微软雅黑" w:hAnsi="微软雅黑" w:hint="eastAsia"/>
+        <w:spacing w:after="80" w:line="300" w:lineRule="auto"/>
+        <w:ind w:left="283" w:hanging="130"/>
+        <w:rPr>
+          <w:rFonts w:ascii="微软雅黑" w:eastAsia="微软雅黑" w:hAnsi="微软雅黑" w:hint="eastAsia"/>
+          <w:color w:val="263445"/>
+          <w:sz w:val="21"/>
+        </w:rPr>
+      </w:pPr>
+      <w:r>
+        <w:rPr>
+          <w:rFonts w:ascii="微软雅黑" w:eastAsia="微软雅黑" w:hAnsi="微软雅黑" w:hint="eastAsia"/>
+          <w:color w:val="263445"/>
           <w:sz w:val="21"/>
         </w:rPr>
         <w:t>• public/login.js 第 543 行：把 app.example.com/login 改成你的登录入口。</w:t>
@@ -717,14 +914,18 @@
     </w:p>
     <w:p>
       <w:pPr>
-        <w:rPr>
-          <w:rFonts w:ascii="微软雅黑" w:eastAsia="微软雅黑" w:hAnsi="微软雅黑" w:hint="eastAsia"/>
-          <w:sz w:val="21"/>
-        </w:rPr>
-      </w:pPr>
-      <w:r>
-        <w:rPr>
-          <w:rFonts w:ascii="微软雅黑" w:eastAsia="微软雅黑" w:hAnsi="微软雅黑" w:hint="eastAsia"/>
+        <w:spacing w:after="80" w:line="300" w:lineRule="auto"/>
+        <w:ind w:left="283" w:hanging="130"/>
+        <w:rPr>
+          <w:rFonts w:ascii="微软雅黑" w:eastAsia="微软雅黑" w:hAnsi="微软雅黑" w:hint="eastAsia"/>
+          <w:color w:val="263445"/>
+          <w:sz w:val="21"/>
+        </w:rPr>
+      </w:pPr>
+      <w:r>
+        <w:rPr>
+          <w:rFonts w:ascii="微软雅黑" w:eastAsia="微软雅黑" w:hAnsi="微软雅黑" w:hint="eastAsia"/>
+          <w:color w:val="263445"/>
           <w:sz w:val="21"/>
         </w:rPr>
         <w:t>• public/linkhistory.js 第 52 行：把 app.example.com/linkhistory 改成你的封存库入口。</w:t>
@@ -732,14 +933,18 @@
     </w:p>
     <w:p>
       <w:pPr>
-        <w:rPr>
-          <w:rFonts w:ascii="微软雅黑" w:eastAsia="微软雅黑" w:hAnsi="微软雅黑" w:hint="eastAsia"/>
-          <w:sz w:val="21"/>
-        </w:rPr>
-      </w:pPr>
-      <w:r>
-        <w:rPr>
-          <w:rFonts w:ascii="微软雅黑" w:eastAsia="微软雅黑" w:hAnsi="微软雅黑" w:hint="eastAsia"/>
+        <w:spacing w:after="80" w:line="300" w:lineRule="auto"/>
+        <w:ind w:left="283" w:hanging="130"/>
+        <w:rPr>
+          <w:rFonts w:ascii="微软雅黑" w:eastAsia="微软雅黑" w:hAnsi="微软雅黑" w:hint="eastAsia"/>
+          <w:color w:val="263445"/>
+          <w:sz w:val="21"/>
+        </w:rPr>
+      </w:pPr>
+      <w:r>
+        <w:rPr>
+          <w:rFonts w:ascii="微软雅黑" w:eastAsia="微软雅黑" w:hAnsi="微软雅黑" w:hint="eastAsia"/>
+          <w:color w:val="263445"/>
           <w:sz w:val="21"/>
         </w:rPr>
         <w:t>• public/linkhistory.js 第 89 行：把 app.example.com/linkhistory 改成你的封存库入口。</w:t>
@@ -747,14 +952,17 @@
     </w:p>
     <w:p>
       <w:pPr>
-        <w:rPr>
-          <w:rFonts w:ascii="微软雅黑" w:eastAsia="微软雅黑" w:hAnsi="微软雅黑" w:hint="eastAsia"/>
-          <w:sz w:val="21"/>
-        </w:rPr>
-      </w:pPr>
-      <w:r>
-        <w:rPr>
-          <w:rFonts w:ascii="微软雅黑" w:eastAsia="微软雅黑" w:hAnsi="微软雅黑" w:hint="eastAsia"/>
+        <w:spacing w:after="120" w:line="300" w:lineRule="auto"/>
+        <w:rPr>
+          <w:rFonts w:ascii="微软雅黑" w:eastAsia="微软雅黑" w:hAnsi="微软雅黑" w:hint="eastAsia"/>
+          <w:color w:val="263445"/>
+          <w:sz w:val="21"/>
+        </w:rPr>
+      </w:pPr>
+      <w:r>
+        <w:rPr>
+          <w:rFonts w:ascii="微软雅黑" w:eastAsia="微软雅黑" w:hAnsi="微软雅黑" w:hint="eastAsia"/>
+          <w:color w:val="263445"/>
           <w:sz w:val="21"/>
         </w:rPr>
         <w:t>3.4 修改默认模板数据</w:t>
@@ -762,14 +970,18 @@
     </w:p>
     <w:p>
       <w:pPr>
-        <w:rPr>
-          <w:rFonts w:ascii="微软雅黑" w:eastAsia="微软雅黑" w:hAnsi="微软雅黑" w:hint="eastAsia"/>
-          <w:sz w:val="21"/>
-        </w:rPr>
-      </w:pPr>
-      <w:r>
-        <w:rPr>
-          <w:rFonts w:ascii="微软雅黑" w:eastAsia="微软雅黑" w:hAnsi="微软雅黑" w:hint="eastAsia"/>
+        <w:spacing w:after="80" w:line="300" w:lineRule="auto"/>
+        <w:ind w:left="283" w:hanging="130"/>
+        <w:rPr>
+          <w:rFonts w:ascii="微软雅黑" w:eastAsia="微软雅黑" w:hAnsi="微软雅黑" w:hint="eastAsia"/>
+          <w:color w:val="263445"/>
+          <w:sz w:val="21"/>
+        </w:rPr>
+      </w:pPr>
+      <w:r>
+        <w:rPr>
+          <w:rFonts w:ascii="微软雅黑" w:eastAsia="微软雅黑" w:hAnsi="微软雅黑" w:hint="eastAsia"/>
+          <w:color w:val="263445"/>
           <w:sz w:val="21"/>
         </w:rPr>
         <w:t>• src/default-config.js 第 37-50 行：默认姓名、头像字、学号、学院、专业、班级、宿舍等个人信息。开源副本已是示例数据；实际部署可改成你希望管理员首次打开时看到的模板。</w:t>
@@ -777,14 +989,18 @@
     </w:p>
     <w:p>
       <w:pPr>
-        <w:rPr>
-          <w:rFonts w:ascii="微软雅黑" w:eastAsia="微软雅黑" w:hAnsi="微软雅黑" w:hint="eastAsia"/>
-          <w:sz w:val="21"/>
-        </w:rPr>
-      </w:pPr>
-      <w:r>
-        <w:rPr>
-          <w:rFonts w:ascii="微软雅黑" w:eastAsia="微软雅黑" w:hAnsi="微软雅黑" w:hint="eastAsia"/>
+        <w:spacing w:after="80" w:line="300" w:lineRule="auto"/>
+        <w:ind w:left="283" w:hanging="130"/>
+        <w:rPr>
+          <w:rFonts w:ascii="微软雅黑" w:eastAsia="微软雅黑" w:hAnsi="微软雅黑" w:hint="eastAsia"/>
+          <w:color w:val="263445"/>
+          <w:sz w:val="21"/>
+        </w:rPr>
+      </w:pPr>
+      <w:r>
+        <w:rPr>
+          <w:rFonts w:ascii="微软雅黑" w:eastAsia="微软雅黑" w:hAnsi="微软雅黑" w:hint="eastAsia"/>
+          <w:color w:val="263445"/>
           <w:sz w:val="21"/>
         </w:rPr>
         <w:t>• src/default-config.js 第 64-68 行：默认审批人、请假原因、定位文本和定位 URL。</w:t>
@@ -792,14 +1008,18 @@
     </w:p>
     <w:p>
       <w:pPr>
-        <w:rPr>
-          <w:rFonts w:ascii="微软雅黑" w:eastAsia="微软雅黑" w:hAnsi="微软雅黑" w:hint="eastAsia"/>
-          <w:sz w:val="21"/>
-        </w:rPr>
-      </w:pPr>
-      <w:r>
-        <w:rPr>
-          <w:rFonts w:ascii="微软雅黑" w:eastAsia="微软雅黑" w:hAnsi="微软雅黑" w:hint="eastAsia"/>
+        <w:spacing w:after="80" w:line="300" w:lineRule="auto"/>
+        <w:ind w:left="283" w:hanging="130"/>
+        <w:rPr>
+          <w:rFonts w:ascii="微软雅黑" w:eastAsia="微软雅黑" w:hAnsi="微软雅黑" w:hint="eastAsia"/>
+          <w:color w:val="263445"/>
+          <w:sz w:val="21"/>
+        </w:rPr>
+      </w:pPr>
+      <w:r>
+        <w:rPr>
+          <w:rFonts w:ascii="微软雅黑" w:eastAsia="微软雅黑" w:hAnsi="微软雅黑" w:hint="eastAsia"/>
+          <w:color w:val="263445"/>
           <w:sz w:val="21"/>
         </w:rPr>
         <w:t>• src/default-config.js 第 70-75 行：默认目的地省、市、区县、详细地址。</w:t>
@@ -807,14 +1027,18 @@
     </w:p>
     <w:p>
       <w:pPr>
-        <w:rPr>
-          <w:rFonts w:ascii="微软雅黑" w:eastAsia="微软雅黑" w:hAnsi="微软雅黑" w:hint="eastAsia"/>
-          <w:sz w:val="21"/>
-        </w:rPr>
-      </w:pPr>
-      <w:r>
-        <w:rPr>
-          <w:rFonts w:ascii="微软雅黑" w:eastAsia="微软雅黑" w:hAnsi="微软雅黑" w:hint="eastAsia"/>
+        <w:spacing w:after="80" w:line="300" w:lineRule="auto"/>
+        <w:ind w:left="283" w:hanging="130"/>
+        <w:rPr>
+          <w:rFonts w:ascii="微软雅黑" w:eastAsia="微软雅黑" w:hAnsi="微软雅黑" w:hint="eastAsia"/>
+          <w:color w:val="263445"/>
+          <w:sz w:val="21"/>
+        </w:rPr>
+      </w:pPr>
+      <w:r>
+        <w:rPr>
+          <w:rFonts w:ascii="微软雅黑" w:eastAsia="微软雅黑" w:hAnsi="微软雅黑" w:hint="eastAsia"/>
+          <w:color w:val="263445"/>
           <w:sz w:val="21"/>
         </w:rPr>
         <w:t>• src/default-config.js 第 115 行：默认客服链接。</w:t>
@@ -822,14 +1046,18 @@
     </w:p>
     <w:p>
       <w:pPr>
-        <w:rPr>
-          <w:rFonts w:ascii="微软雅黑" w:eastAsia="微软雅黑" w:hAnsi="微软雅黑" w:hint="eastAsia"/>
-          <w:sz w:val="21"/>
-        </w:rPr>
-      </w:pPr>
-      <w:r>
-        <w:rPr>
-          <w:rFonts w:ascii="微软雅黑" w:eastAsia="微软雅黑" w:hAnsi="微软雅黑" w:hint="eastAsia"/>
+        <w:spacing w:after="80" w:line="300" w:lineRule="auto"/>
+        <w:ind w:left="283" w:hanging="130"/>
+        <w:rPr>
+          <w:rFonts w:ascii="微软雅黑" w:eastAsia="微软雅黑" w:hAnsi="微软雅黑" w:hint="eastAsia"/>
+          <w:color w:val="263445"/>
+          <w:sz w:val="21"/>
+        </w:rPr>
+      </w:pPr>
+      <w:r>
+        <w:rPr>
+          <w:rFonts w:ascii="微软雅黑" w:eastAsia="微软雅黑" w:hAnsi="微软雅黑" w:hint="eastAsia"/>
+          <w:color w:val="263445"/>
           <w:sz w:val="21"/>
         </w:rPr>
         <w:t>• public/wec-counselor-leave-apps/leave/share/config.js 第 44-59、77-88、135 行：这是静态分享页 fallback 配置，应与 src/default-config.js 保持同级别脱敏或改成你的默认模板。</w:t>
@@ -837,14 +1065,18 @@
     </w:p>
     <w:p>
       <w:pPr>
-        <w:rPr>
-          <w:rFonts w:ascii="微软雅黑" w:eastAsia="微软雅黑" w:hAnsi="微软雅黑" w:hint="eastAsia"/>
-          <w:sz w:val="21"/>
-        </w:rPr>
-      </w:pPr>
-      <w:r>
-        <w:rPr>
-          <w:rFonts w:ascii="微软雅黑" w:eastAsia="微软雅黑" w:hAnsi="微软雅黑" w:hint="eastAsia"/>
+        <w:spacing w:after="80" w:line="300" w:lineRule="auto"/>
+        <w:ind w:left="283" w:hanging="130"/>
+        <w:rPr>
+          <w:rFonts w:ascii="微软雅黑" w:eastAsia="微软雅黑" w:hAnsi="微软雅黑" w:hint="eastAsia"/>
+          <w:color w:val="263445"/>
+          <w:sz w:val="21"/>
+        </w:rPr>
+      </w:pPr>
+      <w:r>
+        <w:rPr>
+          <w:rFonts w:ascii="微软雅黑" w:eastAsia="微软雅黑" w:hAnsi="微软雅黑" w:hint="eastAsia"/>
+          <w:color w:val="263445"/>
           <w:sz w:val="21"/>
         </w:rPr>
         <w:t>• src/admin.js 第 1885 行和第 2210 行：仅是超级管理员界面显示用的 R2 bucket/D1 database 名称；如果你改了资源名，建议同步修改这里。</w:t>
@@ -852,31 +1084,38 @@
     </w:p>
     <w:p>
       <w:pPr>
-        <w:rPr>
-          <w:rFonts w:ascii="微软雅黑" w:eastAsia="微软雅黑" w:hAnsi="微软雅黑" w:hint="eastAsia"/>
+        <w:shd w:val="clear" w:color="auto" w:fill="EAF2FB"/>
+        <w:spacing w:before="240" w:after="140" w:line="380" w:lineRule="auto"/>
+        <w:rPr>
+          <w:rFonts w:ascii="Microsoft YaHei UI" w:eastAsia="Microsoft YaHei UI" w:hAnsi="Microsoft YaHei UI" w:hint="eastAsia"/>
           <w:b/>
-          <w:sz w:val="26"/>
-        </w:rPr>
-      </w:pPr>
-      <w:r>
-        <w:rPr>
-          <w:rFonts w:ascii="微软雅黑" w:eastAsia="微软雅黑" w:hAnsi="微软雅黑" w:hint="eastAsia"/>
+          <w:color w:val="17365D"/>
+          <w:sz w:val="28"/>
+        </w:rPr>
+      </w:pPr>
+      <w:r>
+        <w:rPr>
+          <w:rFonts w:ascii="Microsoft YaHei UI" w:eastAsia="Microsoft YaHei UI" w:hAnsi="Microsoft YaHei UI" w:hint="eastAsia"/>
           <w:b/>
-          <w:sz w:val="26"/>
+          <w:color w:val="17365D"/>
+          <w:sz w:val="28"/>
         </w:rPr>
         <w:t>4. 创建 Cloudflare 资源</w:t>
       </w:r>
     </w:p>
     <w:p>
       <w:pPr>
-        <w:rPr>
-          <w:rFonts w:ascii="微软雅黑" w:eastAsia="微软雅黑" w:hAnsi="微软雅黑" w:hint="eastAsia"/>
-          <w:sz w:val="21"/>
-        </w:rPr>
-      </w:pPr>
-      <w:r>
-        <w:rPr>
-          <w:rFonts w:ascii="微软雅黑" w:eastAsia="微软雅黑" w:hAnsi="微软雅黑" w:hint="eastAsia"/>
+        <w:spacing w:after="120" w:line="300" w:lineRule="auto"/>
+        <w:rPr>
+          <w:rFonts w:ascii="微软雅黑" w:eastAsia="微软雅黑" w:hAnsi="微软雅黑" w:hint="eastAsia"/>
+          <w:color w:val="263445"/>
+          <w:sz w:val="21"/>
+        </w:rPr>
+      </w:pPr>
+      <w:r>
+        <w:rPr>
+          <w:rFonts w:ascii="微软雅黑" w:eastAsia="微软雅黑" w:hAnsi="微软雅黑" w:hint="eastAsia"/>
+          <w:color w:val="263445"/>
           <w:sz w:val="21"/>
         </w:rPr>
         <w:t>先进入你克隆或解压后的项目目录，再执行命令。下面路径只是 Windows 示例，请替换成你自己的实际目录；macOS/Linux 用户使用对应的 /path/to/leave-status-open-source。</w:t>
@@ -884,29 +1123,37 @@
     </w:p>
     <w:p>
       <w:pPr>
-        <w:rPr>
-          <w:rFonts w:ascii="微软雅黑" w:eastAsia="微软雅黑" w:hAnsi="微软雅黑" w:hint="eastAsia"/>
-          <w:sz w:val="21"/>
-        </w:rPr>
-      </w:pPr>
-      <w:r>
-        <w:rPr>
-          <w:rFonts w:ascii="微软雅黑" w:eastAsia="微软雅黑" w:hAnsi="微软雅黑" w:hint="eastAsia"/>
-          <w:sz w:val="21"/>
+        <w:shd w:val="clear" w:color="auto" w:fill="F4F7FA"/>
+        <w:spacing w:before="40" w:after="140" w:line="300" w:lineRule="auto"/>
+        <w:ind w:left="255" w:right="113"/>
+        <w:rPr>
+          <w:rFonts w:ascii="Consolas" w:eastAsia="微软雅黑" w:hAnsi="Consolas" w:hint="eastAsia"/>
+          <w:color w:val="111827"/>
+          <w:sz w:val="19"/>
+        </w:rPr>
+      </w:pPr>
+      <w:r>
+        <w:rPr>
+          <w:rFonts w:ascii="Consolas" w:eastAsia="微软雅黑" w:hAnsi="Consolas" w:hint="eastAsia"/>
+          <w:color w:val="111827"/>
+          <w:sz w:val="19"/>
         </w:rPr>
         <w:t>cd C:\path\to\leave-status-open-source</w:t>
       </w:r>
     </w:p>
     <w:p>
       <w:pPr>
-        <w:rPr>
-          <w:rFonts w:ascii="微软雅黑" w:eastAsia="微软雅黑" w:hAnsi="微软雅黑" w:hint="eastAsia"/>
-          <w:sz w:val="21"/>
-        </w:rPr>
-      </w:pPr>
-      <w:r>
-        <w:rPr>
-          <w:rFonts w:ascii="微软雅黑" w:eastAsia="微软雅黑" w:hAnsi="微软雅黑" w:hint="eastAsia"/>
+        <w:spacing w:after="120" w:line="300" w:lineRule="auto"/>
+        <w:rPr>
+          <w:rFonts w:ascii="微软雅黑" w:eastAsia="微软雅黑" w:hAnsi="微软雅黑" w:hint="eastAsia"/>
+          <w:color w:val="263445"/>
+          <w:sz w:val="21"/>
+        </w:rPr>
+      </w:pPr>
+      <w:r>
+        <w:rPr>
+          <w:rFonts w:ascii="微软雅黑" w:eastAsia="微软雅黑" w:hAnsi="微软雅黑" w:hint="eastAsia"/>
+          <w:color w:val="263445"/>
           <w:sz w:val="21"/>
         </w:rPr>
         <w:t>npm install</w:t>
@@ -914,29 +1161,37 @@
     </w:p>
     <w:p>
       <w:pPr>
-        <w:rPr>
-          <w:rFonts w:ascii="微软雅黑" w:eastAsia="微软雅黑" w:hAnsi="微软雅黑" w:hint="eastAsia"/>
-          <w:sz w:val="21"/>
-        </w:rPr>
-      </w:pPr>
-      <w:r>
-        <w:rPr>
-          <w:rFonts w:ascii="微软雅黑" w:eastAsia="微软雅黑" w:hAnsi="微软雅黑" w:hint="eastAsia"/>
-          <w:sz w:val="21"/>
+        <w:shd w:val="clear" w:color="auto" w:fill="F4F7FA"/>
+        <w:spacing w:before="40" w:after="140" w:line="300" w:lineRule="auto"/>
+        <w:ind w:left="255" w:right="113"/>
+        <w:rPr>
+          <w:rFonts w:ascii="Consolas" w:eastAsia="微软雅黑" w:hAnsi="Consolas" w:hint="eastAsia"/>
+          <w:color w:val="111827"/>
+          <w:sz w:val="19"/>
+        </w:rPr>
+      </w:pPr>
+      <w:r>
+        <w:rPr>
+          <w:rFonts w:ascii="Consolas" w:eastAsia="微软雅黑" w:hAnsi="Consolas" w:hint="eastAsia"/>
+          <w:color w:val="111827"/>
+          <w:sz w:val="19"/>
         </w:rPr>
         <w:t>npx wrangler login</w:t>
       </w:r>
     </w:p>
     <w:p>
       <w:pPr>
-        <w:rPr>
-          <w:rFonts w:ascii="微软雅黑" w:eastAsia="微软雅黑" w:hAnsi="微软雅黑" w:hint="eastAsia"/>
-          <w:sz w:val="21"/>
-        </w:rPr>
-      </w:pPr>
-      <w:r>
-        <w:rPr>
-          <w:rFonts w:ascii="微软雅黑" w:eastAsia="微软雅黑" w:hAnsi="微软雅黑" w:hint="eastAsia"/>
+        <w:spacing w:after="120" w:line="300" w:lineRule="auto"/>
+        <w:rPr>
+          <w:rFonts w:ascii="微软雅黑" w:eastAsia="微软雅黑" w:hAnsi="微软雅黑" w:hint="eastAsia"/>
+          <w:color w:val="263445"/>
+          <w:sz w:val="21"/>
+        </w:rPr>
+      </w:pPr>
+      <w:r>
+        <w:rPr>
+          <w:rFonts w:ascii="微软雅黑" w:eastAsia="微软雅黑" w:hAnsi="微软雅黑" w:hint="eastAsia"/>
+          <w:color w:val="263445"/>
           <w:sz w:val="21"/>
         </w:rPr>
         <w:t>4.1 创建 KV</w:t>
@@ -944,29 +1199,37 @@
     </w:p>
     <w:p>
       <w:pPr>
-        <w:rPr>
-          <w:rFonts w:ascii="微软雅黑" w:eastAsia="微软雅黑" w:hAnsi="微软雅黑" w:hint="eastAsia"/>
-          <w:sz w:val="21"/>
-        </w:rPr>
-      </w:pPr>
-      <w:r>
-        <w:rPr>
-          <w:rFonts w:ascii="微软雅黑" w:eastAsia="微软雅黑" w:hAnsi="微软雅黑" w:hint="eastAsia"/>
-          <w:sz w:val="21"/>
+        <w:shd w:val="clear" w:color="auto" w:fill="F4F7FA"/>
+        <w:spacing w:before="40" w:after="140" w:line="300" w:lineRule="auto"/>
+        <w:ind w:left="255" w:right="113"/>
+        <w:rPr>
+          <w:rFonts w:ascii="Consolas" w:eastAsia="微软雅黑" w:hAnsi="Consolas" w:hint="eastAsia"/>
+          <w:color w:val="111827"/>
+          <w:sz w:val="19"/>
+        </w:rPr>
+      </w:pPr>
+      <w:r>
+        <w:rPr>
+          <w:rFonts w:ascii="Consolas" w:eastAsia="微软雅黑" w:hAnsi="Consolas" w:hint="eastAsia"/>
+          <w:color w:val="111827"/>
+          <w:sz w:val="19"/>
         </w:rPr>
         <w:t>npx wrangler kv namespace create LEAVE_STATUS_DATA</w:t>
       </w:r>
     </w:p>
     <w:p>
       <w:pPr>
-        <w:rPr>
-          <w:rFonts w:ascii="微软雅黑" w:eastAsia="微软雅黑" w:hAnsi="微软雅黑" w:hint="eastAsia"/>
-          <w:sz w:val="21"/>
-        </w:rPr>
-      </w:pPr>
-      <w:r>
-        <w:rPr>
-          <w:rFonts w:ascii="微软雅黑" w:eastAsia="微软雅黑" w:hAnsi="微软雅黑" w:hint="eastAsia"/>
+        <w:spacing w:after="120" w:line="300" w:lineRule="auto"/>
+        <w:rPr>
+          <w:rFonts w:ascii="微软雅黑" w:eastAsia="微软雅黑" w:hAnsi="微软雅黑" w:hint="eastAsia"/>
+          <w:color w:val="263445"/>
+          <w:sz w:val="21"/>
+        </w:rPr>
+      </w:pPr>
+      <w:r>
+        <w:rPr>
+          <w:rFonts w:ascii="微软雅黑" w:eastAsia="微软雅黑" w:hAnsi="微软雅黑" w:hint="eastAsia"/>
+          <w:color w:val="263445"/>
           <w:sz w:val="21"/>
         </w:rPr>
         <w:t>命令输出会给出 id，把它填入 wrangler.toml 第 7 行的 id。若你需要远程预览环境，可再执行 npx wrangler kv namespace create LEAVE_STATUS_DATA --preview 创建预览 KV，并把输出 id 填到 preview_id；不需要时删除 preview_id 字段。</w:t>
@@ -974,14 +1237,17 @@
     </w:p>
     <w:p>
       <w:pPr>
-        <w:rPr>
-          <w:rFonts w:ascii="微软雅黑" w:eastAsia="微软雅黑" w:hAnsi="微软雅黑" w:hint="eastAsia"/>
-          <w:sz w:val="21"/>
-        </w:rPr>
-      </w:pPr>
-      <w:r>
-        <w:rPr>
-          <w:rFonts w:ascii="微软雅黑" w:eastAsia="微软雅黑" w:hAnsi="微软雅黑" w:hint="eastAsia"/>
+        <w:spacing w:after="120" w:line="300" w:lineRule="auto"/>
+        <w:rPr>
+          <w:rFonts w:ascii="微软雅黑" w:eastAsia="微软雅黑" w:hAnsi="微软雅黑" w:hint="eastAsia"/>
+          <w:color w:val="263445"/>
+          <w:sz w:val="21"/>
+        </w:rPr>
+      </w:pPr>
+      <w:r>
+        <w:rPr>
+          <w:rFonts w:ascii="微软雅黑" w:eastAsia="微软雅黑" w:hAnsi="微软雅黑" w:hint="eastAsia"/>
+          <w:color w:val="263445"/>
           <w:sz w:val="21"/>
         </w:rPr>
         <w:t>4.2 创建 R2 bucket</w:t>
@@ -989,44 +1255,57 @@
     </w:p>
     <w:p>
       <w:pPr>
-        <w:rPr>
-          <w:rFonts w:ascii="微软雅黑" w:eastAsia="微软雅黑" w:hAnsi="微软雅黑" w:hint="eastAsia"/>
-          <w:sz w:val="21"/>
-        </w:rPr>
-      </w:pPr>
-      <w:r>
-        <w:rPr>
-          <w:rFonts w:ascii="微软雅黑" w:eastAsia="微软雅黑" w:hAnsi="微软雅黑" w:hint="eastAsia"/>
-          <w:sz w:val="21"/>
+        <w:shd w:val="clear" w:color="auto" w:fill="F4F7FA"/>
+        <w:spacing w:before="40" w:after="140" w:line="300" w:lineRule="auto"/>
+        <w:ind w:left="255" w:right="113"/>
+        <w:rPr>
+          <w:rFonts w:ascii="Consolas" w:eastAsia="微软雅黑" w:hAnsi="Consolas" w:hint="eastAsia"/>
+          <w:color w:val="111827"/>
+          <w:sz w:val="19"/>
+        </w:rPr>
+      </w:pPr>
+      <w:r>
+        <w:rPr>
+          <w:rFonts w:ascii="Consolas" w:eastAsia="微软雅黑" w:hAnsi="Consolas" w:hint="eastAsia"/>
+          <w:color w:val="111827"/>
+          <w:sz w:val="19"/>
         </w:rPr>
         <w:t>npx wrangler r2 bucket create leave-status-attachments</w:t>
       </w:r>
     </w:p>
     <w:p>
       <w:pPr>
-        <w:rPr>
-          <w:rFonts w:ascii="微软雅黑" w:eastAsia="微软雅黑" w:hAnsi="微软雅黑" w:hint="eastAsia"/>
-          <w:sz w:val="21"/>
-        </w:rPr>
-      </w:pPr>
-      <w:r>
-        <w:rPr>
-          <w:rFonts w:ascii="微软雅黑" w:eastAsia="微软雅黑" w:hAnsi="微软雅黑" w:hint="eastAsia"/>
-          <w:sz w:val="21"/>
+        <w:shd w:val="clear" w:color="auto" w:fill="F4F7FA"/>
+        <w:spacing w:before="40" w:after="140" w:line="300" w:lineRule="auto"/>
+        <w:ind w:left="255" w:right="113"/>
+        <w:rPr>
+          <w:rFonts w:ascii="Consolas" w:eastAsia="微软雅黑" w:hAnsi="Consolas" w:hint="eastAsia"/>
+          <w:color w:val="111827"/>
+          <w:sz w:val="19"/>
+        </w:rPr>
+      </w:pPr>
+      <w:r>
+        <w:rPr>
+          <w:rFonts w:ascii="Consolas" w:eastAsia="微软雅黑" w:hAnsi="Consolas" w:hint="eastAsia"/>
+          <w:color w:val="111827"/>
+          <w:sz w:val="19"/>
         </w:rPr>
         <w:t>npx wrangler r2 bucket list</w:t>
       </w:r>
     </w:p>
     <w:p>
       <w:pPr>
-        <w:rPr>
-          <w:rFonts w:ascii="微软雅黑" w:eastAsia="微软雅黑" w:hAnsi="微软雅黑" w:hint="eastAsia"/>
-          <w:sz w:val="21"/>
-        </w:rPr>
-      </w:pPr>
-      <w:r>
-        <w:rPr>
-          <w:rFonts w:ascii="微软雅黑" w:eastAsia="微软雅黑" w:hAnsi="微软雅黑" w:hint="eastAsia"/>
+        <w:spacing w:after="120" w:line="300" w:lineRule="auto"/>
+        <w:rPr>
+          <w:rFonts w:ascii="微软雅黑" w:eastAsia="微软雅黑" w:hAnsi="微软雅黑" w:hint="eastAsia"/>
+          <w:color w:val="263445"/>
+          <w:sz w:val="21"/>
+        </w:rPr>
+      </w:pPr>
+      <w:r>
+        <w:rPr>
+          <w:rFonts w:ascii="微软雅黑" w:eastAsia="微软雅黑" w:hAnsi="微软雅黑" w:hint="eastAsia"/>
+          <w:color w:val="263445"/>
           <w:sz w:val="21"/>
         </w:rPr>
         <w:t>bucket 名称只能包含小写字母、数字和短横线，长度 3-63 位，且不能以短横线开头或结尾。创建后把名称写入 wrangler.toml 第 34 行。R2 bucket 默认不是公开 bucket，本项目通过 Worker 的 /uploads 和 /completion-uploads 路由读取对象，不需要打开 R2 公共访问。</w:t>
@@ -1034,14 +1313,17 @@
     </w:p>
     <w:p>
       <w:pPr>
-        <w:rPr>
-          <w:rFonts w:ascii="微软雅黑" w:eastAsia="微软雅黑" w:hAnsi="微软雅黑" w:hint="eastAsia"/>
-          <w:sz w:val="21"/>
-        </w:rPr>
-      </w:pPr>
-      <w:r>
-        <w:rPr>
-          <w:rFonts w:ascii="微软雅黑" w:eastAsia="微软雅黑" w:hAnsi="微软雅黑" w:hint="eastAsia"/>
+        <w:spacing w:after="120" w:line="300" w:lineRule="auto"/>
+        <w:rPr>
+          <w:rFonts w:ascii="微软雅黑" w:eastAsia="微软雅黑" w:hAnsi="微软雅黑" w:hint="eastAsia"/>
+          <w:color w:val="263445"/>
+          <w:sz w:val="21"/>
+        </w:rPr>
+      </w:pPr>
+      <w:r>
+        <w:rPr>
+          <w:rFonts w:ascii="微软雅黑" w:eastAsia="微软雅黑" w:hAnsi="微软雅黑" w:hint="eastAsia"/>
+          <w:color w:val="263445"/>
           <w:sz w:val="21"/>
         </w:rPr>
         <w:t>4.3 创建 D1 数据库并迁移</w:t>
@@ -1049,29 +1331,37 @@
     </w:p>
     <w:p>
       <w:pPr>
-        <w:rPr>
-          <w:rFonts w:ascii="微软雅黑" w:eastAsia="微软雅黑" w:hAnsi="微软雅黑" w:hint="eastAsia"/>
-          <w:sz w:val="21"/>
-        </w:rPr>
-      </w:pPr>
-      <w:r>
-        <w:rPr>
-          <w:rFonts w:ascii="微软雅黑" w:eastAsia="微软雅黑" w:hAnsi="微软雅黑" w:hint="eastAsia"/>
-          <w:sz w:val="21"/>
+        <w:shd w:val="clear" w:color="auto" w:fill="F4F7FA"/>
+        <w:spacing w:before="40" w:after="140" w:line="300" w:lineRule="auto"/>
+        <w:ind w:left="255" w:right="113"/>
+        <w:rPr>
+          <w:rFonts w:ascii="Consolas" w:eastAsia="微软雅黑" w:hAnsi="Consolas" w:hint="eastAsia"/>
+          <w:color w:val="111827"/>
+          <w:sz w:val="19"/>
+        </w:rPr>
+      </w:pPr>
+      <w:r>
+        <w:rPr>
+          <w:rFonts w:ascii="Consolas" w:eastAsia="微软雅黑" w:hAnsi="Consolas" w:hint="eastAsia"/>
+          <w:color w:val="111827"/>
+          <w:sz w:val="19"/>
         </w:rPr>
         <w:t>npx wrangler d1 create leave-status-db</w:t>
       </w:r>
     </w:p>
     <w:p>
       <w:pPr>
-        <w:rPr>
-          <w:rFonts w:ascii="微软雅黑" w:eastAsia="微软雅黑" w:hAnsi="微软雅黑" w:hint="eastAsia"/>
-          <w:sz w:val="21"/>
-        </w:rPr>
-      </w:pPr>
-      <w:r>
-        <w:rPr>
-          <w:rFonts w:ascii="微软雅黑" w:eastAsia="微软雅黑" w:hAnsi="微软雅黑" w:hint="eastAsia"/>
+        <w:spacing w:after="120" w:line="300" w:lineRule="auto"/>
+        <w:rPr>
+          <w:rFonts w:ascii="微软雅黑" w:eastAsia="微软雅黑" w:hAnsi="微软雅黑" w:hint="eastAsia"/>
+          <w:color w:val="263445"/>
+          <w:sz w:val="21"/>
+        </w:rPr>
+      </w:pPr>
+      <w:r>
+        <w:rPr>
+          <w:rFonts w:ascii="微软雅黑" w:eastAsia="微软雅黑" w:hAnsi="微软雅黑" w:hint="eastAsia"/>
+          <w:color w:val="263445"/>
           <w:sz w:val="21"/>
         </w:rPr>
         <w:t>命令输出会给出 database_id，把 database_name 和 database_id 分别填入 wrangler.toml 第 38-39 行，并确认 binding 仍为 LEAVE_STATUS_D1、migrations_dir 仍为 migrations。然后执行迁移：</w:t>
@@ -1079,44 +1369,57 @@
     </w:p>
     <w:p>
       <w:pPr>
-        <w:rPr>
-          <w:rFonts w:ascii="微软雅黑" w:eastAsia="微软雅黑" w:hAnsi="微软雅黑" w:hint="eastAsia"/>
-          <w:sz w:val="21"/>
-        </w:rPr>
-      </w:pPr>
-      <w:r>
-        <w:rPr>
-          <w:rFonts w:ascii="微软雅黑" w:eastAsia="微软雅黑" w:hAnsi="微软雅黑" w:hint="eastAsia"/>
-          <w:sz w:val="21"/>
+        <w:shd w:val="clear" w:color="auto" w:fill="F4F7FA"/>
+        <w:spacing w:before="40" w:after="140" w:line="300" w:lineRule="auto"/>
+        <w:ind w:left="255" w:right="113"/>
+        <w:rPr>
+          <w:rFonts w:ascii="Consolas" w:eastAsia="微软雅黑" w:hAnsi="Consolas" w:hint="eastAsia"/>
+          <w:color w:val="111827"/>
+          <w:sz w:val="19"/>
+        </w:rPr>
+      </w:pPr>
+      <w:r>
+        <w:rPr>
+          <w:rFonts w:ascii="Consolas" w:eastAsia="微软雅黑" w:hAnsi="Consolas" w:hint="eastAsia"/>
+          <w:color w:val="111827"/>
+          <w:sz w:val="19"/>
         </w:rPr>
         <w:t>npx wrangler d1 migrations list LEAVE_STATUS_D1 --remote</w:t>
       </w:r>
     </w:p>
     <w:p>
       <w:pPr>
-        <w:rPr>
-          <w:rFonts w:ascii="微软雅黑" w:eastAsia="微软雅黑" w:hAnsi="微软雅黑" w:hint="eastAsia"/>
-          <w:sz w:val="21"/>
-        </w:rPr>
-      </w:pPr>
-      <w:r>
-        <w:rPr>
-          <w:rFonts w:ascii="微软雅黑" w:eastAsia="微软雅黑" w:hAnsi="微软雅黑" w:hint="eastAsia"/>
-          <w:sz w:val="21"/>
+        <w:shd w:val="clear" w:color="auto" w:fill="F4F7FA"/>
+        <w:spacing w:before="40" w:after="140" w:line="300" w:lineRule="auto"/>
+        <w:ind w:left="255" w:right="113"/>
+        <w:rPr>
+          <w:rFonts w:ascii="Consolas" w:eastAsia="微软雅黑" w:hAnsi="Consolas" w:hint="eastAsia"/>
+          <w:color w:val="111827"/>
+          <w:sz w:val="19"/>
+        </w:rPr>
+      </w:pPr>
+      <w:r>
+        <w:rPr>
+          <w:rFonts w:ascii="Consolas" w:eastAsia="微软雅黑" w:hAnsi="Consolas" w:hint="eastAsia"/>
+          <w:color w:val="111827"/>
+          <w:sz w:val="19"/>
         </w:rPr>
         <w:t>npx wrangler d1 migrations apply LEAVE_STATUS_D1 --remote</w:t>
       </w:r>
     </w:p>
     <w:p>
       <w:pPr>
-        <w:rPr>
-          <w:rFonts w:ascii="微软雅黑" w:eastAsia="微软雅黑" w:hAnsi="微软雅黑" w:hint="eastAsia"/>
-          <w:sz w:val="21"/>
-        </w:rPr>
-      </w:pPr>
-      <w:r>
-        <w:rPr>
-          <w:rFonts w:ascii="微软雅黑" w:eastAsia="微软雅黑" w:hAnsi="微软雅黑" w:hint="eastAsia"/>
+        <w:spacing w:after="120" w:line="300" w:lineRule="auto"/>
+        <w:rPr>
+          <w:rFonts w:ascii="微软雅黑" w:eastAsia="微软雅黑" w:hAnsi="微软雅黑" w:hint="eastAsia"/>
+          <w:color w:val="263445"/>
+          <w:sz w:val="21"/>
+        </w:rPr>
+      </w:pPr>
+      <w:r>
+        <w:rPr>
+          <w:rFonts w:ascii="微软雅黑" w:eastAsia="微软雅黑" w:hAnsi="微软雅黑" w:hint="eastAsia"/>
+          <w:color w:val="263445"/>
           <w:sz w:val="21"/>
         </w:rPr>
         <w:t>迁移文件是 migrations/0001_leave_status_d1.sql。Worker 运行时也会调用src/admin.js 第 2255 行附近的 ensureD1Schema 做兜底建表，但正式部署仍建议先跑迁移，避免首个请求承担初始化。</w:t>
@@ -1124,31 +1427,38 @@
     </w:p>
     <w:p>
       <w:pPr>
-        <w:rPr>
-          <w:rFonts w:ascii="微软雅黑" w:eastAsia="微软雅黑" w:hAnsi="微软雅黑" w:hint="eastAsia"/>
+        <w:shd w:val="clear" w:color="auto" w:fill="EAF2FB"/>
+        <w:spacing w:before="240" w:after="140" w:line="380" w:lineRule="auto"/>
+        <w:rPr>
+          <w:rFonts w:ascii="Microsoft YaHei UI" w:eastAsia="Microsoft YaHei UI" w:hAnsi="Microsoft YaHei UI" w:hint="eastAsia"/>
           <w:b/>
-          <w:sz w:val="26"/>
-        </w:rPr>
-      </w:pPr>
-      <w:r>
-        <w:rPr>
-          <w:rFonts w:ascii="微软雅黑" w:eastAsia="微软雅黑" w:hAnsi="微软雅黑" w:hint="eastAsia"/>
+          <w:color w:val="17365D"/>
+          <w:sz w:val="28"/>
+        </w:rPr>
+      </w:pPr>
+      <w:r>
+        <w:rPr>
+          <w:rFonts w:ascii="Microsoft YaHei UI" w:eastAsia="Microsoft YaHei UI" w:hAnsi="Microsoft YaHei UI" w:hint="eastAsia"/>
           <w:b/>
-          <w:sz w:val="26"/>
+          <w:color w:val="17365D"/>
+          <w:sz w:val="28"/>
         </w:rPr>
         <w:t>5. 配置 Cloudflare Access</w:t>
       </w:r>
     </w:p>
     <w:p>
       <w:pPr>
-        <w:rPr>
-          <w:rFonts w:ascii="微软雅黑" w:eastAsia="微软雅黑" w:hAnsi="微软雅黑" w:hint="eastAsia"/>
-          <w:sz w:val="21"/>
-        </w:rPr>
-      </w:pPr>
-      <w:r>
-        <w:rPr>
-          <w:rFonts w:ascii="微软雅黑" w:eastAsia="微软雅黑" w:hAnsi="微软雅黑" w:hint="eastAsia"/>
+        <w:spacing w:after="120" w:line="300" w:lineRule="auto"/>
+        <w:rPr>
+          <w:rFonts w:ascii="微软雅黑" w:eastAsia="微软雅黑" w:hAnsi="微软雅黑" w:hint="eastAsia"/>
+          <w:color w:val="263445"/>
+          <w:sz w:val="21"/>
+        </w:rPr>
+      </w:pPr>
+      <w:r>
+        <w:rPr>
+          <w:rFonts w:ascii="微软雅黑" w:eastAsia="微软雅黑" w:hAnsi="微软雅黑" w:hint="eastAsia"/>
+          <w:color w:val="263445"/>
           <w:sz w:val="21"/>
         </w:rPr>
         <w:t>建议创建两个 Access self-hosted application：一个只给超级管理员使用，一个给普通管理员后台使用。这样普通管理员 allow policy 可以被系统自动同步，而不会覆盖超级管理员入口。</w:t>
@@ -1156,14 +1466,17 @@
     </w:p>
     <w:p>
       <w:pPr>
-        <w:rPr>
-          <w:rFonts w:ascii="微软雅黑" w:eastAsia="微软雅黑" w:hAnsi="微软雅黑" w:hint="eastAsia"/>
-          <w:sz w:val="21"/>
-        </w:rPr>
-      </w:pPr>
-      <w:r>
-        <w:rPr>
-          <w:rFonts w:ascii="微软雅黑" w:eastAsia="微软雅黑" w:hAnsi="微软雅黑" w:hint="eastAsia"/>
+        <w:spacing w:after="120" w:line="300" w:lineRule="auto"/>
+        <w:rPr>
+          <w:rFonts w:ascii="微软雅黑" w:eastAsia="微软雅黑" w:hAnsi="微软雅黑" w:hint="eastAsia"/>
+          <w:color w:val="263445"/>
+          <w:sz w:val="21"/>
+        </w:rPr>
+      </w:pPr>
+      <w:r>
+        <w:rPr>
+          <w:rFonts w:ascii="微软雅黑" w:eastAsia="微软雅黑" w:hAnsi="微软雅黑" w:hint="eastAsia"/>
+          <w:color w:val="263445"/>
           <w:sz w:val="21"/>
         </w:rPr>
         <w:t>5.1 超级管理员 Access 应用</w:t>
@@ -1171,14 +1484,18 @@
     </w:p>
     <w:p>
       <w:pPr>
-        <w:rPr>
-          <w:rFonts w:ascii="微软雅黑" w:eastAsia="微软雅黑" w:hAnsi="微软雅黑" w:hint="eastAsia"/>
-          <w:sz w:val="21"/>
-        </w:rPr>
-      </w:pPr>
-      <w:r>
-        <w:rPr>
-          <w:rFonts w:ascii="微软雅黑" w:eastAsia="微软雅黑" w:hAnsi="微软雅黑" w:hint="eastAsia"/>
+        <w:spacing w:after="80" w:line="300" w:lineRule="auto"/>
+        <w:ind w:left="283" w:hanging="130"/>
+        <w:rPr>
+          <w:rFonts w:ascii="微软雅黑" w:eastAsia="微软雅黑" w:hAnsi="微软雅黑" w:hint="eastAsia"/>
+          <w:color w:val="263445"/>
+          <w:sz w:val="21"/>
+        </w:rPr>
+      </w:pPr>
+      <w:r>
+        <w:rPr>
+          <w:rFonts w:ascii="微软雅黑" w:eastAsia="微软雅黑" w:hAnsi="微软雅黑" w:hint="eastAsia"/>
+          <w:color w:val="263445"/>
           <w:sz w:val="21"/>
         </w:rPr>
         <w:t>• 在 Zero Trust &gt; Access controls &gt; Applications 创建 Self-hosted public hostname。</w:t>
@@ -1186,14 +1503,18 @@
     </w:p>
     <w:p>
       <w:pPr>
-        <w:rPr>
-          <w:rFonts w:ascii="微软雅黑" w:eastAsia="微软雅黑" w:hAnsi="微软雅黑" w:hint="eastAsia"/>
-          <w:sz w:val="21"/>
-        </w:rPr>
-      </w:pPr>
-      <w:r>
-        <w:rPr>
-          <w:rFonts w:ascii="微软雅黑" w:eastAsia="微软雅黑" w:hAnsi="微软雅黑" w:hint="eastAsia"/>
+        <w:spacing w:after="80" w:line="300" w:lineRule="auto"/>
+        <w:ind w:left="283" w:hanging="130"/>
+        <w:rPr>
+          <w:rFonts w:ascii="微软雅黑" w:eastAsia="微软雅黑" w:hAnsi="微软雅黑" w:hint="eastAsia"/>
+          <w:color w:val="263445"/>
+          <w:sz w:val="21"/>
+        </w:rPr>
+      </w:pPr>
+      <w:r>
+        <w:rPr>
+          <w:rFonts w:ascii="微软雅黑" w:eastAsia="微软雅黑" w:hAnsi="微软雅黑" w:hint="eastAsia"/>
+          <w:color w:val="263445"/>
           <w:sz w:val="21"/>
         </w:rPr>
         <w:t>• Hostname/path 填 app.yourdomain.com/superloginv*。如 UI 分开填写 Domain 和 Path，则 Domain 填 app.yourdomain.com，Path 填 /superloginv*。</w:t>
@@ -1201,14 +1522,19 @@
     </w:p>
     <w:p>
       <w:pPr>
-        <w:rPr>
-          <w:rFonts w:ascii="微软雅黑" w:eastAsia="微软雅黑" w:hAnsi="微软雅黑" w:hint="eastAsia"/>
-          <w:sz w:val="21"/>
-        </w:rPr>
-      </w:pPr>
-      <w:r>
-        <w:rPr>
-          <w:rFonts w:ascii="微软雅黑" w:eastAsia="微软雅黑" w:hAnsi="微软雅黑" w:hint="eastAsia"/>
+        <w:shd w:val="clear" w:color="auto" w:fill="FFF7E6"/>
+        <w:spacing w:after="80" w:line="300" w:lineRule="auto"/>
+        <w:ind w:left="283" w:hanging="130"/>
+        <w:rPr>
+          <w:rFonts w:ascii="微软雅黑" w:eastAsia="微软雅黑" w:hAnsi="微软雅黑" w:hint="eastAsia"/>
+          <w:color w:val="263445"/>
+          <w:sz w:val="21"/>
+        </w:rPr>
+      </w:pPr>
+      <w:r>
+        <w:rPr>
+          <w:rFonts w:ascii="微软雅黑" w:eastAsia="微软雅黑" w:hAnsi="微软雅黑" w:hint="eastAsia"/>
+          <w:color w:val="263445"/>
           <w:sz w:val="21"/>
         </w:rPr>
         <w:t>• Access policy 只允许你的超级管理员邮箱。该邮箱同时写入 wrangler.toml 第 17 行。</w:t>
@@ -1216,14 +1542,18 @@
     </w:p>
     <w:p>
       <w:pPr>
-        <w:rPr>
-          <w:rFonts w:ascii="微软雅黑" w:eastAsia="微软雅黑" w:hAnsi="微软雅黑" w:hint="eastAsia"/>
-          <w:sz w:val="21"/>
-        </w:rPr>
-      </w:pPr>
-      <w:r>
-        <w:rPr>
-          <w:rFonts w:ascii="微软雅黑" w:eastAsia="微软雅黑" w:hAnsi="微软雅黑" w:hint="eastAsia"/>
+        <w:spacing w:after="80" w:line="300" w:lineRule="auto"/>
+        <w:ind w:left="283" w:hanging="130"/>
+        <w:rPr>
+          <w:rFonts w:ascii="微软雅黑" w:eastAsia="微软雅黑" w:hAnsi="微软雅黑" w:hint="eastAsia"/>
+          <w:color w:val="263445"/>
+          <w:sz w:val="21"/>
+        </w:rPr>
+      </w:pPr>
+      <w:r>
+        <w:rPr>
+          <w:rFonts w:ascii="微软雅黑" w:eastAsia="微软雅黑" w:hAnsi="微软雅黑" w:hint="eastAsia"/>
+          <w:color w:val="263445"/>
           <w:sz w:val="21"/>
         </w:rPr>
         <w:t>• 复制该应用的 AUD，写入 wrangler.toml 第 20 行 CF_ACCESS_AUD。</w:t>
@@ -1231,14 +1561,17 @@
     </w:p>
     <w:p>
       <w:pPr>
-        <w:rPr>
-          <w:rFonts w:ascii="微软雅黑" w:eastAsia="微软雅黑" w:hAnsi="微软雅黑" w:hint="eastAsia"/>
-          <w:sz w:val="21"/>
-        </w:rPr>
-      </w:pPr>
-      <w:r>
-        <w:rPr>
-          <w:rFonts w:ascii="微软雅黑" w:eastAsia="微软雅黑" w:hAnsi="微软雅黑" w:hint="eastAsia"/>
+        <w:spacing w:after="120" w:line="300" w:lineRule="auto"/>
+        <w:rPr>
+          <w:rFonts w:ascii="微软雅黑" w:eastAsia="微软雅黑" w:hAnsi="微软雅黑" w:hint="eastAsia"/>
+          <w:color w:val="263445"/>
+          <w:sz w:val="21"/>
+        </w:rPr>
+      </w:pPr>
+      <w:r>
+        <w:rPr>
+          <w:rFonts w:ascii="微软雅黑" w:eastAsia="微软雅黑" w:hAnsi="微软雅黑" w:hint="eastAsia"/>
+          <w:color w:val="263445"/>
           <w:sz w:val="21"/>
         </w:rPr>
         <w:t>5.2 普通管理员 Access 应用</w:t>
@@ -1246,14 +1579,19 @@
     </w:p>
     <w:p>
       <w:pPr>
-        <w:rPr>
-          <w:rFonts w:ascii="微软雅黑" w:eastAsia="微软雅黑" w:hAnsi="微软雅黑" w:hint="eastAsia"/>
-          <w:sz w:val="21"/>
-        </w:rPr>
-      </w:pPr>
-      <w:r>
-        <w:rPr>
-          <w:rFonts w:ascii="微软雅黑" w:eastAsia="微软雅黑" w:hAnsi="微软雅黑" w:hint="eastAsia"/>
+        <w:shd w:val="clear" w:color="auto" w:fill="FFF7E6"/>
+        <w:spacing w:after="80" w:line="300" w:lineRule="auto"/>
+        <w:ind w:left="283" w:hanging="130"/>
+        <w:rPr>
+          <w:rFonts w:ascii="微软雅黑" w:eastAsia="微软雅黑" w:hAnsi="微软雅黑" w:hint="eastAsia"/>
+          <w:color w:val="263445"/>
+          <w:sz w:val="21"/>
+        </w:rPr>
+      </w:pPr>
+      <w:r>
+        <w:rPr>
+          <w:rFonts w:ascii="微软雅黑" w:eastAsia="微软雅黑" w:hAnsi="微软雅黑" w:hint="eastAsia"/>
+          <w:color w:val="263445"/>
           <w:sz w:val="21"/>
         </w:rPr>
         <w:t>• 创建第二个 Self-hosted Access application 作为普通管理员应用，并在同一个 application 中保护 app.yourdomain.com/login* 和 app.yourdomain.com/linkhistory*（如果 UI 以 public hostname 条目管理，两个条目必须属于同一个 application）。这两个后台入口必须共用同一个 AUD；不要拆成两个不同 Access application，除非同步改代码支持多个 AUD。</w:t>
@@ -1261,14 +1599,18 @@
     </w:p>
     <w:p>
       <w:pPr>
-        <w:rPr>
-          <w:rFonts w:ascii="微软雅黑" w:eastAsia="微软雅黑" w:hAnsi="微软雅黑" w:hint="eastAsia"/>
-          <w:sz w:val="21"/>
-        </w:rPr>
-      </w:pPr>
-      <w:r>
-        <w:rPr>
-          <w:rFonts w:ascii="微软雅黑" w:eastAsia="微软雅黑" w:hAnsi="微软雅黑" w:hint="eastAsia"/>
+        <w:spacing w:after="80" w:line="300" w:lineRule="auto"/>
+        <w:ind w:left="283" w:hanging="130"/>
+        <w:rPr>
+          <w:rFonts w:ascii="微软雅黑" w:eastAsia="微软雅黑" w:hAnsi="微软雅黑" w:hint="eastAsia"/>
+          <w:color w:val="263445"/>
+          <w:sz w:val="21"/>
+        </w:rPr>
+      </w:pPr>
+      <w:r>
+        <w:rPr>
+          <w:rFonts w:ascii="微软雅黑" w:eastAsia="微软雅黑" w:hAnsi="微软雅黑" w:hint="eastAsia"/>
+          <w:color w:val="263445"/>
           <w:sz w:val="21"/>
         </w:rPr>
         <w:t>• 创建一个 Allow policy，后续由超级管理员界面自动更新 allowed email 列表。复制该应用的 Application ID 到 wrangler.toml 第 21 行。</w:t>
@@ -1276,14 +1618,18 @@
     </w:p>
     <w:p>
       <w:pPr>
-        <w:rPr>
-          <w:rFonts w:ascii="微软雅黑" w:eastAsia="微软雅黑" w:hAnsi="微软雅黑" w:hint="eastAsia"/>
-          <w:sz w:val="21"/>
-        </w:rPr>
-      </w:pPr>
-      <w:r>
-        <w:rPr>
-          <w:rFonts w:ascii="微软雅黑" w:eastAsia="微软雅黑" w:hAnsi="微软雅黑" w:hint="eastAsia"/>
+        <w:spacing w:after="80" w:line="300" w:lineRule="auto"/>
+        <w:ind w:left="283" w:hanging="130"/>
+        <w:rPr>
+          <w:rFonts w:ascii="微软雅黑" w:eastAsia="微软雅黑" w:hAnsi="微软雅黑" w:hint="eastAsia"/>
+          <w:color w:val="263445"/>
+          <w:sz w:val="21"/>
+        </w:rPr>
+      </w:pPr>
+      <w:r>
+        <w:rPr>
+          <w:rFonts w:ascii="微软雅黑" w:eastAsia="微软雅黑" w:hAnsi="微软雅黑" w:hint="eastAsia"/>
+          <w:color w:val="263445"/>
           <w:sz w:val="21"/>
         </w:rPr>
         <w:t>• 复制这个 Allow policy 的 Policy ID 到 wrangler.toml 第 22 行。</w:t>
@@ -1291,14 +1637,18 @@
     </w:p>
     <w:p>
       <w:pPr>
-        <w:rPr>
-          <w:rFonts w:ascii="微软雅黑" w:eastAsia="微软雅黑" w:hAnsi="微软雅黑" w:hint="eastAsia"/>
-          <w:sz w:val="21"/>
-        </w:rPr>
-      </w:pPr>
-      <w:r>
-        <w:rPr>
-          <w:rFonts w:ascii="微软雅黑" w:eastAsia="微软雅黑" w:hAnsi="微软雅黑" w:hint="eastAsia"/>
+        <w:spacing w:after="80" w:line="300" w:lineRule="auto"/>
+        <w:ind w:left="283" w:hanging="130"/>
+        <w:rPr>
+          <w:rFonts w:ascii="微软雅黑" w:eastAsia="微软雅黑" w:hAnsi="微软雅黑" w:hint="eastAsia"/>
+          <w:color w:val="263445"/>
+          <w:sz w:val="21"/>
+        </w:rPr>
+      </w:pPr>
+      <w:r>
+        <w:rPr>
+          <w:rFonts w:ascii="微软雅黑" w:eastAsia="微软雅黑" w:hAnsi="微软雅黑" w:hint="eastAsia"/>
+          <w:color w:val="263445"/>
           <w:sz w:val="21"/>
         </w:rPr>
         <w:t>• 复制该普通管理员应用的 AUD 到 wrangler.toml 第 23 行 CF_ACCESS_ADMIN_AUD；/login 和 /linkhistory 都要使用这个同一个 AUD。</w:t>
@@ -1306,14 +1656,19 @@
     </w:p>
     <w:p>
       <w:pPr>
-        <w:rPr>
-          <w:rFonts w:ascii="微软雅黑" w:eastAsia="微软雅黑" w:hAnsi="微软雅黑" w:hint="eastAsia"/>
-          <w:sz w:val="21"/>
-        </w:rPr>
-      </w:pPr>
-      <w:r>
-        <w:rPr>
-          <w:rFonts w:ascii="微软雅黑" w:eastAsia="微软雅黑" w:hAnsi="微软雅黑" w:hint="eastAsia"/>
+        <w:shd w:val="clear" w:color="auto" w:fill="FFF7E6"/>
+        <w:spacing w:after="80" w:line="300" w:lineRule="auto"/>
+        <w:ind w:left="283" w:hanging="130"/>
+        <w:rPr>
+          <w:rFonts w:ascii="微软雅黑" w:eastAsia="微软雅黑" w:hAnsi="微软雅黑" w:hint="eastAsia"/>
+          <w:color w:val="263445"/>
+          <w:sz w:val="21"/>
+        </w:rPr>
+      </w:pPr>
+      <w:r>
+        <w:rPr>
+          <w:rFonts w:ascii="微软雅黑" w:eastAsia="微软雅黑" w:hAnsi="微软雅黑" w:hint="eastAsia"/>
+          <w:color w:val="263445"/>
           <w:sz w:val="21"/>
         </w:rPr>
         <w:t>• 不要把 app.yourdomain.com/* 整体放进普通管理员 Access 应用，否则公开分享页也会要求登录。</w:t>
@@ -1321,14 +1676,17 @@
     </w:p>
     <w:p>
       <w:pPr>
-        <w:rPr>
-          <w:rFonts w:ascii="微软雅黑" w:eastAsia="微软雅黑" w:hAnsi="微软雅黑" w:hint="eastAsia"/>
-          <w:sz w:val="21"/>
-        </w:rPr>
-      </w:pPr>
-      <w:r>
-        <w:rPr>
-          <w:rFonts w:ascii="微软雅黑" w:eastAsia="微软雅黑" w:hAnsi="微软雅黑" w:hint="eastAsia"/>
+        <w:spacing w:after="120" w:line="300" w:lineRule="auto"/>
+        <w:rPr>
+          <w:rFonts w:ascii="微软雅黑" w:eastAsia="微软雅黑" w:hAnsi="微软雅黑" w:hint="eastAsia"/>
+          <w:color w:val="263445"/>
+          <w:sz w:val="21"/>
+        </w:rPr>
+      </w:pPr>
+      <w:r>
+        <w:rPr>
+          <w:rFonts w:ascii="微软雅黑" w:eastAsia="微软雅黑" w:hAnsi="微软雅黑" w:hint="eastAsia"/>
+          <w:color w:val="263445"/>
           <w:sz w:val="21"/>
         </w:rPr>
         <w:t>5.3 设置 Cloudflare API Token</w:t>
@@ -1336,14 +1694,17 @@
     </w:p>
     <w:p>
       <w:pPr>
-        <w:rPr>
-          <w:rFonts w:ascii="微软雅黑" w:eastAsia="微软雅黑" w:hAnsi="微软雅黑" w:hint="eastAsia"/>
-          <w:sz w:val="21"/>
-        </w:rPr>
-      </w:pPr>
-      <w:r>
-        <w:rPr>
-          <w:rFonts w:ascii="微软雅黑" w:eastAsia="微软雅黑" w:hAnsi="微软雅黑" w:hint="eastAsia"/>
+        <w:spacing w:after="120" w:line="300" w:lineRule="auto"/>
+        <w:rPr>
+          <w:rFonts w:ascii="微软雅黑" w:eastAsia="微软雅黑" w:hAnsi="微软雅黑" w:hint="eastAsia"/>
+          <w:color w:val="263445"/>
+          <w:sz w:val="21"/>
+        </w:rPr>
+      </w:pPr>
+      <w:r>
+        <w:rPr>
+          <w:rFonts w:ascii="微软雅黑" w:eastAsia="微软雅黑" w:hAnsi="微软雅黑" w:hint="eastAsia"/>
+          <w:color w:val="263445"/>
           <w:sz w:val="21"/>
         </w:rPr>
         <w:t>超级管理员新增、修改、删除普通管理员时，src/admin.js 第 631 行附近会调用 Cloudflare API 同步普通管理员 Access policy。API Token 不能写入 wrangler.toml，必须作为 Worker secret 写入。</w:t>
@@ -1351,29 +1712,37 @@
     </w:p>
     <w:p>
       <w:pPr>
-        <w:rPr>
-          <w:rFonts w:ascii="微软雅黑" w:eastAsia="微软雅黑" w:hAnsi="微软雅黑" w:hint="eastAsia"/>
-          <w:sz w:val="21"/>
-        </w:rPr>
-      </w:pPr>
-      <w:r>
-        <w:rPr>
-          <w:rFonts w:ascii="微软雅黑" w:eastAsia="微软雅黑" w:hAnsi="微软雅黑" w:hint="eastAsia"/>
-          <w:sz w:val="21"/>
+        <w:shd w:val="clear" w:color="auto" w:fill="F4F7FA"/>
+        <w:spacing w:before="40" w:after="140" w:line="300" w:lineRule="auto"/>
+        <w:ind w:left="255" w:right="113"/>
+        <w:rPr>
+          <w:rFonts w:ascii="Consolas" w:eastAsia="微软雅黑" w:hAnsi="Consolas" w:hint="eastAsia"/>
+          <w:color w:val="111827"/>
+          <w:sz w:val="19"/>
+        </w:rPr>
+      </w:pPr>
+      <w:r>
+        <w:rPr>
+          <w:rFonts w:ascii="Consolas" w:eastAsia="微软雅黑" w:hAnsi="Consolas" w:hint="eastAsia"/>
+          <w:color w:val="111827"/>
+          <w:sz w:val="19"/>
         </w:rPr>
         <w:t>npx wrangler secret put CF_API_TOKEN</w:t>
       </w:r>
     </w:p>
     <w:p>
       <w:pPr>
-        <w:rPr>
-          <w:rFonts w:ascii="微软雅黑" w:eastAsia="微软雅黑" w:hAnsi="微软雅黑" w:hint="eastAsia"/>
-          <w:sz w:val="21"/>
-        </w:rPr>
-      </w:pPr>
-      <w:r>
-        <w:rPr>
-          <w:rFonts w:ascii="微软雅黑" w:eastAsia="微软雅黑" w:hAnsi="微软雅黑" w:hint="eastAsia"/>
+        <w:spacing w:after="120" w:line="300" w:lineRule="auto"/>
+        <w:rPr>
+          <w:rFonts w:ascii="微软雅黑" w:eastAsia="微软雅黑" w:hAnsi="微软雅黑" w:hint="eastAsia"/>
+          <w:color w:val="263445"/>
+          <w:sz w:val="21"/>
+        </w:rPr>
+      </w:pPr>
+      <w:r>
+        <w:rPr>
+          <w:rFonts w:ascii="微软雅黑" w:eastAsia="微软雅黑" w:hAnsi="微软雅黑" w:hint="eastAsia"/>
+          <w:color w:val="263445"/>
           <w:sz w:val="21"/>
         </w:rPr>
         <w:t>Token 至少需要能编辑该账号下的 Cloudflare Access 应用/策略。若没有这个 secret，新增、修改或删除管理员会出现cloudflare_config_missing、cloudflare_sync_failed或cloudflare_sync_incomplete；新增和邮箱修改不会留下未同步的管理员记录。修正 secret 或 Access 配置后，可在超级管理员页点击 Sync Access 重新同步已有管理员邮箱。</w:t>
@@ -1381,31 +1750,38 @@
     </w:p>
     <w:p>
       <w:pPr>
-        <w:rPr>
-          <w:rFonts w:ascii="微软雅黑" w:eastAsia="微软雅黑" w:hAnsi="微软雅黑" w:hint="eastAsia"/>
+        <w:shd w:val="clear" w:color="auto" w:fill="EAF2FB"/>
+        <w:spacing w:before="240" w:after="140" w:line="380" w:lineRule="auto"/>
+        <w:rPr>
+          <w:rFonts w:ascii="Microsoft YaHei UI" w:eastAsia="Microsoft YaHei UI" w:hAnsi="Microsoft YaHei UI" w:hint="eastAsia"/>
           <w:b/>
-          <w:sz w:val="26"/>
-        </w:rPr>
-      </w:pPr>
-      <w:r>
-        <w:rPr>
-          <w:rFonts w:ascii="微软雅黑" w:eastAsia="微软雅黑" w:hAnsi="微软雅黑" w:hint="eastAsia"/>
+          <w:color w:val="17365D"/>
+          <w:sz w:val="28"/>
+        </w:rPr>
+      </w:pPr>
+      <w:r>
+        <w:rPr>
+          <w:rFonts w:ascii="Microsoft YaHei UI" w:eastAsia="Microsoft YaHei UI" w:hAnsi="Microsoft YaHei UI" w:hint="eastAsia"/>
           <w:b/>
-          <w:sz w:val="26"/>
+          <w:color w:val="17365D"/>
+          <w:sz w:val="28"/>
         </w:rPr>
         <w:t>6. 部署</w:t>
       </w:r>
     </w:p>
     <w:p>
       <w:pPr>
-        <w:rPr>
-          <w:rFonts w:ascii="微软雅黑" w:eastAsia="微软雅黑" w:hAnsi="微软雅黑" w:hint="eastAsia"/>
-          <w:sz w:val="21"/>
-        </w:rPr>
-      </w:pPr>
-      <w:r>
-        <w:rPr>
-          <w:rFonts w:ascii="微软雅黑" w:eastAsia="微软雅黑" w:hAnsi="微软雅黑" w:hint="eastAsia"/>
+        <w:spacing w:after="120" w:line="300" w:lineRule="auto"/>
+        <w:rPr>
+          <w:rFonts w:ascii="微软雅黑" w:eastAsia="微软雅黑" w:hAnsi="微软雅黑" w:hint="eastAsia"/>
+          <w:color w:val="263445"/>
+          <w:sz w:val="21"/>
+        </w:rPr>
+      </w:pPr>
+      <w:r>
+        <w:rPr>
+          <w:rFonts w:ascii="微软雅黑" w:eastAsia="微软雅黑" w:hAnsi="微软雅黑" w:hint="eastAsia"/>
+          <w:color w:val="263445"/>
           <w:sz w:val="21"/>
         </w:rPr>
         <w:t>确认所有 REPLACE_WITH_* 和 example.com 都已按你的环境替换后部署。</w:t>
@@ -1413,44 +1789,57 @@
     </w:p>
     <w:p>
       <w:pPr>
-        <w:rPr>
-          <w:rFonts w:ascii="微软雅黑" w:eastAsia="微软雅黑" w:hAnsi="微软雅黑" w:hint="eastAsia"/>
-          <w:sz w:val="21"/>
-        </w:rPr>
-      </w:pPr>
-      <w:r>
-        <w:rPr>
-          <w:rFonts w:ascii="微软雅黑" w:eastAsia="微软雅黑" w:hAnsi="微软雅黑" w:hint="eastAsia"/>
-          <w:sz w:val="21"/>
+        <w:shd w:val="clear" w:color="auto" w:fill="F4F7FA"/>
+        <w:spacing w:before="40" w:after="140" w:line="300" w:lineRule="auto"/>
+        <w:ind w:left="255" w:right="113"/>
+        <w:rPr>
+          <w:rFonts w:ascii="Consolas" w:eastAsia="微软雅黑" w:hAnsi="Consolas" w:hint="eastAsia"/>
+          <w:color w:val="111827"/>
+          <w:sz w:val="19"/>
+        </w:rPr>
+      </w:pPr>
+      <w:r>
+        <w:rPr>
+          <w:rFonts w:ascii="Consolas" w:eastAsia="微软雅黑" w:hAnsi="Consolas" w:hint="eastAsia"/>
+          <w:color w:val="111827"/>
+          <w:sz w:val="19"/>
         </w:rPr>
         <w:t>rg -n "REPLACE_WITH|example\.com|admin@example|your-team\.cloudflareaccess\.com"</w:t>
       </w:r>
     </w:p>
     <w:p>
       <w:pPr>
-        <w:rPr>
-          <w:rFonts w:ascii="微软雅黑" w:eastAsia="微软雅黑" w:hAnsi="微软雅黑" w:hint="eastAsia"/>
-          <w:sz w:val="21"/>
-        </w:rPr>
-      </w:pPr>
-      <w:r>
-        <w:rPr>
-          <w:rFonts w:ascii="微软雅黑" w:eastAsia="微软雅黑" w:hAnsi="微软雅黑" w:hint="eastAsia"/>
-          <w:sz w:val="21"/>
+        <w:shd w:val="clear" w:color="auto" w:fill="F4F7FA"/>
+        <w:spacing w:before="40" w:after="140" w:line="300" w:lineRule="auto"/>
+        <w:ind w:left="255" w:right="113"/>
+        <w:rPr>
+          <w:rFonts w:ascii="Consolas" w:eastAsia="微软雅黑" w:hAnsi="Consolas" w:hint="eastAsia"/>
+          <w:color w:val="111827"/>
+          <w:sz w:val="19"/>
+        </w:rPr>
+      </w:pPr>
+      <w:r>
+        <w:rPr>
+          <w:rFonts w:ascii="Consolas" w:eastAsia="微软雅黑" w:hAnsi="Consolas" w:hint="eastAsia"/>
+          <w:color w:val="111827"/>
+          <w:sz w:val="19"/>
         </w:rPr>
         <w:t>npx wrangler deploy</w:t>
       </w:r>
     </w:p>
     <w:p>
       <w:pPr>
-        <w:rPr>
-          <w:rFonts w:ascii="微软雅黑" w:eastAsia="微软雅黑" w:hAnsi="微软雅黑" w:hint="eastAsia"/>
-          <w:sz w:val="21"/>
-        </w:rPr>
-      </w:pPr>
-      <w:r>
-        <w:rPr>
-          <w:rFonts w:ascii="微软雅黑" w:eastAsia="微软雅黑" w:hAnsi="微软雅黑" w:hint="eastAsia"/>
+        <w:spacing w:after="120" w:line="300" w:lineRule="auto"/>
+        <w:rPr>
+          <w:rFonts w:ascii="微软雅黑" w:eastAsia="微软雅黑" w:hAnsi="微软雅黑" w:hint="eastAsia"/>
+          <w:color w:val="263445"/>
+          <w:sz w:val="21"/>
+        </w:rPr>
+      </w:pPr>
+      <w:r>
+        <w:rPr>
+          <w:rFonts w:ascii="微软雅黑" w:eastAsia="微软雅黑" w:hAnsi="微软雅黑" w:hint="eastAsia"/>
+          <w:color w:val="263445"/>
           <w:sz w:val="21"/>
         </w:rPr>
         <w:t>如果 rg 仍然命中 example.com，但你确认该命中属于文档或示例，可以忽略；代码和 wrangler.toml 中不应残留未替换占位符。</w:t>
@@ -1458,31 +1847,39 @@
     </w:p>
     <w:p>
       <w:pPr>
-        <w:rPr>
-          <w:rFonts w:ascii="微软雅黑" w:eastAsia="微软雅黑" w:hAnsi="微软雅黑" w:hint="eastAsia"/>
+        <w:shd w:val="clear" w:color="auto" w:fill="EAF2FB"/>
+        <w:spacing w:before="240" w:after="140" w:line="380" w:lineRule="auto"/>
+        <w:rPr>
+          <w:rFonts w:ascii="Microsoft YaHei UI" w:eastAsia="Microsoft YaHei UI" w:hAnsi="Microsoft YaHei UI" w:hint="eastAsia"/>
           <w:b/>
-          <w:sz w:val="26"/>
-        </w:rPr>
-      </w:pPr>
-      <w:r>
-        <w:rPr>
-          <w:rFonts w:ascii="微软雅黑" w:eastAsia="微软雅黑" w:hAnsi="微软雅黑" w:hint="eastAsia"/>
+          <w:color w:val="17365D"/>
+          <w:sz w:val="28"/>
+        </w:rPr>
+      </w:pPr>
+      <w:r>
+        <w:rPr>
+          <w:rFonts w:ascii="Microsoft YaHei UI" w:eastAsia="Microsoft YaHei UI" w:hAnsi="Microsoft YaHei UI" w:hint="eastAsia"/>
           <w:b/>
-          <w:sz w:val="26"/>
+          <w:color w:val="17365D"/>
+          <w:sz w:val="28"/>
         </w:rPr>
         <w:t>7. 首次上线验证</w:t>
       </w:r>
     </w:p>
     <w:p>
       <w:pPr>
-        <w:rPr>
-          <w:rFonts w:ascii="微软雅黑" w:eastAsia="微软雅黑" w:hAnsi="微软雅黑" w:hint="eastAsia"/>
-          <w:sz w:val="21"/>
-        </w:rPr>
-      </w:pPr>
-      <w:r>
-        <w:rPr>
-          <w:rFonts w:ascii="微软雅黑" w:eastAsia="微软雅黑" w:hAnsi="微软雅黑" w:hint="eastAsia"/>
+        <w:spacing w:after="80" w:line="300" w:lineRule="auto"/>
+        <w:ind w:left="283" w:hanging="130"/>
+        <w:rPr>
+          <w:rFonts w:ascii="微软雅黑" w:eastAsia="微软雅黑" w:hAnsi="微软雅黑" w:hint="eastAsia"/>
+          <w:color w:val="263445"/>
+          <w:sz w:val="21"/>
+        </w:rPr>
+      </w:pPr>
+      <w:r>
+        <w:rPr>
+          <w:rFonts w:ascii="微软雅黑" w:eastAsia="微软雅黑" w:hAnsi="微软雅黑" w:hint="eastAsia"/>
+          <w:color w:val="263445"/>
           <w:sz w:val="21"/>
         </w:rPr>
         <w:t>• 访问 https://app.yourdomain.com/superloginv，使用超级管理员邮箱通过 Cloudflare Access 登录。</w:t>
@@ -1490,14 +1887,18 @@
     </w:p>
     <w:p>
       <w:pPr>
-        <w:rPr>
-          <w:rFonts w:ascii="微软雅黑" w:eastAsia="微软雅黑" w:hAnsi="微软雅黑" w:hint="eastAsia"/>
-          <w:sz w:val="21"/>
-        </w:rPr>
-      </w:pPr>
-      <w:r>
-        <w:rPr>
-          <w:rFonts w:ascii="微软雅黑" w:eastAsia="微软雅黑" w:hAnsi="微软雅黑" w:hint="eastAsia"/>
+        <w:spacing w:after="80" w:line="300" w:lineRule="auto"/>
+        <w:ind w:left="283" w:hanging="130"/>
+        <w:rPr>
+          <w:rFonts w:ascii="微软雅黑" w:eastAsia="微软雅黑" w:hAnsi="微软雅黑" w:hint="eastAsia"/>
+          <w:color w:val="263445"/>
+          <w:sz w:val="21"/>
+        </w:rPr>
+      </w:pPr>
+      <w:r>
+        <w:rPr>
+          <w:rFonts w:ascii="微软雅黑" w:eastAsia="微软雅黑" w:hAnsi="微软雅黑" w:hint="eastAsia"/>
+          <w:color w:val="263445"/>
           <w:sz w:val="21"/>
         </w:rPr>
         <w:t>• 在超级管理员页新增一个普通管理员邮箱。成功后列表会立即显示该邮箱，并同步普通管理员 Access policy；如怀疑同步状态异常，可点击 Sync Access 手动重同步。</w:t>
@@ -1505,14 +1906,18 @@
     </w:p>
     <w:p>
       <w:pPr>
-        <w:rPr>
-          <w:rFonts w:ascii="微软雅黑" w:eastAsia="微软雅黑" w:hAnsi="微软雅黑" w:hint="eastAsia"/>
-          <w:sz w:val="21"/>
-        </w:rPr>
-      </w:pPr>
-      <w:r>
-        <w:rPr>
-          <w:rFonts w:ascii="微软雅黑" w:eastAsia="微软雅黑" w:hAnsi="微软雅黑" w:hint="eastAsia"/>
+        <w:spacing w:after="80" w:line="300" w:lineRule="auto"/>
+        <w:ind w:left="283" w:hanging="130"/>
+        <w:rPr>
+          <w:rFonts w:ascii="微软雅黑" w:eastAsia="微软雅黑" w:hAnsi="微软雅黑" w:hint="eastAsia"/>
+          <w:color w:val="263445"/>
+          <w:sz w:val="21"/>
+        </w:rPr>
+      </w:pPr>
+      <w:r>
+        <w:rPr>
+          <w:rFonts w:ascii="微软雅黑" w:eastAsia="微软雅黑" w:hAnsi="微软雅黑" w:hint="eastAsia"/>
+          <w:color w:val="263445"/>
           <w:sz w:val="21"/>
         </w:rPr>
         <w:t>• 访问 https://app.yourdomain.com/login，使用刚新增的普通管理员邮箱登录。</w:t>
@@ -1520,14 +1925,18 @@
     </w:p>
     <w:p>
       <w:pPr>
-        <w:rPr>
-          <w:rFonts w:ascii="微软雅黑" w:eastAsia="微软雅黑" w:hAnsi="微软雅黑" w:hint="eastAsia"/>
-          <w:sz w:val="21"/>
-        </w:rPr>
-      </w:pPr>
-      <w:r>
-        <w:rPr>
-          <w:rFonts w:ascii="微软雅黑" w:eastAsia="微软雅黑" w:hAnsi="微软雅黑" w:hint="eastAsia"/>
+        <w:spacing w:after="80" w:line="300" w:lineRule="auto"/>
+        <w:ind w:left="283" w:hanging="130"/>
+        <w:rPr>
+          <w:rFonts w:ascii="微软雅黑" w:eastAsia="微软雅黑" w:hAnsi="微软雅黑" w:hint="eastAsia"/>
+          <w:color w:val="263445"/>
+          <w:sz w:val="21"/>
+        </w:rPr>
+      </w:pPr>
+      <w:r>
+        <w:rPr>
+          <w:rFonts w:ascii="微软雅黑" w:eastAsia="微软雅黑" w:hAnsi="微软雅黑" w:hint="eastAsia"/>
+          <w:color w:val="263445"/>
           <w:sz w:val="21"/>
         </w:rPr>
         <w:t>• 在后台编辑默认模板，设置一个未来的北京时间失效时间，保存后复制生成的分享链接。</w:t>
@@ -1535,14 +1944,19 @@
     </w:p>
     <w:p>
       <w:pPr>
-        <w:rPr>
-          <w:rFonts w:ascii="微软雅黑" w:eastAsia="微软雅黑" w:hAnsi="微软雅黑" w:hint="eastAsia"/>
-          <w:sz w:val="21"/>
-        </w:rPr>
-      </w:pPr>
-      <w:r>
-        <w:rPr>
-          <w:rFonts w:ascii="微软雅黑" w:eastAsia="微软雅黑" w:hAnsi="微软雅黑" w:hint="eastAsia"/>
+        <w:shd w:val="clear" w:color="auto" w:fill="FFF7E6"/>
+        <w:spacing w:after="80" w:line="300" w:lineRule="auto"/>
+        <w:ind w:left="283" w:hanging="130"/>
+        <w:rPr>
+          <w:rFonts w:ascii="微软雅黑" w:eastAsia="微软雅黑" w:hAnsi="微软雅黑" w:hint="eastAsia"/>
+          <w:color w:val="263445"/>
+          <w:sz w:val="21"/>
+        </w:rPr>
+      </w:pPr>
+      <w:r>
+        <w:rPr>
+          <w:rFonts w:ascii="微软雅黑" w:eastAsia="微软雅黑" w:hAnsi="微软雅黑" w:hint="eastAsia"/>
+          <w:color w:val="263445"/>
           <w:sz w:val="21"/>
         </w:rPr>
         <w:t>• 无痕窗口打开分享链接，确认不需要 Access 登录即可访问。</w:t>
@@ -1550,14 +1964,19 @@
     </w:p>
     <w:p>
       <w:pPr>
-        <w:rPr>
-          <w:rFonts w:ascii="微软雅黑" w:eastAsia="微软雅黑" w:hAnsi="微软雅黑" w:hint="eastAsia"/>
-          <w:sz w:val="21"/>
-        </w:rPr>
-      </w:pPr>
-      <w:r>
-        <w:rPr>
-          <w:rFonts w:ascii="微软雅黑" w:eastAsia="微软雅黑" w:hAnsi="微软雅黑" w:hint="eastAsia"/>
+        <w:shd w:val="clear" w:color="auto" w:fill="FFF7E6"/>
+        <w:spacing w:after="80" w:line="300" w:lineRule="auto"/>
+        <w:ind w:left="283" w:hanging="130"/>
+        <w:rPr>
+          <w:rFonts w:ascii="微软雅黑" w:eastAsia="微软雅黑" w:hAnsi="微软雅黑" w:hint="eastAsia"/>
+          <w:color w:val="263445"/>
+          <w:sz w:val="21"/>
+        </w:rPr>
+      </w:pPr>
+      <w:r>
+        <w:rPr>
+          <w:rFonts w:ascii="微软雅黑" w:eastAsia="微软雅黑" w:hAnsi="微软雅黑" w:hint="eastAsia"/>
+          <w:color w:val="263445"/>
           <w:sz w:val="21"/>
         </w:rPr>
         <w:t>• 上传一张测试图片，确认 /uploads/... 和 /completion-uploads/... 能通过 Worker 返回图片。</w:t>
@@ -1565,14 +1984,18 @@
     </w:p>
     <w:p>
       <w:pPr>
-        <w:rPr>
-          <w:rFonts w:ascii="微软雅黑" w:eastAsia="微软雅黑" w:hAnsi="微软雅黑" w:hint="eastAsia"/>
-          <w:sz w:val="21"/>
-        </w:rPr>
-      </w:pPr>
-      <w:r>
-        <w:rPr>
-          <w:rFonts w:ascii="微软雅黑" w:eastAsia="微软雅黑" w:hAnsi="微软雅黑" w:hint="eastAsia"/>
+        <w:spacing w:after="80" w:line="300" w:lineRule="auto"/>
+        <w:ind w:left="283" w:hanging="130"/>
+        <w:rPr>
+          <w:rFonts w:ascii="微软雅黑" w:eastAsia="微软雅黑" w:hAnsi="微软雅黑" w:hint="eastAsia"/>
+          <w:color w:val="263445"/>
+          <w:sz w:val="21"/>
+        </w:rPr>
+      </w:pPr>
+      <w:r>
+        <w:rPr>
+          <w:rFonts w:ascii="微软雅黑" w:eastAsia="微软雅黑" w:hAnsi="微软雅黑" w:hint="eastAsia"/>
+          <w:color w:val="263445"/>
           <w:sz w:val="21"/>
         </w:rPr>
         <w:t>• 删除一个测试分享链接，进入 /linkhistory 验证封存/恢复流程。</w:t>
@@ -1580,14 +2003,19 @@
     </w:p>
     <w:p>
       <w:pPr>
-        <w:rPr>
-          <w:rFonts w:ascii="微软雅黑" w:eastAsia="微软雅黑" w:hAnsi="微软雅黑" w:hint="eastAsia"/>
-          <w:sz w:val="21"/>
-        </w:rPr>
-      </w:pPr>
-      <w:r>
-        <w:rPr>
-          <w:rFonts w:ascii="微软雅黑" w:eastAsia="微软雅黑" w:hAnsi="微软雅黑" w:hint="eastAsia"/>
+        <w:shd w:val="clear" w:color="auto" w:fill="FFF7E6"/>
+        <w:spacing w:after="80" w:line="300" w:lineRule="auto"/>
+        <w:ind w:left="283" w:hanging="130"/>
+        <w:rPr>
+          <w:rFonts w:ascii="微软雅黑" w:eastAsia="微软雅黑" w:hAnsi="微软雅黑" w:hint="eastAsia"/>
+          <w:color w:val="263445"/>
+          <w:sz w:val="21"/>
+        </w:rPr>
+      </w:pPr>
+      <w:r>
+        <w:rPr>
+          <w:rFonts w:ascii="微软雅黑" w:eastAsia="微软雅黑" w:hAnsi="微软雅黑" w:hint="eastAsia"/>
+          <w:color w:val="263445"/>
           <w:sz w:val="21"/>
         </w:rPr>
         <w:t>• 进入 /superloginv 查看 R2/D1 使用情况，确认 R2 与 D1 绑定可读。</w:t>
@@ -1595,31 +2023,40 @@
     </w:p>
     <w:p>
       <w:pPr>
-        <w:rPr>
-          <w:rFonts w:ascii="微软雅黑" w:eastAsia="微软雅黑" w:hAnsi="微软雅黑" w:hint="eastAsia"/>
+        <w:shd w:val="clear" w:color="auto" w:fill="EAF2FB"/>
+        <w:spacing w:before="240" w:after="140" w:line="380" w:lineRule="auto"/>
+        <w:rPr>
+          <w:rFonts w:ascii="Microsoft YaHei UI" w:eastAsia="Microsoft YaHei UI" w:hAnsi="Microsoft YaHei UI" w:hint="eastAsia"/>
           <w:b/>
-          <w:sz w:val="26"/>
-        </w:rPr>
-      </w:pPr>
-      <w:r>
-        <w:rPr>
-          <w:rFonts w:ascii="微软雅黑" w:eastAsia="微软雅黑" w:hAnsi="微软雅黑" w:hint="eastAsia"/>
+          <w:color w:val="17365D"/>
+          <w:sz w:val="28"/>
+        </w:rPr>
+      </w:pPr>
+      <w:r>
+        <w:rPr>
+          <w:rFonts w:ascii="Microsoft YaHei UI" w:eastAsia="Microsoft YaHei UI" w:hAnsi="Microsoft YaHei UI" w:hint="eastAsia"/>
           <w:b/>
-          <w:sz w:val="26"/>
+          <w:color w:val="17365D"/>
+          <w:sz w:val="28"/>
         </w:rPr>
         <w:t>8. 常见故障定位</w:t>
       </w:r>
     </w:p>
     <w:p>
       <w:pPr>
-        <w:rPr>
-          <w:rFonts w:ascii="微软雅黑" w:eastAsia="微软雅黑" w:hAnsi="微软雅黑" w:hint="eastAsia"/>
-          <w:sz w:val="21"/>
-        </w:rPr>
-      </w:pPr>
-      <w:r>
-        <w:rPr>
-          <w:rFonts w:ascii="微软雅黑" w:eastAsia="微软雅黑" w:hAnsi="微软雅黑" w:hint="eastAsia"/>
+        <w:shd w:val="clear" w:color="auto" w:fill="FFF7E6"/>
+        <w:spacing w:after="80" w:line="300" w:lineRule="auto"/>
+        <w:ind w:left="283" w:hanging="130"/>
+        <w:rPr>
+          <w:rFonts w:ascii="微软雅黑" w:eastAsia="微软雅黑" w:hAnsi="微软雅黑" w:hint="eastAsia"/>
+          <w:color w:val="263445"/>
+          <w:sz w:val="21"/>
+        </w:rPr>
+      </w:pPr>
+      <w:r>
+        <w:rPr>
+          <w:rFonts w:ascii="微软雅黑" w:eastAsia="微软雅黑" w:hAnsi="微软雅黑" w:hint="eastAsia"/>
+          <w:color w:val="263445"/>
           <w:sz w:val="21"/>
         </w:rPr>
         <w:t>• 页面显示 404 或 未找到对应页面：检查 wrangler.toml 第 11-13 行路由，以及 src/constants.js 第 27-28 行。Worker 的 isAdminHost 只接受根域名或默认子域名作为后台 host。</w:t>
@@ -1627,14 +2064,19 @@
     </w:p>
     <w:p>
       <w:pPr>
-        <w:rPr>
-          <w:rFonts w:ascii="微软雅黑" w:eastAsia="微软雅黑" w:hAnsi="微软雅黑" w:hint="eastAsia"/>
-          <w:sz w:val="21"/>
-        </w:rPr>
-      </w:pPr>
-      <w:r>
-        <w:rPr>
-          <w:rFonts w:ascii="微软雅黑" w:eastAsia="微软雅黑" w:hAnsi="微软雅黑" w:hint="eastAsia"/>
+        <w:shd w:val="clear" w:color="auto" w:fill="FFF7E6"/>
+        <w:spacing w:after="80" w:line="300" w:lineRule="auto"/>
+        <w:ind w:left="283" w:hanging="130"/>
+        <w:rPr>
+          <w:rFonts w:ascii="微软雅黑" w:eastAsia="微软雅黑" w:hAnsi="微软雅黑" w:hint="eastAsia"/>
+          <w:color w:val="263445"/>
+          <w:sz w:val="21"/>
+        </w:rPr>
+      </w:pPr>
+      <w:r>
+        <w:rPr>
+          <w:rFonts w:ascii="微软雅黑" w:eastAsia="微软雅黑" w:hAnsi="微软雅黑" w:hint="eastAsia"/>
+          <w:color w:val="263445"/>
           <w:sz w:val="21"/>
         </w:rPr>
         <w:t>• 返回 access_unauthorized：检查 Access 应用是否覆盖对应路径、wrangler.toml 第 19-23 行的 team domain 和 AUD 是否填反、登录邮箱是否匹配；还要确认普通管理员的 /login 和 /linkhistory 没被拆到两个不同 AUD 的 Access application。</w:t>
@@ -1642,14 +2084,18 @@
     </w:p>
     <w:p>
       <w:pPr>
-        <w:rPr>
-          <w:rFonts w:ascii="微软雅黑" w:eastAsia="微软雅黑" w:hAnsi="微软雅黑" w:hint="eastAsia"/>
-          <w:sz w:val="21"/>
-        </w:rPr>
-      </w:pPr>
-      <w:r>
-        <w:rPr>
-          <w:rFonts w:ascii="微软雅黑" w:eastAsia="微软雅黑" w:hAnsi="微软雅黑" w:hint="eastAsia"/>
+        <w:spacing w:after="80" w:line="300" w:lineRule="auto"/>
+        <w:ind w:left="283" w:hanging="130"/>
+        <w:rPr>
+          <w:rFonts w:ascii="微软雅黑" w:eastAsia="微软雅黑" w:hAnsi="微软雅黑" w:hint="eastAsia"/>
+          <w:color w:val="263445"/>
+          <w:sz w:val="21"/>
+        </w:rPr>
+      </w:pPr>
+      <w:r>
+        <w:rPr>
+          <w:rFonts w:ascii="微软雅黑" w:eastAsia="微软雅黑" w:hAnsi="微软雅黑" w:hint="eastAsia"/>
+          <w:color w:val="263445"/>
           <w:sz w:val="21"/>
         </w:rPr>
         <w:t>• 新增管理员失败cloudflare_config_missing/cloudflare_sync_failed/cloudflare_sync_incomplete：检查 CF_API_TOKEN secret、CF_ACCOUNT_ID、CF_ACCESS_ADMIN_APP_ID、CF_ACCESS_ADMIN_POLICY_ID，并在修复后使用超级管理员页的 Sync Access 重新同步。</w:t>
@@ -1657,14 +2103,19 @@
     </w:p>
     <w:p>
       <w:pPr>
-        <w:rPr>
-          <w:rFonts w:ascii="微软雅黑" w:eastAsia="微软雅黑" w:hAnsi="微软雅黑" w:hint="eastAsia"/>
-          <w:sz w:val="21"/>
-        </w:rPr>
-      </w:pPr>
-      <w:r>
-        <w:rPr>
-          <w:rFonts w:ascii="微软雅黑" w:eastAsia="微软雅黑" w:hAnsi="微软雅黑" w:hint="eastAsia"/>
+        <w:shd w:val="clear" w:color="auto" w:fill="FFF7E6"/>
+        <w:spacing w:after="80" w:line="300" w:lineRule="auto"/>
+        <w:ind w:left="283" w:hanging="130"/>
+        <w:rPr>
+          <w:rFonts w:ascii="微软雅黑" w:eastAsia="微软雅黑" w:hAnsi="微软雅黑" w:hint="eastAsia"/>
+          <w:color w:val="263445"/>
+          <w:sz w:val="21"/>
+        </w:rPr>
+      </w:pPr>
+      <w:r>
+        <w:rPr>
+          <w:rFonts w:ascii="微软雅黑" w:eastAsia="微软雅黑" w:hAnsi="微软雅黑" w:hint="eastAsia"/>
+          <w:color w:val="263445"/>
           <w:sz w:val="21"/>
         </w:rPr>
         <w:t>• 图片上传返回 missing_r2_binding：检查 wrangler.toml 第 32-34 行 R2 绑定名必须是 LEAVE_ATTACHMENTS，bucket_name 必须真实存在。</w:t>
@@ -1672,14 +2123,19 @@
     </w:p>
     <w:p>
       <w:pPr>
-        <w:rPr>
-          <w:rFonts w:ascii="微软雅黑" w:eastAsia="微软雅黑" w:hAnsi="微软雅黑" w:hint="eastAsia"/>
-          <w:sz w:val="21"/>
-        </w:rPr>
-      </w:pPr>
-      <w:r>
-        <w:rPr>
-          <w:rFonts w:ascii="微软雅黑" w:eastAsia="微软雅黑" w:hAnsi="微软雅黑" w:hint="eastAsia"/>
+        <w:shd w:val="clear" w:color="auto" w:fill="FFF7E6"/>
+        <w:spacing w:after="80" w:line="300" w:lineRule="auto"/>
+        <w:ind w:left="283" w:hanging="130"/>
+        <w:rPr>
+          <w:rFonts w:ascii="微软雅黑" w:eastAsia="微软雅黑" w:hAnsi="微软雅黑" w:hint="eastAsia"/>
+          <w:color w:val="263445"/>
+          <w:sz w:val="21"/>
+        </w:rPr>
+      </w:pPr>
+      <w:r>
+        <w:rPr>
+          <w:rFonts w:ascii="微软雅黑" w:eastAsia="微软雅黑" w:hAnsi="微软雅黑" w:hint="eastAsia"/>
+          <w:color w:val="263445"/>
           <w:sz w:val="21"/>
         </w:rPr>
         <w:t>• D1 统计或列表异常：检查 wrangler.toml 第 36-40 行 D1 绑定名必须是 LEAVE_STATUS_D1，并重新执行 d1 migrations apply。</w:t>
@@ -1687,14 +2143,18 @@
     </w:p>
     <w:p>
       <w:pPr>
-        <w:rPr>
-          <w:rFonts w:ascii="微软雅黑" w:eastAsia="微软雅黑" w:hAnsi="微软雅黑" w:hint="eastAsia"/>
-          <w:sz w:val="21"/>
-        </w:rPr>
-      </w:pPr>
-      <w:r>
-        <w:rPr>
-          <w:rFonts w:ascii="微软雅黑" w:eastAsia="微软雅黑" w:hAnsi="微软雅黑" w:hint="eastAsia"/>
+        <w:spacing w:after="80" w:line="300" w:lineRule="auto"/>
+        <w:ind w:left="283" w:hanging="130"/>
+        <w:rPr>
+          <w:rFonts w:ascii="微软雅黑" w:eastAsia="微软雅黑" w:hAnsi="微软雅黑" w:hint="eastAsia"/>
+          <w:color w:val="263445"/>
+          <w:sz w:val="21"/>
+        </w:rPr>
+      </w:pPr>
+      <w:r>
+        <w:rPr>
+          <w:rFonts w:ascii="微软雅黑" w:eastAsia="微软雅黑" w:hAnsi="微软雅黑" w:hint="eastAsia"/>
+          <w:color w:val="263445"/>
           <w:sz w:val="21"/>
         </w:rPr>
         <w:t>• 分享链接生成到错误域名：检查 src/constants.js 第 27-28 行和 public/login.js 第 15-16 行是否一致。</w:t>
@@ -1702,14 +2162,18 @@
     </w:p>
     <w:p>
       <w:pPr>
-        <w:rPr>
-          <w:rFonts w:ascii="微软雅黑" w:eastAsia="微软雅黑" w:hAnsi="微软雅黑" w:hint="eastAsia"/>
-          <w:sz w:val="21"/>
-        </w:rPr>
-      </w:pPr>
-      <w:r>
-        <w:rPr>
-          <w:rFonts w:ascii="微软雅黑" w:eastAsia="微软雅黑" w:hAnsi="微软雅黑" w:hint="eastAsia"/>
+        <w:spacing w:after="80" w:line="300" w:lineRule="auto"/>
+        <w:ind w:left="283" w:hanging="130"/>
+        <w:rPr>
+          <w:rFonts w:ascii="微软雅黑" w:eastAsia="微软雅黑" w:hAnsi="微软雅黑" w:hint="eastAsia"/>
+          <w:color w:val="263445"/>
+          <w:sz w:val="21"/>
+        </w:rPr>
+      </w:pPr>
+      <w:r>
+        <w:rPr>
+          <w:rFonts w:ascii="微软雅黑" w:eastAsia="微软雅黑" w:hAnsi="微软雅黑" w:hint="eastAsia"/>
+          <w:color w:val="263445"/>
           <w:sz w:val="21"/>
         </w:rPr>
         <w:t>• 浏览器控制台 CSP 报错：检查 src/constants.js 第 193 行 connect-src 是否包含你的通配域名。</w:t>
@@ -1717,14 +2181,19 @@
     </w:p>
     <w:p>
       <w:pPr>
-        <w:rPr>
-          <w:rFonts w:ascii="微软雅黑" w:eastAsia="微软雅黑" w:hAnsi="微软雅黑" w:hint="eastAsia"/>
-          <w:sz w:val="21"/>
-        </w:rPr>
-      </w:pPr>
-      <w:r>
-        <w:rPr>
-          <w:rFonts w:ascii="微软雅黑" w:eastAsia="微软雅黑" w:hAnsi="微软雅黑" w:hint="eastAsia"/>
+        <w:shd w:val="clear" w:color="auto" w:fill="FFF7E6"/>
+        <w:spacing w:after="80" w:line="300" w:lineRule="auto"/>
+        <w:ind w:left="283" w:hanging="130"/>
+        <w:rPr>
+          <w:rFonts w:ascii="微软雅黑" w:eastAsia="微软雅黑" w:hAnsi="微软雅黑" w:hint="eastAsia"/>
+          <w:color w:val="263445"/>
+          <w:sz w:val="21"/>
+        </w:rPr>
+      </w:pPr>
+      <w:r>
+        <w:rPr>
+          <w:rFonts w:ascii="微软雅黑" w:eastAsia="微软雅黑" w:hAnsi="微软雅黑" w:hint="eastAsia"/>
+          <w:color w:val="263445"/>
           <w:sz w:val="21"/>
         </w:rPr>
         <w:t>• 普通管理员登录后看不到旧数据：本项目按管理员邮箱归属隔离数据，旧用户名映射只能通过 wrangler.toml 第 24 行 ADMIN_EMAIL_REPLACEMENTS_JSON 维护。</w:t>
@@ -1732,31 +2201,38 @@
     </w:p>
     <w:p>
       <w:pPr>
-        <w:rPr>
-          <w:rFonts w:ascii="微软雅黑" w:eastAsia="微软雅黑" w:hAnsi="微软雅黑" w:hint="eastAsia"/>
+        <w:shd w:val="clear" w:color="auto" w:fill="EAF2FB"/>
+        <w:spacing w:before="240" w:after="140" w:line="380" w:lineRule="auto"/>
+        <w:rPr>
+          <w:rFonts w:ascii="Microsoft YaHei UI" w:eastAsia="Microsoft YaHei UI" w:hAnsi="Microsoft YaHei UI" w:hint="eastAsia"/>
           <w:b/>
-          <w:sz w:val="26"/>
-        </w:rPr>
-      </w:pPr>
-      <w:r>
-        <w:rPr>
-          <w:rFonts w:ascii="微软雅黑" w:eastAsia="微软雅黑" w:hAnsi="微软雅黑" w:hint="eastAsia"/>
+          <w:color w:val="17365D"/>
+          <w:sz w:val="28"/>
+        </w:rPr>
+      </w:pPr>
+      <w:r>
+        <w:rPr>
+          <w:rFonts w:ascii="Microsoft YaHei UI" w:eastAsia="Microsoft YaHei UI" w:hAnsi="Microsoft YaHei UI" w:hint="eastAsia"/>
           <w:b/>
-          <w:sz w:val="26"/>
+          <w:color w:val="17365D"/>
+          <w:sz w:val="28"/>
         </w:rPr>
         <w:t>9. 开源发布前检查</w:t>
       </w:r>
     </w:p>
     <w:p>
       <w:pPr>
-        <w:rPr>
-          <w:rFonts w:ascii="微软雅黑" w:eastAsia="微软雅黑" w:hAnsi="微软雅黑" w:hint="eastAsia"/>
-          <w:sz w:val="21"/>
-        </w:rPr>
-      </w:pPr>
-      <w:r>
-        <w:rPr>
-          <w:rFonts w:ascii="微软雅黑" w:eastAsia="微软雅黑" w:hAnsi="微软雅黑" w:hint="eastAsia"/>
+        <w:spacing w:after="120" w:line="300" w:lineRule="auto"/>
+        <w:rPr>
+          <w:rFonts w:ascii="微软雅黑" w:eastAsia="微软雅黑" w:hAnsi="微软雅黑" w:hint="eastAsia"/>
+          <w:color w:val="263445"/>
+          <w:sz w:val="21"/>
+        </w:rPr>
+      </w:pPr>
+      <w:r>
+        <w:rPr>
+          <w:rFonts w:ascii="微软雅黑" w:eastAsia="微软雅黑" w:hAnsi="微软雅黑" w:hint="eastAsia"/>
+          <w:color w:val="263445"/>
           <w:sz w:val="21"/>
         </w:rPr>
         <w:t>提交到公开仓库前，建议在副本目录执行以下命令。</w:t>
@@ -1764,44 +2240,137 @@
     </w:p>
     <w:p>
       <w:pPr>
-        <w:rPr>
-          <w:rFonts w:ascii="微软雅黑" w:eastAsia="微软雅黑" w:hAnsi="微软雅黑" w:hint="eastAsia"/>
-          <w:sz w:val="21"/>
-        </w:rPr>
-      </w:pPr>
-      <w:r>
-        <w:rPr>
-          <w:rFonts w:ascii="微软雅黑" w:eastAsia="微软雅黑" w:hAnsi="微软雅黑" w:hint="eastAsia"/>
-          <w:sz w:val="21"/>
-        </w:rPr>
-        <w:t>rg -n --hidden -S "真实邮箱|真实域名|真实姓名|真实学号|Cloudflare资源ID|CF_API_TOKEN|REPLACE_WITH" -g '!node_modules' -g "!.wrangler/**"</w:t>
-      </w:r>
-    </w:p>
-    <w:p>
-      <w:pPr>
-        <w:rPr>
-          <w:rFonts w:ascii="微软雅黑" w:eastAsia="微软雅黑" w:hAnsi="微软雅黑" w:hint="eastAsia"/>
-          <w:sz w:val="21"/>
-        </w:rPr>
-      </w:pPr>
-      <w:r>
-        <w:rPr>
-          <w:rFonts w:ascii="微软雅黑" w:eastAsia="微软雅黑" w:hAnsi="微软雅黑" w:hint="eastAsia"/>
-          <w:sz w:val="21"/>
+        <w:shd w:val="clear" w:color="auto" w:fill="F4F7FA"/>
+        <w:spacing w:before="40" w:after="140" w:line="300" w:lineRule="auto"/>
+        <w:ind w:left="255" w:right="113"/>
+        <w:rPr>
+          <w:rFonts w:ascii="Consolas" w:eastAsia="微软雅黑" w:hAnsi="Consolas" w:hint="eastAsia"/>
+          <w:color w:val="111827"/>
+          <w:sz w:val="19"/>
+        </w:rPr>
+      </w:pPr>
+      <w:r>
+        <w:rPr>
+          <w:rFonts w:ascii="Consolas" w:eastAsia="微软雅黑" w:hAnsi="Consolas" w:hint="eastAsia"/>
+          <w:color w:val="111827"/>
+          <w:sz w:val="19"/>
+        </w:rPr>
+        <w:t>rg -n --hidden -S "</w:t>
+      </w:r>
+      <w:r>
+        <w:rPr>
+          <w:rFonts w:ascii="Consolas" w:eastAsia="微软雅黑" w:hAnsi="Consolas" w:hint="eastAsia"/>
+          <w:color w:val="111827"/>
+          <w:sz w:val="19"/>
+        </w:rPr>
+        <w:t>真实邮箱</w:t>
+      </w:r>
+      <w:r>
+        <w:rPr>
+          <w:rFonts w:ascii="Consolas" w:eastAsia="微软雅黑" w:hAnsi="Consolas" w:hint="eastAsia"/>
+          <w:color w:val="111827"/>
+          <w:sz w:val="19"/>
+        </w:rPr>
+        <w:t>|</w:t>
+      </w:r>
+      <w:r>
+        <w:rPr>
+          <w:rFonts w:ascii="Consolas" w:eastAsia="微软雅黑" w:hAnsi="Consolas" w:hint="eastAsia"/>
+          <w:color w:val="111827"/>
+          <w:sz w:val="19"/>
+        </w:rPr>
+        <w:t>真实域名</w:t>
+      </w:r>
+      <w:r>
+        <w:rPr>
+          <w:rFonts w:ascii="Consolas" w:eastAsia="微软雅黑" w:hAnsi="Consolas" w:hint="eastAsia"/>
+          <w:color w:val="111827"/>
+          <w:sz w:val="19"/>
+        </w:rPr>
+        <w:t>|</w:t>
+      </w:r>
+      <w:r>
+        <w:rPr>
+          <w:rFonts w:ascii="Consolas" w:eastAsia="微软雅黑" w:hAnsi="Consolas" w:hint="eastAsia"/>
+          <w:color w:val="111827"/>
+          <w:sz w:val="19"/>
+        </w:rPr>
+        <w:t>真实姓名</w:t>
+      </w:r>
+      <w:r>
+        <w:rPr>
+          <w:rFonts w:ascii="Consolas" w:eastAsia="微软雅黑" w:hAnsi="Consolas" w:hint="eastAsia"/>
+          <w:color w:val="111827"/>
+          <w:sz w:val="19"/>
+        </w:rPr>
+        <w:t>|</w:t>
+      </w:r>
+      <w:r>
+        <w:rPr>
+          <w:rFonts w:ascii="Consolas" w:eastAsia="微软雅黑" w:hAnsi="Consolas" w:hint="eastAsia"/>
+          <w:color w:val="111827"/>
+          <w:sz w:val="19"/>
+        </w:rPr>
+        <w:t>真实学号</w:t>
+      </w:r>
+      <w:r>
+        <w:rPr>
+          <w:rFonts w:ascii="Consolas" w:eastAsia="微软雅黑" w:hAnsi="Consolas" w:hint="eastAsia"/>
+          <w:color w:val="111827"/>
+          <w:sz w:val="19"/>
+        </w:rPr>
+        <w:t>|Cloudflare</w:t>
+      </w:r>
+      <w:r>
+        <w:rPr>
+          <w:rFonts w:ascii="Consolas" w:eastAsia="微软雅黑" w:hAnsi="Consolas" w:hint="eastAsia"/>
+          <w:color w:val="111827"/>
+          <w:sz w:val="19"/>
+        </w:rPr>
+        <w:t>资源</w:t>
+      </w:r>
+      <w:r>
+        <w:rPr>
+          <w:rFonts w:ascii="Consolas" w:eastAsia="微软雅黑" w:hAnsi="Consolas" w:hint="eastAsia"/>
+          <w:color w:val="111827"/>
+          <w:sz w:val="19"/>
+        </w:rPr>
+        <w:t>ID|CF_API_TOKEN|REPLACE_WITH" -g '!node_modules' -g "!.wrangler/**"</w:t>
+      </w:r>
+    </w:p>
+    <w:p>
+      <w:pPr>
+        <w:shd w:val="clear" w:color="auto" w:fill="F4F7FA"/>
+        <w:spacing w:before="40" w:after="140" w:line="300" w:lineRule="auto"/>
+        <w:ind w:left="255" w:right="113"/>
+        <w:rPr>
+          <w:rFonts w:ascii="Consolas" w:eastAsia="微软雅黑" w:hAnsi="Consolas" w:hint="eastAsia"/>
+          <w:color w:val="111827"/>
+          <w:sz w:val="19"/>
+        </w:rPr>
+      </w:pPr>
+      <w:r>
+        <w:rPr>
+          <w:rFonts w:ascii="Consolas" w:eastAsia="微软雅黑" w:hAnsi="Consolas" w:hint="eastAsia"/>
+          <w:color w:val="111827"/>
+          <w:sz w:val="19"/>
         </w:rPr>
         <w:t>Get-ChildItem -Force</w:t>
       </w:r>
     </w:p>
     <w:p>
       <w:pPr>
-        <w:rPr>
-          <w:rFonts w:ascii="微软雅黑" w:eastAsia="微软雅黑" w:hAnsi="微软雅黑" w:hint="eastAsia"/>
-          <w:sz w:val="21"/>
-        </w:rPr>
-      </w:pPr>
-      <w:r>
-        <w:rPr>
-          <w:rFonts w:ascii="微软雅黑" w:eastAsia="微软雅黑" w:hAnsi="微软雅黑" w:hint="eastAsia"/>
+        <w:spacing w:after="120" w:line="300" w:lineRule="auto"/>
+        <w:rPr>
+          <w:rFonts w:ascii="微软雅黑" w:eastAsia="微软雅黑" w:hAnsi="微软雅黑" w:hint="eastAsia"/>
+          <w:color w:val="263445"/>
+          <w:sz w:val="21"/>
+        </w:rPr>
+      </w:pPr>
+      <w:r>
+        <w:rPr>
+          <w:rFonts w:ascii="微软雅黑" w:eastAsia="微软雅黑" w:hAnsi="微软雅黑" w:hint="eastAsia"/>
+          <w:color w:val="263445"/>
           <w:sz w:val="21"/>
         </w:rPr>
         <w:t>预期结果：不应出现真实邮箱、真实域名、Cloudflare 资源 ID、真实姓名、真实学号。若命中 public/china-divisions.js 中的地名，一般属于行政区数据，不是个人敏感信息。</w:t>
@@ -1809,14 +2378,17 @@
     </w:p>
     <w:p>
       <w:pPr>
-        <w:rPr>
-          <w:rFonts w:ascii="微软雅黑" w:eastAsia="微软雅黑" w:hAnsi="微软雅黑" w:hint="eastAsia"/>
-          <w:sz w:val="21"/>
-        </w:rPr>
-      </w:pPr>
-      <w:r>
-        <w:rPr>
-          <w:rFonts w:ascii="微软雅黑" w:eastAsia="微软雅黑" w:hAnsi="微软雅黑" w:hint="eastAsia"/>
+        <w:spacing w:after="120" w:line="300" w:lineRule="auto"/>
+        <w:rPr>
+          <w:rFonts w:ascii="微软雅黑" w:eastAsia="微软雅黑" w:hAnsi="微软雅黑" w:hint="eastAsia"/>
+          <w:color w:val="263445"/>
+          <w:sz w:val="21"/>
+        </w:rPr>
+      </w:pPr>
+      <w:r>
+        <w:rPr>
+          <w:rFonts w:ascii="微软雅黑" w:eastAsia="微软雅黑" w:hAnsi="微软雅黑" w:hint="eastAsia"/>
+          <w:color w:val="263445"/>
           <w:sz w:val="21"/>
         </w:rPr>
         <w:t>.gitignore 已覆盖 .wrangler、node_modules、.env、.dev.vars 和日志文件；不要把实际 CF_API_TOKEN、Access token、Cloudflare 本地账号缓存写入仓库。</w:t>
@@ -1824,31 +2396,39 @@
     </w:p>
     <w:p>
       <w:pPr>
-        <w:rPr>
-          <w:rFonts w:ascii="微软雅黑" w:eastAsia="微软雅黑" w:hAnsi="微软雅黑" w:hint="eastAsia"/>
+        <w:shd w:val="clear" w:color="auto" w:fill="EAF2FB"/>
+        <w:spacing w:before="240" w:after="140" w:line="380" w:lineRule="auto"/>
+        <w:rPr>
+          <w:rFonts w:ascii="Microsoft YaHei UI" w:eastAsia="Microsoft YaHei UI" w:hAnsi="Microsoft YaHei UI" w:hint="eastAsia"/>
           <w:b/>
-          <w:sz w:val="26"/>
-        </w:rPr>
-      </w:pPr>
-      <w:r>
-        <w:rPr>
-          <w:rFonts w:ascii="微软雅黑" w:eastAsia="微软雅黑" w:hAnsi="微软雅黑" w:hint="eastAsia"/>
+          <w:color w:val="17365D"/>
+          <w:sz w:val="28"/>
+        </w:rPr>
+      </w:pPr>
+      <w:r>
+        <w:rPr>
+          <w:rFonts w:ascii="Microsoft YaHei UI" w:eastAsia="Microsoft YaHei UI" w:hAnsi="Microsoft YaHei UI" w:hint="eastAsia"/>
           <w:b/>
-          <w:sz w:val="26"/>
+          <w:color w:val="17365D"/>
+          <w:sz w:val="28"/>
         </w:rPr>
         <w:t>10. 参考资料</w:t>
       </w:r>
     </w:p>
     <w:p>
       <w:pPr>
-        <w:rPr>
-          <w:rFonts w:ascii="微软雅黑" w:eastAsia="微软雅黑" w:hAnsi="微软雅黑" w:hint="eastAsia"/>
-          <w:sz w:val="21"/>
-        </w:rPr>
-      </w:pPr>
-      <w:r>
-        <w:rPr>
-          <w:rFonts w:ascii="微软雅黑" w:eastAsia="微软雅黑" w:hAnsi="微软雅黑" w:hint="eastAsia"/>
+        <w:spacing w:after="80" w:line="300" w:lineRule="auto"/>
+        <w:ind w:left="283" w:hanging="130"/>
+        <w:rPr>
+          <w:rFonts w:ascii="微软雅黑" w:eastAsia="微软雅黑" w:hAnsi="微软雅黑" w:hint="eastAsia"/>
+          <w:color w:val="263445"/>
+          <w:sz w:val="21"/>
+        </w:rPr>
+      </w:pPr>
+      <w:r>
+        <w:rPr>
+          <w:rFonts w:ascii="微软雅黑" w:eastAsia="微软雅黑" w:hAnsi="微软雅黑" w:hint="eastAsia"/>
+          <w:color w:val="263445"/>
           <w:sz w:val="21"/>
         </w:rPr>
         <w:t>• Cloudflare Workers KV 创建 namespace：https://developers.cloudflare.com/kv/get-started/</w:t>
@@ -1856,14 +2436,18 @@
     </w:p>
     <w:p>
       <w:pPr>
-        <w:rPr>
-          <w:rFonts w:ascii="微软雅黑" w:eastAsia="微软雅黑" w:hAnsi="微软雅黑" w:hint="eastAsia"/>
-          <w:sz w:val="21"/>
-        </w:rPr>
-      </w:pPr>
-      <w:r>
-        <w:rPr>
-          <w:rFonts w:ascii="微软雅黑" w:eastAsia="微软雅黑" w:hAnsi="微软雅黑" w:hint="eastAsia"/>
+        <w:spacing w:after="80" w:line="300" w:lineRule="auto"/>
+        <w:ind w:left="283" w:hanging="130"/>
+        <w:rPr>
+          <w:rFonts w:ascii="微软雅黑" w:eastAsia="微软雅黑" w:hAnsi="微软雅黑" w:hint="eastAsia"/>
+          <w:color w:val="263445"/>
+          <w:sz w:val="21"/>
+        </w:rPr>
+      </w:pPr>
+      <w:r>
+        <w:rPr>
+          <w:rFonts w:ascii="微软雅黑" w:eastAsia="微软雅黑" w:hAnsi="微软雅黑" w:hint="eastAsia"/>
+          <w:color w:val="263445"/>
           <w:sz w:val="21"/>
         </w:rPr>
         <w:t>• Cloudflare R2 创建 bucket：https://developers.cloudflare.com/r2/buckets/create-buckets/</w:t>
@@ -1871,14 +2455,18 @@
     </w:p>
     <w:p>
       <w:pPr>
-        <w:rPr>
-          <w:rFonts w:ascii="微软雅黑" w:eastAsia="微软雅黑" w:hAnsi="微软雅黑" w:hint="eastAsia"/>
-          <w:sz w:val="21"/>
-        </w:rPr>
-      </w:pPr>
-      <w:r>
-        <w:rPr>
-          <w:rFonts w:ascii="微软雅黑" w:eastAsia="微软雅黑" w:hAnsi="微软雅黑" w:hint="eastAsia"/>
+        <w:spacing w:after="80" w:line="300" w:lineRule="auto"/>
+        <w:ind w:left="283" w:hanging="130"/>
+        <w:rPr>
+          <w:rFonts w:ascii="微软雅黑" w:eastAsia="微软雅黑" w:hAnsi="微软雅黑" w:hint="eastAsia"/>
+          <w:color w:val="263445"/>
+          <w:sz w:val="21"/>
+        </w:rPr>
+      </w:pPr>
+      <w:r>
+        <w:rPr>
+          <w:rFonts w:ascii="微软雅黑" w:eastAsia="微软雅黑" w:hAnsi="微软雅黑" w:hint="eastAsia"/>
+          <w:color w:val="263445"/>
           <w:sz w:val="21"/>
         </w:rPr>
         <w:t>• Cloudflare D1 Wrangler 命令：https://developers.cloudflare.com/d1/wrangler-commands/</w:t>
@@ -1886,14 +2474,18 @@
     </w:p>
     <w:p>
       <w:pPr>
-        <w:rPr>
-          <w:rFonts w:ascii="微软雅黑" w:eastAsia="微软雅黑" w:hAnsi="微软雅黑" w:hint="eastAsia"/>
-          <w:sz w:val="21"/>
-        </w:rPr>
-      </w:pPr>
-      <w:r>
-        <w:rPr>
-          <w:rFonts w:ascii="微软雅黑" w:eastAsia="微软雅黑" w:hAnsi="微软雅黑" w:hint="eastAsia"/>
+        <w:spacing w:after="80" w:line="300" w:lineRule="auto"/>
+        <w:ind w:left="283" w:hanging="130"/>
+        <w:rPr>
+          <w:rFonts w:ascii="微软雅黑" w:eastAsia="微软雅黑" w:hAnsi="微软雅黑" w:hint="eastAsia"/>
+          <w:color w:val="263445"/>
+          <w:sz w:val="21"/>
+        </w:rPr>
+      </w:pPr>
+      <w:r>
+        <w:rPr>
+          <w:rFonts w:ascii="微软雅黑" w:eastAsia="微软雅黑" w:hAnsi="微软雅黑" w:hint="eastAsia"/>
+          <w:color w:val="263445"/>
           <w:sz w:val="21"/>
         </w:rPr>
         <w:t>• Cloudflare Workers Wrangler 配置：https://developers.cloudflare.com/workers/wrangler/configuration/</w:t>
@@ -1901,14 +2493,18 @@
     </w:p>
     <w:p>
       <w:pPr>
-        <w:rPr>
-          <w:rFonts w:ascii="微软雅黑" w:eastAsia="微软雅黑" w:hAnsi="微软雅黑" w:hint="eastAsia"/>
-          <w:sz w:val="21"/>
-        </w:rPr>
-      </w:pPr>
-      <w:r>
-        <w:rPr>
-          <w:rFonts w:ascii="微软雅黑" w:eastAsia="微软雅黑" w:hAnsi="微软雅黑" w:hint="eastAsia"/>
+        <w:spacing w:after="80" w:line="300" w:lineRule="auto"/>
+        <w:ind w:left="283" w:hanging="130"/>
+        <w:rPr>
+          <w:rFonts w:ascii="微软雅黑" w:eastAsia="微软雅黑" w:hAnsi="微软雅黑" w:hint="eastAsia"/>
+          <w:color w:val="263445"/>
+          <w:sz w:val="21"/>
+        </w:rPr>
+      </w:pPr>
+      <w:r>
+        <w:rPr>
+          <w:rFonts w:ascii="微软雅黑" w:eastAsia="微软雅黑" w:hAnsi="微软雅黑" w:hint="eastAsia"/>
+          <w:color w:val="263445"/>
           <w:sz w:val="21"/>
         </w:rPr>
         <w:t>• Cloudflare Access 应用与路径：https://developers.cloudflare.com/cloudflare-one/policies/access/app-paths/</w:t>
@@ -1916,7 +2512,7 @@
     </w:p>
     <w:sectPr>
       <w:pgSz w:w="11906" w:h="16838"/>
-      <w:pgMar w:top="1440" w:right="1800" w:bottom="1440" w:left="1800" w:header="851" w:footer="992" w:gutter="0"/>
+      <w:pgMar w:top="879" w:right="964" w:bottom="879" w:left="964" w:header="851" w:footer="992" w:gutter="0"/>
       <w:cols w:space="425"/>
       <w:docGrid w:type="lines" w:linePitch="312"/>
     </w:sectPr>
@@ -2335,7 +2931,7 @@
     <w:link w:val="10"/>
     <w:uiPriority w:val="9"/>
     <w:qFormat/>
-    <w:rsid w:val="000E329B"/>
+    <w:rsid w:val="00A51C6B"/>
     <w:pPr>
       <w:keepNext/>
       <w:keepLines/>
@@ -2358,7 +2954,7 @@
     <w:semiHidden/>
     <w:unhideWhenUsed/>
     <w:qFormat/>
-    <w:rsid w:val="000E329B"/>
+    <w:rsid w:val="00A51C6B"/>
     <w:pPr>
       <w:keepNext/>
       <w:keepLines/>
@@ -2381,7 +2977,7 @@
     <w:semiHidden/>
     <w:unhideWhenUsed/>
     <w:qFormat/>
-    <w:rsid w:val="000E329B"/>
+    <w:rsid w:val="00A51C6B"/>
     <w:pPr>
       <w:keepNext/>
       <w:keepLines/>
@@ -2404,7 +3000,7 @@
     <w:semiHidden/>
     <w:unhideWhenUsed/>
     <w:qFormat/>
-    <w:rsid w:val="000E329B"/>
+    <w:rsid w:val="00A51C6B"/>
     <w:pPr>
       <w:keepNext/>
       <w:keepLines/>
@@ -2427,7 +3023,7 @@
     <w:semiHidden/>
     <w:unhideWhenUsed/>
     <w:qFormat/>
-    <w:rsid w:val="000E329B"/>
+    <w:rsid w:val="00A51C6B"/>
     <w:pPr>
       <w:keepNext/>
       <w:keepLines/>
@@ -2449,7 +3045,7 @@
     <w:semiHidden/>
     <w:unhideWhenUsed/>
     <w:qFormat/>
-    <w:rsid w:val="000E329B"/>
+    <w:rsid w:val="00A51C6B"/>
     <w:pPr>
       <w:keepNext/>
       <w:keepLines/>
@@ -2472,7 +3068,7 @@
     <w:semiHidden/>
     <w:unhideWhenUsed/>
     <w:qFormat/>
-    <w:rsid w:val="000E329B"/>
+    <w:rsid w:val="00A51C6B"/>
     <w:pPr>
       <w:keepNext/>
       <w:keepLines/>
@@ -2495,7 +3091,7 @@
     <w:semiHidden/>
     <w:unhideWhenUsed/>
     <w:qFormat/>
-    <w:rsid w:val="000E329B"/>
+    <w:rsid w:val="00A51C6B"/>
     <w:pPr>
       <w:keepNext/>
       <w:keepLines/>
@@ -2516,7 +3112,7 @@
     <w:semiHidden/>
     <w:unhideWhenUsed/>
     <w:qFormat/>
-    <w:rsid w:val="000E329B"/>
+    <w:rsid w:val="00A51C6B"/>
     <w:pPr>
       <w:keepNext/>
       <w:keepLines/>
@@ -2560,7 +3156,7 @@
     <w:basedOn w:val="a0"/>
     <w:link w:val="1"/>
     <w:uiPriority w:val="9"/>
-    <w:rsid w:val="000E329B"/>
+    <w:rsid w:val="00A51C6B"/>
     <w:rPr>
       <w:rFonts w:asciiTheme="majorHAnsi" w:eastAsiaTheme="majorEastAsia" w:hAnsiTheme="majorHAnsi" w:cstheme="majorBidi"/>
       <w:color w:val="0F4761" w:themeColor="accent1" w:themeShade="BF"/>
@@ -2574,7 +3170,7 @@
     <w:link w:val="2"/>
     <w:uiPriority w:val="9"/>
     <w:semiHidden/>
-    <w:rsid w:val="000E329B"/>
+    <w:rsid w:val="00A51C6B"/>
     <w:rPr>
       <w:rFonts w:asciiTheme="majorHAnsi" w:eastAsiaTheme="majorEastAsia" w:hAnsiTheme="majorHAnsi" w:cstheme="majorBidi"/>
       <w:color w:val="0F4761" w:themeColor="accent1" w:themeShade="BF"/>
@@ -2588,7 +3184,7 @@
     <w:link w:val="3"/>
     <w:uiPriority w:val="9"/>
     <w:semiHidden/>
-    <w:rsid w:val="000E329B"/>
+    <w:rsid w:val="00A51C6B"/>
     <w:rPr>
       <w:rFonts w:asciiTheme="majorHAnsi" w:eastAsiaTheme="majorEastAsia" w:hAnsiTheme="majorHAnsi" w:cstheme="majorBidi"/>
       <w:color w:val="0F4761" w:themeColor="accent1" w:themeShade="BF"/>
@@ -2602,7 +3198,7 @@
     <w:link w:val="4"/>
     <w:uiPriority w:val="9"/>
     <w:semiHidden/>
-    <w:rsid w:val="000E329B"/>
+    <w:rsid w:val="00A51C6B"/>
     <w:rPr>
       <w:rFonts w:cstheme="majorBidi"/>
       <w:color w:val="0F4761" w:themeColor="accent1" w:themeShade="BF"/>
@@ -2616,7 +3212,7 @@
     <w:link w:val="5"/>
     <w:uiPriority w:val="9"/>
     <w:semiHidden/>
-    <w:rsid w:val="000E329B"/>
+    <w:rsid w:val="00A51C6B"/>
     <w:rPr>
       <w:rFonts w:cstheme="majorBidi"/>
       <w:color w:val="0F4761" w:themeColor="accent1" w:themeShade="BF"/>
@@ -2629,7 +3225,7 @@
     <w:link w:val="6"/>
     <w:uiPriority w:val="9"/>
     <w:semiHidden/>
-    <w:rsid w:val="000E329B"/>
+    <w:rsid w:val="00A51C6B"/>
     <w:rPr>
       <w:rFonts w:cstheme="majorBidi"/>
       <w:b/>
@@ -2643,7 +3239,7 @@
     <w:link w:val="7"/>
     <w:uiPriority w:val="9"/>
     <w:semiHidden/>
-    <w:rsid w:val="000E329B"/>
+    <w:rsid w:val="00A51C6B"/>
     <w:rPr>
       <w:rFonts w:cstheme="majorBidi"/>
       <w:b/>
@@ -2657,7 +3253,7 @@
     <w:link w:val="8"/>
     <w:uiPriority w:val="9"/>
     <w:semiHidden/>
-    <w:rsid w:val="000E329B"/>
+    <w:rsid w:val="00A51C6B"/>
     <w:rPr>
       <w:rFonts w:cstheme="majorBidi"/>
       <w:color w:val="595959" w:themeColor="text1" w:themeTint="A6"/>
@@ -2669,7 +3265,7 @@
     <w:link w:val="9"/>
     <w:uiPriority w:val="9"/>
     <w:semiHidden/>
-    <w:rsid w:val="000E329B"/>
+    <w:rsid w:val="00A51C6B"/>
     <w:rPr>
       <w:rFonts w:eastAsiaTheme="majorEastAsia" w:cstheme="majorBidi"/>
       <w:color w:val="595959" w:themeColor="text1" w:themeTint="A6"/>
@@ -2682,7 +3278,7 @@
     <w:link w:val="a4"/>
     <w:uiPriority w:val="10"/>
     <w:qFormat/>
-    <w:rsid w:val="000E329B"/>
+    <w:rsid w:val="00A51C6B"/>
     <w:pPr>
       <w:spacing w:after="80" w:line="240" w:lineRule="auto"/>
       <w:contextualSpacing/>
@@ -2701,7 +3297,7 @@
     <w:basedOn w:val="a0"/>
     <w:link w:val="a3"/>
     <w:uiPriority w:val="10"/>
-    <w:rsid w:val="000E329B"/>
+    <w:rsid w:val="00A51C6B"/>
     <w:rPr>
       <w:rFonts w:asciiTheme="majorHAnsi" w:eastAsiaTheme="majorEastAsia" w:hAnsiTheme="majorHAnsi" w:cstheme="majorBidi"/>
       <w:spacing w:val="-10"/>
@@ -2717,7 +3313,7 @@
     <w:link w:val="a6"/>
     <w:uiPriority w:val="11"/>
     <w:qFormat/>
-    <w:rsid w:val="000E329B"/>
+    <w:rsid w:val="00A51C6B"/>
     <w:pPr>
       <w:numPr>
         <w:ilvl w:val="1"/>
@@ -2737,7 +3333,7 @@
     <w:basedOn w:val="a0"/>
     <w:link w:val="a5"/>
     <w:uiPriority w:val="11"/>
-    <w:rsid w:val="000E329B"/>
+    <w:rsid w:val="00A51C6B"/>
     <w:rPr>
       <w:rFonts w:asciiTheme="majorHAnsi" w:eastAsiaTheme="majorEastAsia" w:hAnsiTheme="majorHAnsi" w:cstheme="majorBidi"/>
       <w:color w:val="595959" w:themeColor="text1" w:themeTint="A6"/>
@@ -2753,7 +3349,7 @@
     <w:link w:val="a8"/>
     <w:uiPriority w:val="29"/>
     <w:qFormat/>
-    <w:rsid w:val="000E329B"/>
+    <w:rsid w:val="00A51C6B"/>
     <w:pPr>
       <w:spacing w:before="160"/>
       <w:jc w:val="center"/>
@@ -2769,7 +3365,7 @@
     <w:basedOn w:val="a0"/>
     <w:link w:val="a7"/>
     <w:uiPriority w:val="29"/>
-    <w:rsid w:val="000E329B"/>
+    <w:rsid w:val="00A51C6B"/>
     <w:rPr>
       <w:i/>
       <w:iCs/>
@@ -2781,7 +3377,7 @@
     <w:basedOn w:val="a"/>
     <w:uiPriority w:val="34"/>
     <w:qFormat/>
-    <w:rsid w:val="000E329B"/>
+    <w:rsid w:val="00A51C6B"/>
     <w:pPr>
       <w:ind w:left="720"/>
       <w:contextualSpacing/>
@@ -2792,7 +3388,7 @@
     <w:basedOn w:val="a0"/>
     <w:uiPriority w:val="21"/>
     <w:qFormat/>
-    <w:rsid w:val="000E329B"/>
+    <w:rsid w:val="00A51C6B"/>
     <w:rPr>
       <w:i/>
       <w:iCs/>
@@ -2806,7 +3402,7 @@
     <w:link w:val="ac"/>
     <w:uiPriority w:val="30"/>
     <w:qFormat/>
-    <w:rsid w:val="000E329B"/>
+    <w:rsid w:val="00A51C6B"/>
     <w:pPr>
       <w:pBdr>
         <w:top w:val="single" w:sz="4" w:space="10" w:color="0F4761" w:themeColor="accent1" w:themeShade="BF"/>
@@ -2827,7 +3423,7 @@
     <w:basedOn w:val="a0"/>
     <w:link w:val="ab"/>
     <w:uiPriority w:val="30"/>
-    <w:rsid w:val="000E329B"/>
+    <w:rsid w:val="00A51C6B"/>
     <w:rPr>
       <w:i/>
       <w:iCs/>
@@ -2839,7 +3435,7 @@
     <w:basedOn w:val="a0"/>
     <w:uiPriority w:val="32"/>
     <w:qFormat/>
-    <w:rsid w:val="000E329B"/>
+    <w:rsid w:val="00A51C6B"/>
     <w:rPr>
       <w:b/>
       <w:bCs/>

</xml_diff>